<commit_message>
data_parser.py updates and added new file algorithms.py
</commit_message>
<xml_diff>
--- a/docs/Financial_stock_analysis_system.docx
+++ b/docs/Financial_stock_analysis_system.docx
@@ -1,6 +1,6 @@
 
 <file path=word/document.xml><?xml version="1.0" encoding="utf-8"?>
-<w:document xmlns:wpc="http://schemas.microsoft.com/office/word/2010/wordprocessingCanvas" xmlns:cx="http://schemas.microsoft.com/office/drawing/2014/chartex" xmlns:cx1="http://schemas.microsoft.com/office/drawing/2015/9/8/chartex" xmlns:cx2="http://schemas.microsoft.com/office/drawing/2015/10/21/chartex" xmlns:cx3="http://schemas.microsoft.com/office/drawing/2016/5/9/chartex" xmlns:cx4="http://schemas.microsoft.com/office/drawing/2016/5/10/chartex" xmlns:cx5="http://schemas.microsoft.com/office/drawing/2016/5/11/chartex" xmlns:cx6="http://schemas.microsoft.com/office/drawing/2016/5/12/chartex" xmlns:cx7="http://schemas.microsoft.com/office/drawing/2016/5/13/chartex" xmlns:cx8="http://schemas.microsoft.com/office/drawing/2016/5/14/chartex" xmlns:mc="http://schemas.openxmlformats.org/markup-compatibility/2006" xmlns:aink="http://schemas.microsoft.com/office/drawing/2016/ink" xmlns:am3d="http://schemas.microsoft.com/office/drawing/2017/model3d" xmlns:o="urn:schemas-microsoft-com:office:office" xmlns:oel="http://schemas.microsoft.com/office/2019/extlst" xmlns:r="http://schemas.openxmlformats.org/officeDocument/2006/relationships" xmlns:m="http://schemas.openxmlformats.org/officeDocument/2006/math" xmlns:v="urn:schemas-microsoft-com:vml" xmlns:wp14="http://schemas.microsoft.com/office/word/2010/wordprocessingDrawing" xmlns:wp="http://schemas.openxmlformats.org/drawingml/2006/wordprocessingDrawing" xmlns:w10="urn:schemas-microsoft-com:office:word" xmlns:w="http://schemas.openxmlformats.org/wordprocessingml/2006/main" xmlns:w14="http://schemas.microsoft.com/office/word/2010/wordml" xmlns:w15="http://schemas.microsoft.com/office/word/2012/wordml" xmlns:w16cei="http://schemas.microsoft.com/office/word/2026/wordml/cei" xmlns:w16cex="http://schemas.microsoft.com/office/word/2018/wordml/cex" xmlns:w16cid="http://schemas.microsoft.com/office/word/2016/wordml/cid" xmlns:w16="http://schemas.microsoft.com/office/word/2018/wordml" xmlns:w16du="http://schemas.microsoft.com/office/word/2023/wordml/word16du" xmlns:w16sdtdh="http://schemas.microsoft.com/office/word/2020/wordml/sdtdatahash" xmlns:w16sdtfl="http://schemas.microsoft.com/office/word/2024/wordml/sdtformatlock" xmlns:w16se="http://schemas.microsoft.com/office/word/2015/wordml/symex" xmlns:wpg="http://schemas.microsoft.com/office/word/2010/wordprocessingGroup" xmlns:wpi="http://schemas.microsoft.com/office/word/2010/wordprocessingInk" xmlns:wne="http://schemas.microsoft.com/office/word/2006/wordml" xmlns:wps="http://schemas.microsoft.com/office/word/2010/wordprocessingShape" mc:Ignorable="w14 w15 w16se w16cid w16 w16cex w16sdtdh w16sdtfl w16du wp14">
+<w:document xmlns:wpc="http://schemas.microsoft.com/office/word/2010/wordprocessingCanvas" xmlns:cx="http://schemas.microsoft.com/office/drawing/2014/chartex" xmlns:cx1="http://schemas.microsoft.com/office/drawing/2015/9/8/chartex" xmlns:cx2="http://schemas.microsoft.com/office/drawing/2015/10/21/chartex" xmlns:cx3="http://schemas.microsoft.com/office/drawing/2016/5/9/chartex" xmlns:cx4="http://schemas.microsoft.com/office/drawing/2016/5/10/chartex" xmlns:cx5="http://schemas.microsoft.com/office/drawing/2016/5/11/chartex" xmlns:cx6="http://schemas.microsoft.com/office/drawing/2016/5/12/chartex" xmlns:cx7="http://schemas.microsoft.com/office/drawing/2016/5/13/chartex" xmlns:cx8="http://schemas.microsoft.com/office/drawing/2016/5/14/chartex" xmlns:mc="http://schemas.openxmlformats.org/markup-compatibility/2006" xmlns:aink="http://schemas.microsoft.com/office/drawing/2016/ink" xmlns:am3d="http://schemas.microsoft.com/office/drawing/2017/model3d" xmlns:o="urn:schemas-microsoft-com:office:office" xmlns:oel="http://schemas.microsoft.com/office/2019/extlst" xmlns:r="http://schemas.openxmlformats.org/officeDocument/2006/relationships" xmlns:m="http://schemas.openxmlformats.org/officeDocument/2006/math" xmlns:v="urn:schemas-microsoft-com:vml" xmlns:wp14="http://schemas.microsoft.com/office/word/2010/wordprocessingDrawing" xmlns:wp="http://schemas.openxmlformats.org/drawingml/2006/wordprocessingDrawing" xmlns:w10="urn:schemas-microsoft-com:office:word" xmlns:w="http://schemas.openxmlformats.org/wordprocessingml/2006/main" xmlns:w14="http://schemas.microsoft.com/office/word/2010/wordml" xmlns:w15="http://schemas.microsoft.com/office/word/2012/wordml" xmlns:w16cex="http://schemas.microsoft.com/office/word/2018/wordml/cex" xmlns:w16cid="http://schemas.microsoft.com/office/word/2016/wordml/cid" xmlns:w16="http://schemas.microsoft.com/office/word/2018/wordml" xmlns:w16du="http://schemas.microsoft.com/office/word/2023/wordml/word16du" xmlns:w16sdtdh="http://schemas.microsoft.com/office/word/2020/wordml/sdtdatahash" xmlns:w16sdtfl="http://schemas.microsoft.com/office/word/2024/wordml/sdtformatlock" xmlns:w16se="http://schemas.microsoft.com/office/word/2015/wordml/symex" xmlns:wpg="http://schemas.microsoft.com/office/word/2010/wordprocessingGroup" xmlns:wpi="http://schemas.microsoft.com/office/word/2010/wordprocessingInk" xmlns:wne="http://schemas.microsoft.com/office/word/2006/wordml" xmlns:wps="http://schemas.microsoft.com/office/word/2010/wordprocessingShape" mc:Ignorable="w14 w15 w16se w16cid w16 w16cex w16sdtdh w16sdtfl w16du wp14">
   <w:body>
     <w:p>
       <w:r>
@@ -165,15 +165,10 @@
         </w:numPr>
       </w:pPr>
       <w:r>
-        <w:t xml:space="preserve">Authentication &amp; Security: Handles account signups, password hashing using </w:t>
-      </w:r>
-      <w:proofErr w:type="spellStart"/>
-      <w:r>
-        <w:t>Werkzeug</w:t>
-      </w:r>
-      <w:proofErr w:type="spellEnd"/>
-      <w:r>
-        <w:t>, and a 15-minute lockout system after 3 failed login attempts.</w:t>
+        <w:t>Authentication &amp; Security: Handles account signups, native cryptographic password hashing using PBKDF2-HMAC-SHA256 with constant-time bitwise XOR verification, and a 15-minute lockout system after 3 failed login attempts</w:t>
+      </w:r>
+      <w:r>
+        <w:t>.</w:t>
       </w:r>
     </w:p>
     <w:p>
@@ -239,6 +234,7 @@
         </w:numPr>
       </w:pPr>
       <w:r>
+        <w:lastRenderedPageBreak/>
         <w:t>Database &amp; Interface: Manages a 3NF SQLite database and renders dynamic web pages using Jinja2 templates and Chart.js.</w:t>
       </w:r>
     </w:p>
@@ -247,12 +243,11 @@
         <w:rPr>
           <w:noProof/>
         </w:rPr>
-        <w:lastRenderedPageBreak/>
         <w:drawing>
-          <wp:inline distT="0" distB="0" distL="0" distR="0" wp14:anchorId="5035C26A" wp14:editId="298A4899">
-            <wp:extent cx="5731510" cy="3439160"/>
-            <wp:effectExtent l="0" t="0" r="2540" b="8890"/>
-            <wp:docPr id="987066461" name="Picture 1"/>
+          <wp:inline distT="0" distB="0" distL="0" distR="0" wp14:anchorId="65A9E788" wp14:editId="5D662357">
+            <wp:extent cx="5731510" cy="3564255"/>
+            <wp:effectExtent l="0" t="0" r="2540" b="0"/>
+            <wp:docPr id="1072181707" name="Picture 2"/>
             <wp:cNvGraphicFramePr>
               <a:graphicFrameLocks xmlns:a="http://schemas.openxmlformats.org/drawingml/2006/main" noChangeAspect="1"/>
             </wp:cNvGraphicFramePr>
@@ -260,7 +255,7 @@
               <a:graphicData uri="http://schemas.openxmlformats.org/drawingml/2006/picture">
                 <pic:pic xmlns:pic="http://schemas.openxmlformats.org/drawingml/2006/picture">
                   <pic:nvPicPr>
-                    <pic:cNvPr id="987066461" name="Picture 987066461"/>
+                    <pic:cNvPr id="1072181707" name="Picture 1072181707"/>
                     <pic:cNvPicPr/>
                   </pic:nvPicPr>
                   <pic:blipFill>
@@ -278,7 +273,7 @@
                   <pic:spPr>
                     <a:xfrm>
                       <a:off x="0" y="0"/>
-                      <a:ext cx="5731510" cy="3439160"/>
+                      <a:ext cx="5731510" cy="3564255"/>
                     </a:xfrm>
                     <a:prstGeom prst="rect">
                       <a:avLst/>
@@ -582,6 +577,7 @@
           </w:tcPr>
           <w:p>
             <w:r>
+              <w:lastRenderedPageBreak/>
               <w:t>SC</w:t>
             </w:r>
             <w:r>
@@ -605,11 +601,7 @@
           </w:tcPr>
           <w:p>
             <w:r>
-              <w:t xml:space="preserve">Calculate Linear Regression, RSI, and SMA using pure </w:t>
-            </w:r>
-            <w:r>
-              <w:lastRenderedPageBreak/>
-              <w:t>Python without pandas or scikit-learn.</w:t>
+              <w:t>Calculate Linear Regression, RSI, and SMA using pure Python without pandas or scikit-learn.</w:t>
             </w:r>
           </w:p>
         </w:tc>
@@ -619,7 +611,6 @@
           </w:tcPr>
           <w:p>
             <w:r>
-              <w:lastRenderedPageBreak/>
               <w:t>Audit source code and compare output against verified calculations.</w:t>
             </w:r>
           </w:p>
@@ -945,6 +936,7 @@
           <w:p>
             <w:proofErr w:type="spellStart"/>
             <w:r>
+              <w:lastRenderedPageBreak/>
               <w:t>password_hash</w:t>
             </w:r>
             <w:proofErr w:type="spellEnd"/>
@@ -975,13 +967,16 @@
             <w:tcW w:w="3067" w:type="dxa"/>
           </w:tcPr>
           <w:p>
+            <w:r>
+              <w:t xml:space="preserve">Native PBKDF2-HMAC-SHA256 string (Format: </w:t>
+            </w:r>
             <w:proofErr w:type="spellStart"/>
             <w:r>
-              <w:t>Werkzeug</w:t>
+              <w:t>iterations$salt$hash</w:t>
             </w:r>
             <w:proofErr w:type="spellEnd"/>
             <w:r>
-              <w:t xml:space="preserve"> SHA-256 string</w:t>
+              <w:t>)</w:t>
             </w:r>
           </w:p>
         </w:tc>
@@ -1527,10 +1522,10 @@
           <w:noProof/>
         </w:rPr>
         <w:drawing>
-          <wp:inline distT="0" distB="0" distL="0" distR="0" wp14:anchorId="280E9A1B" wp14:editId="7D3F0107">
-            <wp:extent cx="5414838" cy="2707419"/>
-            <wp:effectExtent l="0" t="0" r="0" b="0"/>
-            <wp:docPr id="2134753988" name="Picture 2"/>
+          <wp:inline distT="0" distB="0" distL="0" distR="0" wp14:anchorId="7F006907" wp14:editId="3DF0E3F6">
+            <wp:extent cx="5731510" cy="3127375"/>
+            <wp:effectExtent l="0" t="0" r="2540" b="0"/>
+            <wp:docPr id="224626761" name="Picture 19"/>
             <wp:cNvGraphicFramePr>
               <a:graphicFrameLocks xmlns:a="http://schemas.openxmlformats.org/drawingml/2006/main" noChangeAspect="1"/>
             </wp:cNvGraphicFramePr>
@@ -1538,11 +1533,11 @@
               <a:graphicData uri="http://schemas.openxmlformats.org/drawingml/2006/picture">
                 <pic:pic xmlns:pic="http://schemas.openxmlformats.org/drawingml/2006/picture">
                   <pic:nvPicPr>
-                    <pic:cNvPr id="2134753988" name="Picture 2134753988"/>
+                    <pic:cNvPr id="224626761" name="Picture 224626761"/>
                     <pic:cNvPicPr/>
                   </pic:nvPicPr>
                   <pic:blipFill>
-                    <a:blip r:embed="rId8">
+                    <a:blip r:embed="rId8" cstate="print">
                       <a:extLst>
                         <a:ext uri="{28A0092B-C50C-407E-A947-70E740481C1C}">
                           <a14:useLocalDpi xmlns:a14="http://schemas.microsoft.com/office/drawing/2010/main" val="0"/>
@@ -1556,7 +1551,7 @@
                   <pic:spPr>
                     <a:xfrm>
                       <a:off x="0" y="0"/>
-                      <a:ext cx="5446503" cy="2723251"/>
+                      <a:ext cx="5731510" cy="3127375"/>
                     </a:xfrm>
                     <a:prstGeom prst="rect">
                       <a:avLst/>
@@ -1578,6 +1573,7 @@
     </w:p>
     <w:p>
       <w:r>
+        <w:lastRenderedPageBreak/>
         <w:t>Login &amp; Authentication Interface (login.html): I designed a simple, functional layout for logging in and signing up. It includes an alert message area at the bottom that dynamically displays feedback, such as incorrect password warnings or a 15-minute account lockout status.</w:t>
       </w:r>
     </w:p>
@@ -1587,12 +1583,11 @@
         <w:rPr>
           <w:noProof/>
         </w:rPr>
-        <w:lastRenderedPageBreak/>
         <w:drawing>
-          <wp:inline distT="0" distB="0" distL="0" distR="0" wp14:anchorId="7D7523BC" wp14:editId="66A2C63B">
-            <wp:extent cx="5216287" cy="3260035"/>
-            <wp:effectExtent l="0" t="0" r="3810" b="0"/>
-            <wp:docPr id="1683217457" name="Picture 3"/>
+          <wp:inline distT="0" distB="0" distL="0" distR="0" wp14:anchorId="076F8F8A" wp14:editId="41539110">
+            <wp:extent cx="5731510" cy="3800475"/>
+            <wp:effectExtent l="0" t="0" r="2540" b="9525"/>
+            <wp:docPr id="794678900" name="Picture 20"/>
             <wp:cNvGraphicFramePr>
               <a:graphicFrameLocks xmlns:a="http://schemas.openxmlformats.org/drawingml/2006/main" noChangeAspect="1"/>
             </wp:cNvGraphicFramePr>
@@ -1600,7 +1595,7 @@
               <a:graphicData uri="http://schemas.openxmlformats.org/drawingml/2006/picture">
                 <pic:pic xmlns:pic="http://schemas.openxmlformats.org/drawingml/2006/picture">
                   <pic:nvPicPr>
-                    <pic:cNvPr id="1683217457" name="Picture 1683217457"/>
+                    <pic:cNvPr id="794678900" name="Picture 794678900"/>
                     <pic:cNvPicPr/>
                   </pic:nvPicPr>
                   <pic:blipFill>
@@ -1618,7 +1613,7 @@
                   <pic:spPr>
                     <a:xfrm>
                       <a:off x="0" y="0"/>
-                      <a:ext cx="5251797" cy="3282228"/>
+                      <a:ext cx="5731510" cy="3800475"/>
                     </a:xfrm>
                     <a:prstGeom prst="rect">
                       <a:avLst/>
@@ -1644,16 +1639,16 @@
         <w:t xml:space="preserve"> statistics, a Chart.js dynamic graph showing historical prices alongside a dashed 7-day forecast line, and a quick form at the bottom allowing users to configure new email price triggers.</w:t>
       </w:r>
     </w:p>
-    <w:p/>
     <w:p>
       <w:r>
         <w:rPr>
           <w:noProof/>
         </w:rPr>
+        <w:lastRenderedPageBreak/>
         <w:drawing>
-          <wp:inline distT="0" distB="0" distL="0" distR="0" wp14:anchorId="10615E73" wp14:editId="45B25E5C">
-            <wp:extent cx="5761041" cy="3840480"/>
-            <wp:effectExtent l="0" t="0" r="0" b="7620"/>
+          <wp:inline distT="0" distB="0" distL="0" distR="0" wp14:anchorId="7F6BD072" wp14:editId="263F7316">
+            <wp:extent cx="5731510" cy="3821007"/>
+            <wp:effectExtent l="0" t="0" r="2540" b="8255"/>
             <wp:docPr id="155372599" name="Picture 4"/>
             <wp:cNvGraphicFramePr>
               <a:graphicFrameLocks xmlns:a="http://schemas.openxmlformats.org/drawingml/2006/main" noChangeAspect="1"/>
@@ -1680,7 +1675,7 @@
                   <pic:spPr>
                     <a:xfrm>
                       <a:off x="0" y="0"/>
-                      <a:ext cx="5811269" cy="3873963"/>
+                      <a:ext cx="5731510" cy="3821007"/>
                     </a:xfrm>
                     <a:prstGeom prst="rect">
                       <a:avLst/>
@@ -1693,8 +1688,4493 @@
         </w:drawing>
       </w:r>
     </w:p>
+    <w:p/>
+    <w:p>
+      <w:r>
+        <w:t xml:space="preserve">3.2.5 Core Mathematical Algorithms &amp; Pseudocode </w:t>
+      </w:r>
+    </w:p>
+    <w:p>
+      <w:r>
+        <w:t>To achieve Group A technical skill marks, I am implementing all mathematical and analytical calculations using pure Python logic, without relying on third-party libraries like pandas or scikit-learn.</w:t>
+      </w:r>
+    </w:p>
+    <w:p/>
+    <w:p>
+      <w:r>
+        <w:rPr>
+          <w:rFonts w:ascii="Calibri" w:hAnsi="Calibri" w:cs="Calibri"/>
+          <w:noProof/>
+          <w:color w:val="000000"/>
+        </w:rPr>
+        <w:lastRenderedPageBreak/>
+        <w:drawing>
+          <wp:inline distT="0" distB="0" distL="0" distR="0" wp14:anchorId="51F0431E" wp14:editId="1424F4CB">
+            <wp:extent cx="5731510" cy="5017135"/>
+            <wp:effectExtent l="0" t="0" r="2540" b="0"/>
+            <wp:docPr id="396399362" name="Picture 10"/>
+            <wp:cNvGraphicFramePr>
+              <a:graphicFrameLocks xmlns:a="http://schemas.openxmlformats.org/drawingml/2006/main" noChangeAspect="1"/>
+            </wp:cNvGraphicFramePr>
+            <a:graphic xmlns:a="http://schemas.openxmlformats.org/drawingml/2006/main">
+              <a:graphicData uri="http://schemas.openxmlformats.org/drawingml/2006/picture">
+                <pic:pic xmlns:pic="http://schemas.openxmlformats.org/drawingml/2006/picture">
+                  <pic:nvPicPr>
+                    <pic:cNvPr id="0" name="Picture 46"/>
+                    <pic:cNvPicPr>
+                      <a:picLocks noChangeAspect="1" noChangeArrowheads="1"/>
+                    </pic:cNvPicPr>
+                  </pic:nvPicPr>
+                  <pic:blipFill>
+                    <a:blip r:embed="rId11">
+                      <a:extLst>
+                        <a:ext uri="{28A0092B-C50C-407E-A947-70E740481C1C}">
+                          <a14:useLocalDpi xmlns:a14="http://schemas.microsoft.com/office/drawing/2010/main" val="0"/>
+                        </a:ext>
+                      </a:extLst>
+                    </a:blip>
+                    <a:srcRect/>
+                    <a:stretch>
+                      <a:fillRect/>
+                    </a:stretch>
+                  </pic:blipFill>
+                  <pic:spPr bwMode="auto">
+                    <a:xfrm>
+                      <a:off x="0" y="0"/>
+                      <a:ext cx="5731510" cy="5017135"/>
+                    </a:xfrm>
+                    <a:prstGeom prst="rect">
+                      <a:avLst/>
+                    </a:prstGeom>
+                    <a:noFill/>
+                    <a:ln>
+                      <a:noFill/>
+                    </a:ln>
+                  </pic:spPr>
+                </pic:pic>
+              </a:graphicData>
+            </a:graphic>
+          </wp:inline>
+        </w:drawing>
+      </w:r>
+    </w:p>
+    <w:p/>
+    <w:p>
+      <w:r>
+        <w:t>Algorithm 1: 7-Day Linear Regression Forecasting (y = mx + c)</w:t>
+      </w:r>
+    </w:p>
+    <w:p>
+      <w:r>
+        <w:t>Purpose: Calculates the slope (m) and y-intercept (c) from historical price data to project stock prices 7 days into the future.</w:t>
+      </w:r>
+    </w:p>
+    <w:p>
+      <w:r>
+        <w:rPr>
+          <w:rFonts w:ascii="Calibri" w:hAnsi="Calibri" w:cs="Calibri"/>
+          <w:noProof/>
+          <w:color w:val="000000"/>
+        </w:rPr>
+        <w:lastRenderedPageBreak/>
+        <w:drawing>
+          <wp:inline distT="0" distB="0" distL="0" distR="0" wp14:anchorId="490C8812" wp14:editId="51FC18DD">
+            <wp:extent cx="3333750" cy="2324100"/>
+            <wp:effectExtent l="0" t="0" r="0" b="0"/>
+            <wp:docPr id="665967105" name="Picture 12"/>
+            <wp:cNvGraphicFramePr>
+              <a:graphicFrameLocks xmlns:a="http://schemas.openxmlformats.org/drawingml/2006/main" noChangeAspect="1"/>
+            </wp:cNvGraphicFramePr>
+            <a:graphic xmlns:a="http://schemas.openxmlformats.org/drawingml/2006/main">
+              <a:graphicData uri="http://schemas.openxmlformats.org/drawingml/2006/picture">
+                <pic:pic xmlns:pic="http://schemas.openxmlformats.org/drawingml/2006/picture">
+                  <pic:nvPicPr>
+                    <pic:cNvPr id="0" name="Picture 53"/>
+                    <pic:cNvPicPr>
+                      <a:picLocks noChangeAspect="1" noChangeArrowheads="1"/>
+                    </pic:cNvPicPr>
+                  </pic:nvPicPr>
+                  <pic:blipFill>
+                    <a:blip r:embed="rId12" cstate="print">
+                      <a:extLst>
+                        <a:ext uri="{28A0092B-C50C-407E-A947-70E740481C1C}">
+                          <a14:useLocalDpi xmlns:a14="http://schemas.microsoft.com/office/drawing/2010/main" val="0"/>
+                        </a:ext>
+                      </a:extLst>
+                    </a:blip>
+                    <a:srcRect/>
+                    <a:stretch>
+                      <a:fillRect/>
+                    </a:stretch>
+                  </pic:blipFill>
+                  <pic:spPr bwMode="auto">
+                    <a:xfrm>
+                      <a:off x="0" y="0"/>
+                      <a:ext cx="3333750" cy="2324100"/>
+                    </a:xfrm>
+                    <a:prstGeom prst="rect">
+                      <a:avLst/>
+                    </a:prstGeom>
+                    <a:noFill/>
+                    <a:ln>
+                      <a:noFill/>
+                    </a:ln>
+                  </pic:spPr>
+                </pic:pic>
+              </a:graphicData>
+            </a:graphic>
+          </wp:inline>
+        </w:drawing>
+      </w:r>
+      <w:r>
+        <w:rPr>
+          <w:noProof/>
+        </w:rPr>
+        <w:drawing>
+          <wp:inline distT="0" distB="0" distL="0" distR="0" wp14:anchorId="32B009ED" wp14:editId="69C8A8AE">
+            <wp:extent cx="2847975" cy="2847975"/>
+            <wp:effectExtent l="0" t="0" r="9525" b="9525"/>
+            <wp:docPr id="512003429" name="Picture 13"/>
+            <wp:cNvGraphicFramePr>
+              <a:graphicFrameLocks xmlns:a="http://schemas.openxmlformats.org/drawingml/2006/main" noChangeAspect="1"/>
+            </wp:cNvGraphicFramePr>
+            <a:graphic xmlns:a="http://schemas.openxmlformats.org/drawingml/2006/main">
+              <a:graphicData uri="http://schemas.openxmlformats.org/drawingml/2006/picture">
+                <pic:pic xmlns:pic="http://schemas.openxmlformats.org/drawingml/2006/picture">
+                  <pic:nvPicPr>
+                    <pic:cNvPr id="0" name="Picture 55"/>
+                    <pic:cNvPicPr>
+                      <a:picLocks noChangeAspect="1" noChangeArrowheads="1"/>
+                    </pic:cNvPicPr>
+                  </pic:nvPicPr>
+                  <pic:blipFill>
+                    <a:blip r:embed="rId13" cstate="print">
+                      <a:extLst>
+                        <a:ext uri="{28A0092B-C50C-407E-A947-70E740481C1C}">
+                          <a14:useLocalDpi xmlns:a14="http://schemas.microsoft.com/office/drawing/2010/main" val="0"/>
+                        </a:ext>
+                      </a:extLst>
+                    </a:blip>
+                    <a:srcRect/>
+                    <a:stretch>
+                      <a:fillRect/>
+                    </a:stretch>
+                  </pic:blipFill>
+                  <pic:spPr bwMode="auto">
+                    <a:xfrm>
+                      <a:off x="0" y="0"/>
+                      <a:ext cx="2847975" cy="2847975"/>
+                    </a:xfrm>
+                    <a:prstGeom prst="rect">
+                      <a:avLst/>
+                    </a:prstGeom>
+                    <a:noFill/>
+                    <a:ln>
+                      <a:noFill/>
+                    </a:ln>
+                  </pic:spPr>
+                </pic:pic>
+              </a:graphicData>
+            </a:graphic>
+          </wp:inline>
+        </w:drawing>
+      </w:r>
+    </w:p>
+    <w:p>
+      <w:r>
+        <w:t>Time Complexity Justification: O(N) - Single pass loop to accumulate sums</w:t>
+      </w:r>
+    </w:p>
+    <w:p>
+      <w:r>
+        <w:rPr>
+          <w:noProof/>
+        </w:rPr>
+        <w:drawing>
+          <wp:inline distT="0" distB="0" distL="0" distR="0" wp14:anchorId="0D45DDA4" wp14:editId="7FDDCC92">
+            <wp:extent cx="2800350" cy="752475"/>
+            <wp:effectExtent l="0" t="0" r="0" b="9525"/>
+            <wp:docPr id="1486539266" name="Picture 14"/>
+            <wp:cNvGraphicFramePr>
+              <a:graphicFrameLocks xmlns:a="http://schemas.openxmlformats.org/drawingml/2006/main" noChangeAspect="1"/>
+            </wp:cNvGraphicFramePr>
+            <a:graphic xmlns:a="http://schemas.openxmlformats.org/drawingml/2006/main">
+              <a:graphicData uri="http://schemas.openxmlformats.org/drawingml/2006/picture">
+                <pic:pic xmlns:pic="http://schemas.openxmlformats.org/drawingml/2006/picture">
+                  <pic:nvPicPr>
+                    <pic:cNvPr id="0" name="Picture 57"/>
+                    <pic:cNvPicPr>
+                      <a:picLocks noChangeAspect="1" noChangeArrowheads="1"/>
+                    </pic:cNvPicPr>
+                  </pic:nvPicPr>
+                  <pic:blipFill>
+                    <a:blip r:embed="rId14">
+                      <a:extLst>
+                        <a:ext uri="{28A0092B-C50C-407E-A947-70E740481C1C}">
+                          <a14:useLocalDpi xmlns:a14="http://schemas.microsoft.com/office/drawing/2010/main" val="0"/>
+                        </a:ext>
+                      </a:extLst>
+                    </a:blip>
+                    <a:srcRect/>
+                    <a:stretch>
+                      <a:fillRect/>
+                    </a:stretch>
+                  </pic:blipFill>
+                  <pic:spPr bwMode="auto">
+                    <a:xfrm>
+                      <a:off x="0" y="0"/>
+                      <a:ext cx="2800350" cy="752475"/>
+                    </a:xfrm>
+                    <a:prstGeom prst="rect">
+                      <a:avLst/>
+                    </a:prstGeom>
+                    <a:noFill/>
+                    <a:ln>
+                      <a:noFill/>
+                    </a:ln>
+                  </pic:spPr>
+                </pic:pic>
+              </a:graphicData>
+            </a:graphic>
+          </wp:inline>
+        </w:drawing>
+      </w:r>
+    </w:p>
+    <w:p>
+      <w:r>
+        <w:rPr>
+          <w:noProof/>
+        </w:rPr>
+        <w:drawing>
+          <wp:inline distT="0" distB="0" distL="0" distR="0" wp14:anchorId="342C1E83" wp14:editId="6B43F6FD">
+            <wp:extent cx="3629025" cy="2028825"/>
+            <wp:effectExtent l="0" t="0" r="9525" b="9525"/>
+            <wp:docPr id="1132155703" name="Picture 15"/>
+            <wp:cNvGraphicFramePr>
+              <a:graphicFrameLocks xmlns:a="http://schemas.openxmlformats.org/drawingml/2006/main" noChangeAspect="1"/>
+            </wp:cNvGraphicFramePr>
+            <a:graphic xmlns:a="http://schemas.openxmlformats.org/drawingml/2006/main">
+              <a:graphicData uri="http://schemas.openxmlformats.org/drawingml/2006/picture">
+                <pic:pic xmlns:pic="http://schemas.openxmlformats.org/drawingml/2006/picture">
+                  <pic:nvPicPr>
+                    <pic:cNvPr id="0" name="Picture 59"/>
+                    <pic:cNvPicPr>
+                      <a:picLocks noChangeAspect="1" noChangeArrowheads="1"/>
+                    </pic:cNvPicPr>
+                  </pic:nvPicPr>
+                  <pic:blipFill>
+                    <a:blip r:embed="rId15">
+                      <a:extLst>
+                        <a:ext uri="{28A0092B-C50C-407E-A947-70E740481C1C}">
+                          <a14:useLocalDpi xmlns:a14="http://schemas.microsoft.com/office/drawing/2010/main" val="0"/>
+                        </a:ext>
+                      </a:extLst>
+                    </a:blip>
+                    <a:srcRect/>
+                    <a:stretch>
+                      <a:fillRect/>
+                    </a:stretch>
+                  </pic:blipFill>
+                  <pic:spPr bwMode="auto">
+                    <a:xfrm>
+                      <a:off x="0" y="0"/>
+                      <a:ext cx="3629025" cy="2028825"/>
+                    </a:xfrm>
+                    <a:prstGeom prst="rect">
+                      <a:avLst/>
+                    </a:prstGeom>
+                    <a:noFill/>
+                    <a:ln>
+                      <a:noFill/>
+                    </a:ln>
+                  </pic:spPr>
+                </pic:pic>
+              </a:graphicData>
+            </a:graphic>
+          </wp:inline>
+        </w:drawing>
+      </w:r>
+    </w:p>
+    <w:p>
+      <w:r>
+        <w:rPr>
+          <w:rFonts w:ascii="Calibri" w:hAnsi="Calibri" w:cs="Calibri"/>
+          <w:noProof/>
+          <w:color w:val="000000"/>
+        </w:rPr>
+        <w:lastRenderedPageBreak/>
+        <w:drawing>
+          <wp:inline distT="0" distB="0" distL="0" distR="0" wp14:anchorId="713A9ED9" wp14:editId="5AC1D0CC">
+            <wp:extent cx="5731510" cy="8025765"/>
+            <wp:effectExtent l="0" t="0" r="2540" b="0"/>
+            <wp:docPr id="475583746" name="Picture 16"/>
+            <wp:cNvGraphicFramePr>
+              <a:graphicFrameLocks xmlns:a="http://schemas.openxmlformats.org/drawingml/2006/main" noChangeAspect="1"/>
+            </wp:cNvGraphicFramePr>
+            <a:graphic xmlns:a="http://schemas.openxmlformats.org/drawingml/2006/main">
+              <a:graphicData uri="http://schemas.openxmlformats.org/drawingml/2006/picture">
+                <pic:pic xmlns:pic="http://schemas.openxmlformats.org/drawingml/2006/picture">
+                  <pic:nvPicPr>
+                    <pic:cNvPr id="0" name="Picture 61"/>
+                    <pic:cNvPicPr>
+                      <a:picLocks noChangeAspect="1" noChangeArrowheads="1"/>
+                    </pic:cNvPicPr>
+                  </pic:nvPicPr>
+                  <pic:blipFill>
+                    <a:blip r:embed="rId16">
+                      <a:extLst>
+                        <a:ext uri="{28A0092B-C50C-407E-A947-70E740481C1C}">
+                          <a14:useLocalDpi xmlns:a14="http://schemas.microsoft.com/office/drawing/2010/main" val="0"/>
+                        </a:ext>
+                      </a:extLst>
+                    </a:blip>
+                    <a:srcRect/>
+                    <a:stretch>
+                      <a:fillRect/>
+                    </a:stretch>
+                  </pic:blipFill>
+                  <pic:spPr bwMode="auto">
+                    <a:xfrm>
+                      <a:off x="0" y="0"/>
+                      <a:ext cx="5731510" cy="8025765"/>
+                    </a:xfrm>
+                    <a:prstGeom prst="rect">
+                      <a:avLst/>
+                    </a:prstGeom>
+                    <a:noFill/>
+                    <a:ln>
+                      <a:noFill/>
+                    </a:ln>
+                  </pic:spPr>
+                </pic:pic>
+              </a:graphicData>
+            </a:graphic>
+          </wp:inline>
+        </w:drawing>
+      </w:r>
+    </w:p>
+    <w:p>
+      <w:r>
+        <w:t xml:space="preserve">FUNCTION </w:t>
+      </w:r>
+      <w:proofErr w:type="spellStart"/>
+      <w:r>
+        <w:t>calculate_linear_regression</w:t>
+      </w:r>
+      <w:proofErr w:type="spellEnd"/>
+      <w:r>
+        <w:t>(</w:t>
+      </w:r>
+      <w:proofErr w:type="spellStart"/>
+      <w:r>
+        <w:t>price_array</w:t>
+      </w:r>
+      <w:proofErr w:type="spellEnd"/>
+      <w:r>
+        <w:t>)</w:t>
+      </w:r>
+    </w:p>
+    <w:p>
+      <w:r>
+        <w:t xml:space="preserve">    INTEGER n = </w:t>
+      </w:r>
+      <w:proofErr w:type="gramStart"/>
+      <w:r>
+        <w:t>LENGTH(</w:t>
+      </w:r>
+      <w:proofErr w:type="spellStart"/>
+      <w:proofErr w:type="gramEnd"/>
+      <w:r>
+        <w:t>price_array</w:t>
+      </w:r>
+      <w:proofErr w:type="spellEnd"/>
+      <w:r>
+        <w:t>)</w:t>
+      </w:r>
+    </w:p>
+    <w:p>
+      <w:r>
+        <w:lastRenderedPageBreak/>
+        <w:t xml:space="preserve">    IF n &lt; 2 THEN</w:t>
+      </w:r>
+    </w:p>
+    <w:p>
+      <w:r>
+        <w:t xml:space="preserve">        RETURN ERROR "Insufficient data points"</w:t>
+      </w:r>
+    </w:p>
+    <w:p>
+      <w:r>
+        <w:t xml:space="preserve">    END IF</w:t>
+      </w:r>
+    </w:p>
+    <w:p/>
+    <w:p>
+      <w:r>
+        <w:t xml:space="preserve">    FLOAT </w:t>
+      </w:r>
+      <w:proofErr w:type="spellStart"/>
+      <w:r>
+        <w:t>sum_x</w:t>
+      </w:r>
+      <w:proofErr w:type="spellEnd"/>
+      <w:r>
+        <w:t xml:space="preserve"> = 0.0</w:t>
+      </w:r>
+    </w:p>
+    <w:p>
+      <w:r>
+        <w:t xml:space="preserve">    FLOAT </w:t>
+      </w:r>
+      <w:proofErr w:type="spellStart"/>
+      <w:r>
+        <w:t>sum_y</w:t>
+      </w:r>
+      <w:proofErr w:type="spellEnd"/>
+      <w:r>
+        <w:t xml:space="preserve"> = 0.0</w:t>
+      </w:r>
+    </w:p>
+    <w:p>
+      <w:r>
+        <w:t xml:space="preserve">    FLOAT </w:t>
+      </w:r>
+      <w:proofErr w:type="spellStart"/>
+      <w:r>
+        <w:t>sum_xy</w:t>
+      </w:r>
+      <w:proofErr w:type="spellEnd"/>
+      <w:r>
+        <w:t xml:space="preserve"> = 0.0</w:t>
+      </w:r>
+    </w:p>
+    <w:p>
+      <w:r>
+        <w:t xml:space="preserve">    FLOAT sum_x2 = 0.0</w:t>
+      </w:r>
+    </w:p>
+    <w:p/>
+    <w:p>
+      <w:r>
+        <w:t xml:space="preserve">    FOR </w:t>
+      </w:r>
+      <w:proofErr w:type="spellStart"/>
+      <w:r>
+        <w:t>i</w:t>
+      </w:r>
+      <w:proofErr w:type="spellEnd"/>
+      <w:r>
+        <w:t xml:space="preserve"> FROM 0 TO n - 1 DO</w:t>
+      </w:r>
+    </w:p>
+    <w:p>
+      <w:r>
+        <w:t xml:space="preserve">        FLOAT x = FLOAT(</w:t>
+      </w:r>
+      <w:proofErr w:type="spellStart"/>
+      <w:r>
+        <w:t>i</w:t>
+      </w:r>
+      <w:proofErr w:type="spellEnd"/>
+      <w:r>
+        <w:t>)</w:t>
+      </w:r>
+    </w:p>
+    <w:p>
+      <w:r>
+        <w:t xml:space="preserve">        FLOAT y = </w:t>
+      </w:r>
+      <w:proofErr w:type="spellStart"/>
+      <w:r>
+        <w:t>price_array</w:t>
+      </w:r>
+      <w:proofErr w:type="spellEnd"/>
+      <w:r>
+        <w:t>[</w:t>
+      </w:r>
+      <w:proofErr w:type="spellStart"/>
+      <w:r>
+        <w:t>i</w:t>
+      </w:r>
+      <w:proofErr w:type="spellEnd"/>
+      <w:r>
+        <w:t>]</w:t>
+      </w:r>
+    </w:p>
+    <w:p>
+      <w:r>
+        <w:t xml:space="preserve">        </w:t>
+      </w:r>
+      <w:proofErr w:type="spellStart"/>
+      <w:r>
+        <w:t>sum_x</w:t>
+      </w:r>
+      <w:proofErr w:type="spellEnd"/>
+      <w:r>
+        <w:t xml:space="preserve"> = </w:t>
+      </w:r>
+      <w:proofErr w:type="spellStart"/>
+      <w:r>
+        <w:t>sum_x</w:t>
+      </w:r>
+      <w:proofErr w:type="spellEnd"/>
+      <w:r>
+        <w:t xml:space="preserve"> + x</w:t>
+      </w:r>
+    </w:p>
+    <w:p>
+      <w:r>
+        <w:t xml:space="preserve">        </w:t>
+      </w:r>
+      <w:proofErr w:type="spellStart"/>
+      <w:r>
+        <w:t>sum_y</w:t>
+      </w:r>
+      <w:proofErr w:type="spellEnd"/>
+      <w:r>
+        <w:t xml:space="preserve"> = </w:t>
+      </w:r>
+      <w:proofErr w:type="spellStart"/>
+      <w:r>
+        <w:t>sum_y</w:t>
+      </w:r>
+      <w:proofErr w:type="spellEnd"/>
+      <w:r>
+        <w:t xml:space="preserve"> + y</w:t>
+      </w:r>
+    </w:p>
+    <w:p>
+      <w:r>
+        <w:t xml:space="preserve">        </w:t>
+      </w:r>
+      <w:proofErr w:type="spellStart"/>
+      <w:r>
+        <w:t>sum_xy</w:t>
+      </w:r>
+      <w:proofErr w:type="spellEnd"/>
+      <w:r>
+        <w:t xml:space="preserve"> = </w:t>
+      </w:r>
+      <w:proofErr w:type="spellStart"/>
+      <w:r>
+        <w:t>sum_xy</w:t>
+      </w:r>
+      <w:proofErr w:type="spellEnd"/>
+      <w:r>
+        <w:t xml:space="preserve"> + (x * y)</w:t>
+      </w:r>
+    </w:p>
+    <w:p>
+      <w:r>
+        <w:t xml:space="preserve">        sum_x2 = sum_x2 + (x * x)</w:t>
+      </w:r>
+    </w:p>
+    <w:p>
+      <w:r>
+        <w:t xml:space="preserve">    END FOR</w:t>
+      </w:r>
+    </w:p>
+    <w:p/>
+    <w:p>
+      <w:r>
+        <w:t xml:space="preserve">    # Calculate slope (m) and intercept (c)</w:t>
+      </w:r>
+    </w:p>
+    <w:p>
+      <w:r>
+        <w:t xml:space="preserve">    FLOAT denominator = (n * sum_x2) - (</w:t>
+      </w:r>
+      <w:proofErr w:type="spellStart"/>
+      <w:r>
+        <w:t>sum_x</w:t>
+      </w:r>
+      <w:proofErr w:type="spellEnd"/>
+      <w:r>
+        <w:t xml:space="preserve"> * </w:t>
+      </w:r>
+      <w:proofErr w:type="spellStart"/>
+      <w:r>
+        <w:t>sum_x</w:t>
+      </w:r>
+      <w:proofErr w:type="spellEnd"/>
+      <w:r>
+        <w:t>)</w:t>
+      </w:r>
+    </w:p>
+    <w:p>
+      <w:r>
+        <w:t xml:space="preserve">    IF denominator == 0 THEN</w:t>
+      </w:r>
+    </w:p>
+    <w:p>
+      <w:r>
+        <w:t xml:space="preserve">        FLOAT slope = 0.0</w:t>
+      </w:r>
+    </w:p>
+    <w:p>
+      <w:r>
+        <w:t xml:space="preserve">    ELSE</w:t>
+      </w:r>
+    </w:p>
+    <w:p>
+      <w:r>
+        <w:t xml:space="preserve">        FLOAT slope = ((n * </w:t>
+      </w:r>
+      <w:proofErr w:type="spellStart"/>
+      <w:r>
+        <w:t>sum_xy</w:t>
+      </w:r>
+      <w:proofErr w:type="spellEnd"/>
+      <w:r>
+        <w:t>) - (</w:t>
+      </w:r>
+      <w:proofErr w:type="spellStart"/>
+      <w:r>
+        <w:t>sum_x</w:t>
+      </w:r>
+      <w:proofErr w:type="spellEnd"/>
+      <w:r>
+        <w:t xml:space="preserve"> * </w:t>
+      </w:r>
+      <w:proofErr w:type="spellStart"/>
+      <w:r>
+        <w:t>sum_y</w:t>
+      </w:r>
+      <w:proofErr w:type="spellEnd"/>
+      <w:r>
+        <w:t>)) / denominator</w:t>
+      </w:r>
+    </w:p>
+    <w:p>
+      <w:r>
+        <w:t xml:space="preserve">    END IF</w:t>
+      </w:r>
+    </w:p>
+    <w:p/>
+    <w:p>
+      <w:r>
+        <w:t xml:space="preserve">    FLOAT intercept = (</w:t>
+      </w:r>
+      <w:proofErr w:type="spellStart"/>
+      <w:r>
+        <w:t>sum_y</w:t>
+      </w:r>
+      <w:proofErr w:type="spellEnd"/>
+      <w:r>
+        <w:t xml:space="preserve"> - (slope * </w:t>
+      </w:r>
+      <w:proofErr w:type="spellStart"/>
+      <w:r>
+        <w:t>sum_x</w:t>
+      </w:r>
+      <w:proofErr w:type="spellEnd"/>
+      <w:r>
+        <w:t>)) / n</w:t>
+      </w:r>
+    </w:p>
+    <w:p/>
+    <w:p>
+      <w:r>
+        <w:t xml:space="preserve">    # Generate 7-day forecast array</w:t>
+      </w:r>
+    </w:p>
+    <w:p>
+      <w:r>
+        <w:t xml:space="preserve">    ARRAY forecasts = []</w:t>
+      </w:r>
+    </w:p>
+    <w:p>
+      <w:r>
+        <w:t xml:space="preserve">    FOR day FROM 1 TO 7 DO</w:t>
+      </w:r>
+    </w:p>
+    <w:p>
+      <w:r>
+        <w:lastRenderedPageBreak/>
+        <w:t xml:space="preserve">        FLOAT </w:t>
+      </w:r>
+      <w:proofErr w:type="spellStart"/>
+      <w:r>
+        <w:t>future_x</w:t>
+      </w:r>
+      <w:proofErr w:type="spellEnd"/>
+      <w:r>
+        <w:t xml:space="preserve"> = </w:t>
+      </w:r>
+      <w:proofErr w:type="gramStart"/>
+      <w:r>
+        <w:t>FLOAT(</w:t>
+      </w:r>
+      <w:proofErr w:type="gramEnd"/>
+      <w:r>
+        <w:t>n - 1 + day)</w:t>
+      </w:r>
+    </w:p>
+    <w:p>
+      <w:r>
+        <w:t xml:space="preserve">        FLOAT </w:t>
+      </w:r>
+      <w:proofErr w:type="spellStart"/>
+      <w:r>
+        <w:t>predicted_price</w:t>
+      </w:r>
+      <w:proofErr w:type="spellEnd"/>
+      <w:r>
+        <w:t xml:space="preserve"> = (slope * </w:t>
+      </w:r>
+      <w:proofErr w:type="spellStart"/>
+      <w:r>
+        <w:t>future_x</w:t>
+      </w:r>
+      <w:proofErr w:type="spellEnd"/>
+      <w:r>
+        <w:t>) + intercept</w:t>
+      </w:r>
+    </w:p>
+    <w:p>
+      <w:r>
+        <w:t xml:space="preserve">        APPEND </w:t>
+      </w:r>
+      <w:proofErr w:type="spellStart"/>
+      <w:r>
+        <w:t>predicted_price</w:t>
+      </w:r>
+      <w:proofErr w:type="spellEnd"/>
+      <w:r>
+        <w:t xml:space="preserve"> TO forecasts</w:t>
+      </w:r>
+    </w:p>
+    <w:p>
+      <w:r>
+        <w:t xml:space="preserve">    END FOR</w:t>
+      </w:r>
+    </w:p>
+    <w:p/>
+    <w:p>
+      <w:r>
+        <w:t xml:space="preserve">    RETURN forecasts</w:t>
+      </w:r>
+    </w:p>
+    <w:p>
+      <w:r>
+        <w:t>END FUNCTION</w:t>
+      </w:r>
+    </w:p>
+    <w:p/>
+    <w:p>
+      <w:r>
+        <w:t xml:space="preserve">Algorithm 2: 14-Period Relative Strength Index (RSI) </w:t>
+      </w:r>
+    </w:p>
+    <w:p>
+      <w:r>
+        <w:t>Purpose: Measures speed and change of price movements to identify overbought (RSI &gt;=70) or oversold (RSI &lt;= 30) conditions.</w:t>
+      </w:r>
+    </w:p>
+    <w:p/>
+    <w:p>
+      <w:r>
+        <w:t>Time Complexity Justification: O(N) - Iterates over the price array once to compute price differences, gains and losses.</w:t>
+      </w:r>
+    </w:p>
+    <w:p/>
+    <w:p>
+      <w:r>
+        <w:rPr>
+          <w:rFonts w:ascii="Calibri" w:hAnsi="Calibri" w:cs="Calibri"/>
+          <w:noProof/>
+          <w:color w:val="000000"/>
+        </w:rPr>
+        <w:lastRenderedPageBreak/>
+        <w:drawing>
+          <wp:inline distT="0" distB="0" distL="0" distR="0" wp14:anchorId="795FBB22" wp14:editId="33DCB104">
+            <wp:extent cx="5731510" cy="8025765"/>
+            <wp:effectExtent l="0" t="0" r="2540" b="0"/>
+            <wp:docPr id="2117449151" name="Picture 17"/>
+            <wp:cNvGraphicFramePr>
+              <a:graphicFrameLocks xmlns:a="http://schemas.openxmlformats.org/drawingml/2006/main" noChangeAspect="1"/>
+            </wp:cNvGraphicFramePr>
+            <a:graphic xmlns:a="http://schemas.openxmlformats.org/drawingml/2006/main">
+              <a:graphicData uri="http://schemas.openxmlformats.org/drawingml/2006/picture">
+                <pic:pic xmlns:pic="http://schemas.openxmlformats.org/drawingml/2006/picture">
+                  <pic:nvPicPr>
+                    <pic:cNvPr id="0" name="Picture 63"/>
+                    <pic:cNvPicPr>
+                      <a:picLocks noChangeAspect="1" noChangeArrowheads="1"/>
+                    </pic:cNvPicPr>
+                  </pic:nvPicPr>
+                  <pic:blipFill>
+                    <a:blip r:embed="rId17">
+                      <a:extLst>
+                        <a:ext uri="{28A0092B-C50C-407E-A947-70E740481C1C}">
+                          <a14:useLocalDpi xmlns:a14="http://schemas.microsoft.com/office/drawing/2010/main" val="0"/>
+                        </a:ext>
+                      </a:extLst>
+                    </a:blip>
+                    <a:srcRect/>
+                    <a:stretch>
+                      <a:fillRect/>
+                    </a:stretch>
+                  </pic:blipFill>
+                  <pic:spPr bwMode="auto">
+                    <a:xfrm>
+                      <a:off x="0" y="0"/>
+                      <a:ext cx="5731510" cy="8025765"/>
+                    </a:xfrm>
+                    <a:prstGeom prst="rect">
+                      <a:avLst/>
+                    </a:prstGeom>
+                    <a:noFill/>
+                    <a:ln>
+                      <a:noFill/>
+                    </a:ln>
+                  </pic:spPr>
+                </pic:pic>
+              </a:graphicData>
+            </a:graphic>
+          </wp:inline>
+        </w:drawing>
+      </w:r>
+    </w:p>
+    <w:p>
+      <w:r>
+        <w:t xml:space="preserve">FUNCTION </w:t>
+      </w:r>
+      <w:proofErr w:type="spellStart"/>
+      <w:r>
+        <w:t>calculate_</w:t>
+      </w:r>
+      <w:proofErr w:type="gramStart"/>
+      <w:r>
+        <w:t>rsi</w:t>
+      </w:r>
+      <w:proofErr w:type="spellEnd"/>
+      <w:r>
+        <w:t>(</w:t>
+      </w:r>
+      <w:proofErr w:type="spellStart"/>
+      <w:proofErr w:type="gramEnd"/>
+      <w:r>
+        <w:t>price_array</w:t>
+      </w:r>
+      <w:proofErr w:type="spellEnd"/>
+      <w:r>
+        <w:t>, period = 14)</w:t>
+      </w:r>
+    </w:p>
+    <w:p>
+      <w:r>
+        <w:t xml:space="preserve">    INTEGER n = </w:t>
+      </w:r>
+      <w:proofErr w:type="gramStart"/>
+      <w:r>
+        <w:t>LENGTH(</w:t>
+      </w:r>
+      <w:proofErr w:type="spellStart"/>
+      <w:proofErr w:type="gramEnd"/>
+      <w:r>
+        <w:t>price_array</w:t>
+      </w:r>
+      <w:proofErr w:type="spellEnd"/>
+      <w:r>
+        <w:t>)</w:t>
+      </w:r>
+    </w:p>
+    <w:p>
+      <w:r>
+        <w:lastRenderedPageBreak/>
+        <w:t xml:space="preserve">    IF n &lt;= period THEN</w:t>
+      </w:r>
+    </w:p>
+    <w:p>
+      <w:r>
+        <w:t xml:space="preserve">        RETURN </w:t>
+      </w:r>
+      <w:proofErr w:type="gramStart"/>
+      <w:r>
+        <w:t>50.0  #</w:t>
+      </w:r>
+      <w:proofErr w:type="gramEnd"/>
+      <w:r>
+        <w:t xml:space="preserve"> Default neutral RSI if data points are insufficient</w:t>
+      </w:r>
+    </w:p>
+    <w:p>
+      <w:r>
+        <w:t xml:space="preserve">    END IF</w:t>
+      </w:r>
+    </w:p>
+    <w:p/>
+    <w:p>
+      <w:r>
+        <w:t xml:space="preserve">    FLOAT </w:t>
+      </w:r>
+      <w:proofErr w:type="spellStart"/>
+      <w:r>
+        <w:t>total_gain</w:t>
+      </w:r>
+      <w:proofErr w:type="spellEnd"/>
+      <w:r>
+        <w:t xml:space="preserve"> = 0.0</w:t>
+      </w:r>
+    </w:p>
+    <w:p>
+      <w:r>
+        <w:t xml:space="preserve">    FLOAT </w:t>
+      </w:r>
+      <w:proofErr w:type="spellStart"/>
+      <w:r>
+        <w:t>total_loss</w:t>
+      </w:r>
+      <w:proofErr w:type="spellEnd"/>
+      <w:r>
+        <w:t xml:space="preserve"> = 0.0</w:t>
+      </w:r>
+    </w:p>
+    <w:p/>
+    <w:p>
+      <w:r>
+        <w:t xml:space="preserve">    # Calculate initial average gain and loss for first 14 periods</w:t>
+      </w:r>
+    </w:p>
+    <w:p>
+      <w:r>
+        <w:t xml:space="preserve">    FOR </w:t>
+      </w:r>
+      <w:proofErr w:type="spellStart"/>
+      <w:r>
+        <w:t>i</w:t>
+      </w:r>
+      <w:proofErr w:type="spellEnd"/>
+      <w:r>
+        <w:t xml:space="preserve"> FROM 1 TO period DO</w:t>
+      </w:r>
+    </w:p>
+    <w:p>
+      <w:r>
+        <w:t xml:space="preserve">        FLOAT change = </w:t>
+      </w:r>
+      <w:proofErr w:type="spellStart"/>
+      <w:r>
+        <w:t>price_array</w:t>
+      </w:r>
+      <w:proofErr w:type="spellEnd"/>
+      <w:r>
+        <w:t>[</w:t>
+      </w:r>
+      <w:proofErr w:type="spellStart"/>
+      <w:r>
+        <w:t>i</w:t>
+      </w:r>
+      <w:proofErr w:type="spellEnd"/>
+      <w:r>
+        <w:t xml:space="preserve">] - </w:t>
+      </w:r>
+      <w:proofErr w:type="spellStart"/>
+      <w:r>
+        <w:t>price_</w:t>
+      </w:r>
+      <w:proofErr w:type="gramStart"/>
+      <w:r>
+        <w:t>array</w:t>
+      </w:r>
+      <w:proofErr w:type="spellEnd"/>
+      <w:r>
+        <w:t>[</w:t>
+      </w:r>
+      <w:proofErr w:type="spellStart"/>
+      <w:proofErr w:type="gramEnd"/>
+      <w:r>
+        <w:t>i</w:t>
+      </w:r>
+      <w:proofErr w:type="spellEnd"/>
+      <w:r>
+        <w:t xml:space="preserve"> - 1]</w:t>
+      </w:r>
+    </w:p>
+    <w:p>
+      <w:r>
+        <w:t xml:space="preserve">        IF change &gt; 0 THEN</w:t>
+      </w:r>
+    </w:p>
+    <w:p>
+      <w:r>
+        <w:t xml:space="preserve">            </w:t>
+      </w:r>
+      <w:proofErr w:type="spellStart"/>
+      <w:r>
+        <w:t>total_gain</w:t>
+      </w:r>
+      <w:proofErr w:type="spellEnd"/>
+      <w:r>
+        <w:t xml:space="preserve"> = </w:t>
+      </w:r>
+      <w:proofErr w:type="spellStart"/>
+      <w:r>
+        <w:t>total_gain</w:t>
+      </w:r>
+      <w:proofErr w:type="spellEnd"/>
+      <w:r>
+        <w:t xml:space="preserve"> + change</w:t>
+      </w:r>
+    </w:p>
+    <w:p>
+      <w:r>
+        <w:t xml:space="preserve">        ELSE</w:t>
+      </w:r>
+    </w:p>
+    <w:p>
+      <w:r>
+        <w:t xml:space="preserve">            </w:t>
+      </w:r>
+      <w:proofErr w:type="spellStart"/>
+      <w:r>
+        <w:t>total_loss</w:t>
+      </w:r>
+      <w:proofErr w:type="spellEnd"/>
+      <w:r>
+        <w:t xml:space="preserve"> = </w:t>
+      </w:r>
+      <w:proofErr w:type="spellStart"/>
+      <w:r>
+        <w:t>total_loss</w:t>
+      </w:r>
+      <w:proofErr w:type="spellEnd"/>
+      <w:r>
+        <w:t xml:space="preserve"> + </w:t>
+      </w:r>
+      <w:proofErr w:type="gramStart"/>
+      <w:r>
+        <w:t>ABS(</w:t>
+      </w:r>
+      <w:proofErr w:type="gramEnd"/>
+      <w:r>
+        <w:t>change)</w:t>
+      </w:r>
+    </w:p>
+    <w:p>
+      <w:r>
+        <w:t xml:space="preserve">        END IF</w:t>
+      </w:r>
+    </w:p>
+    <w:p>
+      <w:r>
+        <w:t xml:space="preserve">    END FOR</w:t>
+      </w:r>
+    </w:p>
+    <w:p/>
+    <w:p>
+      <w:r>
+        <w:t xml:space="preserve">    FLOAT </w:t>
+      </w:r>
+      <w:proofErr w:type="spellStart"/>
+      <w:r>
+        <w:t>avg_gain</w:t>
+      </w:r>
+      <w:proofErr w:type="spellEnd"/>
+      <w:r>
+        <w:t xml:space="preserve"> = </w:t>
+      </w:r>
+      <w:proofErr w:type="spellStart"/>
+      <w:r>
+        <w:t>total_gain</w:t>
+      </w:r>
+      <w:proofErr w:type="spellEnd"/>
+      <w:r>
+        <w:t xml:space="preserve"> / period</w:t>
+      </w:r>
+    </w:p>
+    <w:p>
+      <w:r>
+        <w:t xml:space="preserve">    FLOAT </w:t>
+      </w:r>
+      <w:proofErr w:type="spellStart"/>
+      <w:r>
+        <w:t>avg_loss</w:t>
+      </w:r>
+      <w:proofErr w:type="spellEnd"/>
+      <w:r>
+        <w:t xml:space="preserve"> = </w:t>
+      </w:r>
+      <w:proofErr w:type="spellStart"/>
+      <w:r>
+        <w:t>total_loss</w:t>
+      </w:r>
+      <w:proofErr w:type="spellEnd"/>
+      <w:r>
+        <w:t xml:space="preserve"> / period</w:t>
+      </w:r>
+    </w:p>
+    <w:p/>
+    <w:p>
+      <w:r>
+        <w:t xml:space="preserve">    # Smooth RSI using remaining price points</w:t>
+      </w:r>
+    </w:p>
+    <w:p>
+      <w:r>
+        <w:t xml:space="preserve">    FOR </w:t>
+      </w:r>
+      <w:proofErr w:type="spellStart"/>
+      <w:r>
+        <w:t>i</w:t>
+      </w:r>
+      <w:proofErr w:type="spellEnd"/>
+      <w:r>
+        <w:t xml:space="preserve"> FROM period + 1 TO n - 1 DO</w:t>
+      </w:r>
+    </w:p>
+    <w:p>
+      <w:r>
+        <w:t xml:space="preserve">        FLOAT change = </w:t>
+      </w:r>
+      <w:proofErr w:type="spellStart"/>
+      <w:r>
+        <w:t>price_array</w:t>
+      </w:r>
+      <w:proofErr w:type="spellEnd"/>
+      <w:r>
+        <w:t>[</w:t>
+      </w:r>
+      <w:proofErr w:type="spellStart"/>
+      <w:r>
+        <w:t>i</w:t>
+      </w:r>
+      <w:proofErr w:type="spellEnd"/>
+      <w:r>
+        <w:t xml:space="preserve">] - </w:t>
+      </w:r>
+      <w:proofErr w:type="spellStart"/>
+      <w:r>
+        <w:t>price_</w:t>
+      </w:r>
+      <w:proofErr w:type="gramStart"/>
+      <w:r>
+        <w:t>array</w:t>
+      </w:r>
+      <w:proofErr w:type="spellEnd"/>
+      <w:r>
+        <w:t>[</w:t>
+      </w:r>
+      <w:proofErr w:type="spellStart"/>
+      <w:proofErr w:type="gramEnd"/>
+      <w:r>
+        <w:t>i</w:t>
+      </w:r>
+      <w:proofErr w:type="spellEnd"/>
+      <w:r>
+        <w:t xml:space="preserve"> - 1]</w:t>
+      </w:r>
+    </w:p>
+    <w:p>
+      <w:r>
+        <w:t xml:space="preserve">        IF change &gt; 0 THEN</w:t>
+      </w:r>
+    </w:p>
+    <w:p>
+      <w:r>
+        <w:t xml:space="preserve">            </w:t>
+      </w:r>
+      <w:proofErr w:type="spellStart"/>
+      <w:r>
+        <w:t>avg_gain</w:t>
+      </w:r>
+      <w:proofErr w:type="spellEnd"/>
+      <w:r>
+        <w:t xml:space="preserve"> = ((</w:t>
+      </w:r>
+      <w:proofErr w:type="spellStart"/>
+      <w:r>
+        <w:t>avg_gain</w:t>
+      </w:r>
+      <w:proofErr w:type="spellEnd"/>
+      <w:r>
+        <w:t xml:space="preserve"> * 13) + change) / 14</w:t>
+      </w:r>
+    </w:p>
+    <w:p>
+      <w:r>
+        <w:t xml:space="preserve">            </w:t>
+      </w:r>
+      <w:proofErr w:type="spellStart"/>
+      <w:r>
+        <w:t>avg_loss</w:t>
+      </w:r>
+      <w:proofErr w:type="spellEnd"/>
+      <w:r>
+        <w:t xml:space="preserve"> = (</w:t>
+      </w:r>
+      <w:proofErr w:type="spellStart"/>
+      <w:r>
+        <w:t>avg_loss</w:t>
+      </w:r>
+      <w:proofErr w:type="spellEnd"/>
+      <w:r>
+        <w:t xml:space="preserve"> * 13) / 14</w:t>
+      </w:r>
+    </w:p>
+    <w:p>
+      <w:r>
+        <w:t xml:space="preserve">        ELSE</w:t>
+      </w:r>
+    </w:p>
+    <w:p>
+      <w:r>
+        <w:t xml:space="preserve">            </w:t>
+      </w:r>
+      <w:proofErr w:type="spellStart"/>
+      <w:r>
+        <w:t>avg_gain</w:t>
+      </w:r>
+      <w:proofErr w:type="spellEnd"/>
+      <w:r>
+        <w:t xml:space="preserve"> = (</w:t>
+      </w:r>
+      <w:proofErr w:type="spellStart"/>
+      <w:r>
+        <w:t>avg_gain</w:t>
+      </w:r>
+      <w:proofErr w:type="spellEnd"/>
+      <w:r>
+        <w:t xml:space="preserve"> * 13) / 14</w:t>
+      </w:r>
+    </w:p>
+    <w:p>
+      <w:r>
+        <w:t xml:space="preserve">            </w:t>
+      </w:r>
+      <w:proofErr w:type="spellStart"/>
+      <w:r>
+        <w:t>avg_loss</w:t>
+      </w:r>
+      <w:proofErr w:type="spellEnd"/>
+      <w:r>
+        <w:t xml:space="preserve"> = ((</w:t>
+      </w:r>
+      <w:proofErr w:type="spellStart"/>
+      <w:r>
+        <w:t>avg_loss</w:t>
+      </w:r>
+      <w:proofErr w:type="spellEnd"/>
+      <w:r>
+        <w:t xml:space="preserve"> * 13) + </w:t>
+      </w:r>
+      <w:proofErr w:type="gramStart"/>
+      <w:r>
+        <w:t>ABS(</w:t>
+      </w:r>
+      <w:proofErr w:type="gramEnd"/>
+      <w:r>
+        <w:t>change)) / 14</w:t>
+      </w:r>
+    </w:p>
+    <w:p>
+      <w:r>
+        <w:t xml:space="preserve">        END IF</w:t>
+      </w:r>
+    </w:p>
+    <w:p>
+      <w:r>
+        <w:t xml:space="preserve">    END FOR</w:t>
+      </w:r>
+    </w:p>
+    <w:p/>
+    <w:p>
+      <w:r>
+        <w:t xml:space="preserve">    IF </w:t>
+      </w:r>
+      <w:proofErr w:type="spellStart"/>
+      <w:r>
+        <w:t>avg_loss</w:t>
+      </w:r>
+      <w:proofErr w:type="spellEnd"/>
+      <w:r>
+        <w:t xml:space="preserve"> == 0 THEN</w:t>
+      </w:r>
+    </w:p>
+    <w:p>
+      <w:r>
+        <w:t xml:space="preserve">        RETURN 100.0</w:t>
+      </w:r>
+    </w:p>
+    <w:p>
+      <w:r>
+        <w:t xml:space="preserve">    END IF</w:t>
+      </w:r>
+    </w:p>
+    <w:p/>
+    <w:p>
+      <w:r>
+        <w:t xml:space="preserve">    FLOAT </w:t>
+      </w:r>
+      <w:proofErr w:type="spellStart"/>
+      <w:r>
+        <w:t>rs</w:t>
+      </w:r>
+      <w:proofErr w:type="spellEnd"/>
+      <w:r>
+        <w:t xml:space="preserve"> = </w:t>
+      </w:r>
+      <w:proofErr w:type="spellStart"/>
+      <w:r>
+        <w:t>avg_gain</w:t>
+      </w:r>
+      <w:proofErr w:type="spellEnd"/>
+      <w:r>
+        <w:t xml:space="preserve"> / </w:t>
+      </w:r>
+      <w:proofErr w:type="spellStart"/>
+      <w:r>
+        <w:t>avg_loss</w:t>
+      </w:r>
+      <w:proofErr w:type="spellEnd"/>
+    </w:p>
+    <w:p>
+      <w:r>
+        <w:t xml:space="preserve">    FLOAT </w:t>
+      </w:r>
+      <w:proofErr w:type="spellStart"/>
+      <w:r>
+        <w:t>rsi</w:t>
+      </w:r>
+      <w:proofErr w:type="spellEnd"/>
+      <w:r>
+        <w:t xml:space="preserve"> = 100.0 - (100.0 / (1.0 + </w:t>
+      </w:r>
+      <w:proofErr w:type="spellStart"/>
+      <w:r>
+        <w:t>rs</w:t>
+      </w:r>
+      <w:proofErr w:type="spellEnd"/>
+      <w:r>
+        <w:t>))</w:t>
+      </w:r>
+    </w:p>
+    <w:p>
+      <w:r>
+        <w:t xml:space="preserve">    RETURN </w:t>
+      </w:r>
+      <w:proofErr w:type="spellStart"/>
+      <w:r>
+        <w:t>rsi</w:t>
+      </w:r>
+      <w:proofErr w:type="spellEnd"/>
+    </w:p>
+    <w:p>
+      <w:r>
+        <w:t>END FUNCTION</w:t>
+      </w:r>
+    </w:p>
+    <w:p/>
+    <w:p>
+      <w:r>
+        <w:t xml:space="preserve">Algorithm 3: Brute-Force Account Lockout Security Guard </w:t>
+      </w:r>
+    </w:p>
+    <w:p>
+      <w:r>
+        <w:t>Purpose: Locks user account for 15 minutes after 3 consecutive failed login attempts to protect against brute-force attacks.</w:t>
+      </w:r>
+    </w:p>
+    <w:p/>
+    <w:p>
+      <w:r>
+        <w:rPr>
+          <w:rFonts w:ascii="Calibri" w:hAnsi="Calibri" w:cs="Calibri"/>
+          <w:noProof/>
+          <w:color w:val="000000"/>
+        </w:rPr>
+        <w:lastRenderedPageBreak/>
+        <w:drawing>
+          <wp:inline distT="0" distB="0" distL="0" distR="0" wp14:anchorId="10C2E589" wp14:editId="33931DD1">
+            <wp:extent cx="5731510" cy="8593455"/>
+            <wp:effectExtent l="0" t="0" r="2540" b="0"/>
+            <wp:docPr id="253313409" name="Picture 18"/>
+            <wp:cNvGraphicFramePr>
+              <a:graphicFrameLocks xmlns:a="http://schemas.openxmlformats.org/drawingml/2006/main" noChangeAspect="1"/>
+            </wp:cNvGraphicFramePr>
+            <a:graphic xmlns:a="http://schemas.openxmlformats.org/drawingml/2006/main">
+              <a:graphicData uri="http://schemas.openxmlformats.org/drawingml/2006/picture">
+                <pic:pic xmlns:pic="http://schemas.openxmlformats.org/drawingml/2006/picture">
+                  <pic:nvPicPr>
+                    <pic:cNvPr id="0" name="Picture 65"/>
+                    <pic:cNvPicPr>
+                      <a:picLocks noChangeAspect="1" noChangeArrowheads="1"/>
+                    </pic:cNvPicPr>
+                  </pic:nvPicPr>
+                  <pic:blipFill>
+                    <a:blip r:embed="rId18">
+                      <a:extLst>
+                        <a:ext uri="{28A0092B-C50C-407E-A947-70E740481C1C}">
+                          <a14:useLocalDpi xmlns:a14="http://schemas.microsoft.com/office/drawing/2010/main" val="0"/>
+                        </a:ext>
+                      </a:extLst>
+                    </a:blip>
+                    <a:srcRect/>
+                    <a:stretch>
+                      <a:fillRect/>
+                    </a:stretch>
+                  </pic:blipFill>
+                  <pic:spPr bwMode="auto">
+                    <a:xfrm>
+                      <a:off x="0" y="0"/>
+                      <a:ext cx="5731510" cy="8593455"/>
+                    </a:xfrm>
+                    <a:prstGeom prst="rect">
+                      <a:avLst/>
+                    </a:prstGeom>
+                    <a:noFill/>
+                    <a:ln>
+                      <a:noFill/>
+                    </a:ln>
+                  </pic:spPr>
+                </pic:pic>
+              </a:graphicData>
+            </a:graphic>
+          </wp:inline>
+        </w:drawing>
+      </w:r>
+    </w:p>
+    <w:p>
+      <w:r>
+        <w:lastRenderedPageBreak/>
+        <w:t xml:space="preserve">FUNCTION </w:t>
+      </w:r>
+      <w:proofErr w:type="spellStart"/>
+      <w:r>
+        <w:t>verify_login_</w:t>
+      </w:r>
+      <w:proofErr w:type="gramStart"/>
+      <w:r>
+        <w:t>security</w:t>
+      </w:r>
+      <w:proofErr w:type="spellEnd"/>
+      <w:r>
+        <w:t>(</w:t>
+      </w:r>
+      <w:proofErr w:type="spellStart"/>
+      <w:proofErr w:type="gramEnd"/>
+      <w:r>
+        <w:t>username_input</w:t>
+      </w:r>
+      <w:proofErr w:type="spellEnd"/>
+      <w:r>
+        <w:t xml:space="preserve">, </w:t>
+      </w:r>
+      <w:proofErr w:type="spellStart"/>
+      <w:r>
+        <w:t>password_input</w:t>
+      </w:r>
+      <w:proofErr w:type="spellEnd"/>
+      <w:r>
+        <w:t>)</w:t>
+      </w:r>
+    </w:p>
+    <w:p>
+      <w:r>
+        <w:t xml:space="preserve">    RECORD user = QUERY_</w:t>
+      </w:r>
+      <w:proofErr w:type="gramStart"/>
+      <w:r>
+        <w:t>DATABASE(</w:t>
+      </w:r>
+      <w:proofErr w:type="gramEnd"/>
+      <w:r>
+        <w:t xml:space="preserve">"SELECT * FROM users WHERE username </w:t>
+      </w:r>
+      <w:proofErr w:type="gramStart"/>
+      <w:r>
+        <w:t>= ?</w:t>
+      </w:r>
+      <w:proofErr w:type="gramEnd"/>
+      <w:r>
+        <w:t xml:space="preserve">", </w:t>
+      </w:r>
+      <w:proofErr w:type="spellStart"/>
+      <w:r>
+        <w:t>username_input</w:t>
+      </w:r>
+      <w:proofErr w:type="spellEnd"/>
+      <w:r>
+        <w:t>)</w:t>
+      </w:r>
+    </w:p>
+    <w:p>
+      <w:r>
+        <w:t xml:space="preserve">    </w:t>
+      </w:r>
+    </w:p>
+    <w:p>
+      <w:r>
+        <w:t xml:space="preserve">    IF user IS NULL THEN</w:t>
+      </w:r>
+    </w:p>
+    <w:p>
+      <w:r>
+        <w:t xml:space="preserve">        RETURN "INVALID_CREDENTIALS"</w:t>
+      </w:r>
+    </w:p>
+    <w:p>
+      <w:r>
+        <w:t xml:space="preserve">    END IF</w:t>
+      </w:r>
+    </w:p>
+    <w:p/>
+    <w:p>
+      <w:r>
+        <w:t xml:space="preserve">    # Step A: Check if account is currently locked out</w:t>
+      </w:r>
+    </w:p>
+    <w:p>
+      <w:r>
+        <w:t xml:space="preserve">    IF </w:t>
+      </w:r>
+      <w:proofErr w:type="spellStart"/>
+      <w:proofErr w:type="gramStart"/>
+      <w:r>
+        <w:t>user.lockout</w:t>
+      </w:r>
+      <w:proofErr w:type="gramEnd"/>
+      <w:r>
+        <w:t>_until</w:t>
+      </w:r>
+      <w:proofErr w:type="spellEnd"/>
+      <w:r>
+        <w:t xml:space="preserve"> IS NOT NULL THEN</w:t>
+      </w:r>
+    </w:p>
+    <w:p>
+      <w:r>
+        <w:t xml:space="preserve">        TIMESTAMP </w:t>
+      </w:r>
+      <w:proofErr w:type="spellStart"/>
+      <w:r>
+        <w:t>current_time</w:t>
+      </w:r>
+      <w:proofErr w:type="spellEnd"/>
+      <w:r>
+        <w:t xml:space="preserve"> = GET_CURRENT_</w:t>
+      </w:r>
+      <w:proofErr w:type="gramStart"/>
+      <w:r>
+        <w:t>TIMESTAMP(</w:t>
+      </w:r>
+      <w:proofErr w:type="gramEnd"/>
+      <w:r>
+        <w:t>)</w:t>
+      </w:r>
+    </w:p>
+    <w:p>
+      <w:r>
+        <w:t xml:space="preserve">        IF </w:t>
+      </w:r>
+      <w:proofErr w:type="spellStart"/>
+      <w:r>
+        <w:t>current_time</w:t>
+      </w:r>
+      <w:proofErr w:type="spellEnd"/>
+      <w:r>
+        <w:t xml:space="preserve"> &lt; PARSE_</w:t>
+      </w:r>
+      <w:proofErr w:type="gramStart"/>
+      <w:r>
+        <w:t>TIMESTAMP(</w:t>
+      </w:r>
+      <w:proofErr w:type="spellStart"/>
+      <w:r>
+        <w:t>user.lockout</w:t>
+      </w:r>
+      <w:proofErr w:type="gramEnd"/>
+      <w:r>
+        <w:t>_until</w:t>
+      </w:r>
+      <w:proofErr w:type="spellEnd"/>
+      <w:r>
+        <w:t>) THEN</w:t>
+      </w:r>
+    </w:p>
+    <w:p>
+      <w:r>
+        <w:t xml:space="preserve">            RETURN "ACCOUNT_LOCKED_OUT"</w:t>
+      </w:r>
+    </w:p>
+    <w:p>
+      <w:r>
+        <w:t xml:space="preserve">        ELSE</w:t>
+      </w:r>
+    </w:p>
+    <w:p>
+      <w:r>
+        <w:t xml:space="preserve">            # Lockout period expired; reset failed attempts counter</w:t>
+      </w:r>
+    </w:p>
+    <w:p>
+      <w:r>
+        <w:t xml:space="preserve">            EXECUTE_</w:t>
+      </w:r>
+      <w:proofErr w:type="gramStart"/>
+      <w:r>
+        <w:t>SQL(</w:t>
+      </w:r>
+      <w:proofErr w:type="gramEnd"/>
+      <w:r>
+        <w:t xml:space="preserve">"UPDATE users SET </w:t>
+      </w:r>
+      <w:proofErr w:type="spellStart"/>
+      <w:r>
+        <w:t>failed_attempts</w:t>
+      </w:r>
+      <w:proofErr w:type="spellEnd"/>
+      <w:r>
+        <w:t xml:space="preserve"> = 0, </w:t>
+      </w:r>
+      <w:proofErr w:type="spellStart"/>
+      <w:r>
+        <w:t>lockout_until</w:t>
+      </w:r>
+      <w:proofErr w:type="spellEnd"/>
+      <w:r>
+        <w:t xml:space="preserve"> = NULL WHERE </w:t>
+      </w:r>
+      <w:proofErr w:type="spellStart"/>
+      <w:r>
+        <w:t>user_id</w:t>
+      </w:r>
+      <w:proofErr w:type="spellEnd"/>
+      <w:r>
+        <w:t xml:space="preserve"> </w:t>
+      </w:r>
+      <w:proofErr w:type="gramStart"/>
+      <w:r>
+        <w:t>= ?</w:t>
+      </w:r>
+      <w:proofErr w:type="gramEnd"/>
+      <w:r>
+        <w:t xml:space="preserve">", </w:t>
+      </w:r>
+      <w:proofErr w:type="spellStart"/>
+      <w:r>
+        <w:t>user.user_id</w:t>
+      </w:r>
+      <w:proofErr w:type="spellEnd"/>
+      <w:r>
+        <w:t>)</w:t>
+      </w:r>
+    </w:p>
+    <w:p>
+      <w:r>
+        <w:t xml:space="preserve">            </w:t>
+      </w:r>
+      <w:proofErr w:type="spellStart"/>
+      <w:proofErr w:type="gramStart"/>
+      <w:r>
+        <w:t>user.failed</w:t>
+      </w:r>
+      <w:proofErr w:type="gramEnd"/>
+      <w:r>
+        <w:t>_attempts</w:t>
+      </w:r>
+      <w:proofErr w:type="spellEnd"/>
+      <w:r>
+        <w:t xml:space="preserve"> = 0</w:t>
+      </w:r>
+    </w:p>
+    <w:p>
+      <w:r>
+        <w:t xml:space="preserve">        END IF</w:t>
+      </w:r>
+    </w:p>
+    <w:p>
+      <w:r>
+        <w:t xml:space="preserve">    END IF</w:t>
+      </w:r>
+    </w:p>
+    <w:p/>
+    <w:p>
+      <w:r>
+        <w:t xml:space="preserve">    # Step B: Native PBKDF2 Constant-Time Verification</w:t>
+      </w:r>
+    </w:p>
+    <w:p>
+      <w:r>
+        <w:t xml:space="preserve">    BOOLEAN </w:t>
+      </w:r>
+      <w:proofErr w:type="spellStart"/>
+      <w:r>
+        <w:t>is_valid</w:t>
+      </w:r>
+      <w:proofErr w:type="spellEnd"/>
+      <w:r>
+        <w:t xml:space="preserve"> = VERIFY_PBKDF2_CONSTANT_</w:t>
+      </w:r>
+      <w:proofErr w:type="gramStart"/>
+      <w:r>
+        <w:t>TIME(</w:t>
+      </w:r>
+      <w:proofErr w:type="spellStart"/>
+      <w:r>
+        <w:t>user.password</w:t>
+      </w:r>
+      <w:proofErr w:type="gramEnd"/>
+      <w:r>
+        <w:t>_hash</w:t>
+      </w:r>
+      <w:proofErr w:type="spellEnd"/>
+      <w:r>
+        <w:t xml:space="preserve">, </w:t>
+      </w:r>
+      <w:proofErr w:type="spellStart"/>
+      <w:r>
+        <w:t>password_input</w:t>
+      </w:r>
+      <w:proofErr w:type="spellEnd"/>
+      <w:r>
+        <w:t>)</w:t>
+      </w:r>
+    </w:p>
+    <w:p/>
+    <w:p>
+      <w:r>
+        <w:t xml:space="preserve">    # Step C: Success or Failure Branching</w:t>
+      </w:r>
+    </w:p>
+    <w:p>
+      <w:r>
+        <w:t xml:space="preserve">    IF </w:t>
+      </w:r>
+      <w:proofErr w:type="spellStart"/>
+      <w:r>
+        <w:t>is_valid</w:t>
+      </w:r>
+      <w:proofErr w:type="spellEnd"/>
+      <w:r>
+        <w:t xml:space="preserve"> THEN</w:t>
+      </w:r>
+    </w:p>
+    <w:p>
+      <w:r>
+        <w:t xml:space="preserve">        EXECUTE_</w:t>
+      </w:r>
+      <w:proofErr w:type="gramStart"/>
+      <w:r>
+        <w:t>SQL(</w:t>
+      </w:r>
+      <w:proofErr w:type="gramEnd"/>
+      <w:r>
+        <w:t xml:space="preserve">"UPDATE users SET </w:t>
+      </w:r>
+      <w:proofErr w:type="spellStart"/>
+      <w:r>
+        <w:t>failed_attempts</w:t>
+      </w:r>
+      <w:proofErr w:type="spellEnd"/>
+      <w:r>
+        <w:t xml:space="preserve"> = 0 WHERE </w:t>
+      </w:r>
+      <w:proofErr w:type="spellStart"/>
+      <w:r>
+        <w:t>user_id</w:t>
+      </w:r>
+      <w:proofErr w:type="spellEnd"/>
+      <w:r>
+        <w:t xml:space="preserve"> </w:t>
+      </w:r>
+      <w:proofErr w:type="gramStart"/>
+      <w:r>
+        <w:t>= ?</w:t>
+      </w:r>
+      <w:proofErr w:type="gramEnd"/>
+      <w:r>
+        <w:t xml:space="preserve">", </w:t>
+      </w:r>
+      <w:proofErr w:type="spellStart"/>
+      <w:r>
+        <w:t>user.user_id</w:t>
+      </w:r>
+      <w:proofErr w:type="spellEnd"/>
+      <w:r>
+        <w:t>)</w:t>
+      </w:r>
+    </w:p>
+    <w:p>
+      <w:r>
+        <w:t xml:space="preserve">        RETURN "LOGIN_SUCCESS"</w:t>
+      </w:r>
+    </w:p>
+    <w:p>
+      <w:r>
+        <w:t xml:space="preserve">    ELSE</w:t>
+      </w:r>
+    </w:p>
+    <w:p>
+      <w:r>
+        <w:t xml:space="preserve">        INTEGER </w:t>
+      </w:r>
+      <w:proofErr w:type="spellStart"/>
+      <w:r>
+        <w:t>new_attempts</w:t>
+      </w:r>
+      <w:proofErr w:type="spellEnd"/>
+      <w:r>
+        <w:t xml:space="preserve"> = </w:t>
+      </w:r>
+      <w:proofErr w:type="spellStart"/>
+      <w:proofErr w:type="gramStart"/>
+      <w:r>
+        <w:t>user.failed</w:t>
+      </w:r>
+      <w:proofErr w:type="gramEnd"/>
+      <w:r>
+        <w:t>_attempts</w:t>
+      </w:r>
+      <w:proofErr w:type="spellEnd"/>
+      <w:r>
+        <w:t xml:space="preserve"> + 1</w:t>
+      </w:r>
+    </w:p>
+    <w:p>
+      <w:r>
+        <w:t xml:space="preserve">        IF </w:t>
+      </w:r>
+      <w:proofErr w:type="spellStart"/>
+      <w:r>
+        <w:t>new_attempts</w:t>
+      </w:r>
+      <w:proofErr w:type="spellEnd"/>
+      <w:r>
+        <w:t xml:space="preserve"> &gt;= 3 THEN</w:t>
+      </w:r>
+    </w:p>
+    <w:p>
+      <w:r>
+        <w:t xml:space="preserve">            TIMESTAMP </w:t>
+      </w:r>
+      <w:proofErr w:type="spellStart"/>
+      <w:r>
+        <w:t>lockout_time</w:t>
+      </w:r>
+      <w:proofErr w:type="spellEnd"/>
+      <w:r>
+        <w:t xml:space="preserve"> = GET_CURRENT_</w:t>
+      </w:r>
+      <w:proofErr w:type="gramStart"/>
+      <w:r>
+        <w:t>TIMESTAMP(</w:t>
+      </w:r>
+      <w:proofErr w:type="gramEnd"/>
+      <w:r>
+        <w:t>) + INTERVAL 15 MINUTES</w:t>
+      </w:r>
+    </w:p>
+    <w:p>
+      <w:r>
+        <w:lastRenderedPageBreak/>
+        <w:t xml:space="preserve">            EXECUTE_</w:t>
+      </w:r>
+      <w:proofErr w:type="gramStart"/>
+      <w:r>
+        <w:t>SQL(</w:t>
+      </w:r>
+      <w:proofErr w:type="gramEnd"/>
+      <w:r>
+        <w:t xml:space="preserve">"UPDATE users SET </w:t>
+      </w:r>
+      <w:proofErr w:type="spellStart"/>
+      <w:r>
+        <w:t>failed_attempts</w:t>
+      </w:r>
+      <w:proofErr w:type="spellEnd"/>
+      <w:r>
+        <w:t xml:space="preserve"> </w:t>
+      </w:r>
+      <w:proofErr w:type="gramStart"/>
+      <w:r>
+        <w:t>= ?</w:t>
+      </w:r>
+      <w:proofErr w:type="gramEnd"/>
+      <w:r>
+        <w:t xml:space="preserve">, </w:t>
+      </w:r>
+      <w:proofErr w:type="spellStart"/>
+      <w:r>
+        <w:t>lockout_until</w:t>
+      </w:r>
+      <w:proofErr w:type="spellEnd"/>
+      <w:r>
+        <w:t xml:space="preserve"> </w:t>
+      </w:r>
+      <w:proofErr w:type="gramStart"/>
+      <w:r>
+        <w:t>= ?</w:t>
+      </w:r>
+      <w:proofErr w:type="gramEnd"/>
+      <w:r>
+        <w:t xml:space="preserve"> WHERE </w:t>
+      </w:r>
+      <w:proofErr w:type="spellStart"/>
+      <w:r>
+        <w:t>user_id</w:t>
+      </w:r>
+      <w:proofErr w:type="spellEnd"/>
+      <w:r>
+        <w:t xml:space="preserve"> </w:t>
+      </w:r>
+      <w:proofErr w:type="gramStart"/>
+      <w:r>
+        <w:t>= ?</w:t>
+      </w:r>
+      <w:proofErr w:type="gramEnd"/>
+      <w:r>
+        <w:t xml:space="preserve">", </w:t>
+      </w:r>
+      <w:proofErr w:type="spellStart"/>
+      <w:r>
+        <w:t>new_attempts</w:t>
+      </w:r>
+      <w:proofErr w:type="spellEnd"/>
+      <w:r>
+        <w:t xml:space="preserve">, </w:t>
+      </w:r>
+      <w:proofErr w:type="spellStart"/>
+      <w:r>
+        <w:t>lockout_time</w:t>
+      </w:r>
+      <w:proofErr w:type="spellEnd"/>
+      <w:r>
+        <w:t xml:space="preserve">, </w:t>
+      </w:r>
+      <w:proofErr w:type="spellStart"/>
+      <w:r>
+        <w:t>user.user_id</w:t>
+      </w:r>
+      <w:proofErr w:type="spellEnd"/>
+      <w:r>
+        <w:t>)</w:t>
+      </w:r>
+    </w:p>
+    <w:p>
+      <w:r>
+        <w:t xml:space="preserve">            RETURN "ACCOUNT_LOCKED_OUT"</w:t>
+      </w:r>
+    </w:p>
+    <w:p>
+      <w:r>
+        <w:t xml:space="preserve">        ELSE</w:t>
+      </w:r>
+    </w:p>
+    <w:p>
+      <w:r>
+        <w:t xml:space="preserve">            EXECUTE_</w:t>
+      </w:r>
+      <w:proofErr w:type="gramStart"/>
+      <w:r>
+        <w:t>SQL(</w:t>
+      </w:r>
+      <w:proofErr w:type="gramEnd"/>
+      <w:r>
+        <w:t xml:space="preserve">"UPDATE users SET </w:t>
+      </w:r>
+      <w:proofErr w:type="spellStart"/>
+      <w:r>
+        <w:t>failed_attempts</w:t>
+      </w:r>
+      <w:proofErr w:type="spellEnd"/>
+      <w:r>
+        <w:t xml:space="preserve"> </w:t>
+      </w:r>
+      <w:proofErr w:type="gramStart"/>
+      <w:r>
+        <w:t>= ?</w:t>
+      </w:r>
+      <w:proofErr w:type="gramEnd"/>
+      <w:r>
+        <w:t xml:space="preserve"> WHERE </w:t>
+      </w:r>
+      <w:proofErr w:type="spellStart"/>
+      <w:r>
+        <w:t>user_id</w:t>
+      </w:r>
+      <w:proofErr w:type="spellEnd"/>
+      <w:r>
+        <w:t xml:space="preserve"> </w:t>
+      </w:r>
+      <w:proofErr w:type="gramStart"/>
+      <w:r>
+        <w:t>= ?</w:t>
+      </w:r>
+      <w:proofErr w:type="gramEnd"/>
+      <w:r>
+        <w:t xml:space="preserve">", </w:t>
+      </w:r>
+      <w:proofErr w:type="spellStart"/>
+      <w:r>
+        <w:t>new_attempts</w:t>
+      </w:r>
+      <w:proofErr w:type="spellEnd"/>
+      <w:r>
+        <w:t xml:space="preserve">, </w:t>
+      </w:r>
+      <w:proofErr w:type="spellStart"/>
+      <w:r>
+        <w:t>user.user_id</w:t>
+      </w:r>
+      <w:proofErr w:type="spellEnd"/>
+      <w:r>
+        <w:t>)</w:t>
+      </w:r>
+    </w:p>
+    <w:p>
+      <w:r>
+        <w:t xml:space="preserve">            RETURN "INVALID_CREDENTIALS"</w:t>
+      </w:r>
+    </w:p>
+    <w:p>
+      <w:r>
+        <w:t xml:space="preserve">        END IF</w:t>
+      </w:r>
+    </w:p>
+    <w:p>
+      <w:r>
+        <w:t xml:space="preserve">    END IF</w:t>
+      </w:r>
+    </w:p>
+    <w:p>
+      <w:r>
+        <w:t>END FUNCTION</w:t>
+      </w:r>
+    </w:p>
+    <w:p/>
+    <w:p/>
+    <w:p>
+      <w:r>
+        <w:t>FUNCTION VERIFY_PBKDF2_CONSTANT_</w:t>
+      </w:r>
+      <w:proofErr w:type="gramStart"/>
+      <w:r>
+        <w:t>TIME(</w:t>
+      </w:r>
+      <w:proofErr w:type="spellStart"/>
+      <w:proofErr w:type="gramEnd"/>
+      <w:r>
+        <w:t>stored_hash_string</w:t>
+      </w:r>
+      <w:proofErr w:type="spellEnd"/>
+      <w:r>
+        <w:t xml:space="preserve">, </w:t>
+      </w:r>
+      <w:proofErr w:type="spellStart"/>
+      <w:r>
+        <w:t>candidate_password</w:t>
+      </w:r>
+      <w:proofErr w:type="spellEnd"/>
+      <w:r>
+        <w:t>)</w:t>
+      </w:r>
+    </w:p>
+    <w:p>
+      <w:r>
+        <w:t xml:space="preserve">    # Parse stored string: "</w:t>
+      </w:r>
+      <w:proofErr w:type="spellStart"/>
+      <w:r>
+        <w:t>iterationssalthash</w:t>
+      </w:r>
+      <w:proofErr w:type="spellEnd"/>
+      <w:r>
+        <w:t>"</w:t>
+      </w:r>
+    </w:p>
+    <w:p>
+      <w:r>
+        <w:t xml:space="preserve">    ARRAY parts = </w:t>
+      </w:r>
+      <w:proofErr w:type="gramStart"/>
+      <w:r>
+        <w:t>SPLIT(</w:t>
+      </w:r>
+      <w:proofErr w:type="spellStart"/>
+      <w:proofErr w:type="gramEnd"/>
+      <w:r>
+        <w:t>stored_hash_string</w:t>
+      </w:r>
+      <w:proofErr w:type="spellEnd"/>
+      <w:r>
+        <w:t>, "$")</w:t>
+      </w:r>
+    </w:p>
+    <w:p>
+      <w:r>
+        <w:t xml:space="preserve">    INTEGER iterations = TO_</w:t>
+      </w:r>
+      <w:proofErr w:type="gramStart"/>
+      <w:r>
+        <w:t>INTEGER(parts[</w:t>
+      </w:r>
+      <w:proofErr w:type="gramEnd"/>
+      <w:r>
+        <w:t>0])</w:t>
+      </w:r>
+    </w:p>
+    <w:p>
+      <w:r>
+        <w:t xml:space="preserve">    STRING salt = </w:t>
+      </w:r>
+      <w:proofErr w:type="gramStart"/>
+      <w:r>
+        <w:t>parts[</w:t>
+      </w:r>
+      <w:proofErr w:type="gramEnd"/>
+      <w:r>
+        <w:t>1]</w:t>
+      </w:r>
+    </w:p>
+    <w:p>
+      <w:r>
+        <w:t xml:space="preserve">    STRING </w:t>
+      </w:r>
+      <w:proofErr w:type="spellStart"/>
+      <w:r>
+        <w:t>original_hash</w:t>
+      </w:r>
+      <w:proofErr w:type="spellEnd"/>
+      <w:r>
+        <w:t xml:space="preserve"> = </w:t>
+      </w:r>
+      <w:proofErr w:type="gramStart"/>
+      <w:r>
+        <w:t>parts[</w:t>
+      </w:r>
+      <w:proofErr w:type="gramEnd"/>
+      <w:r>
+        <w:t>2]</w:t>
+      </w:r>
+    </w:p>
+    <w:p/>
+    <w:p>
+      <w:r>
+        <w:t xml:space="preserve">    # Recompute PBKDF2-HMAC-SHA256 hash using the extracted salt and iteration count</w:t>
+      </w:r>
+    </w:p>
+    <w:p>
+      <w:r>
+        <w:t xml:space="preserve">    STRING </w:t>
+      </w:r>
+      <w:proofErr w:type="spellStart"/>
+      <w:r>
+        <w:t>candidate_hash</w:t>
+      </w:r>
+      <w:proofErr w:type="spellEnd"/>
+      <w:r>
+        <w:t xml:space="preserve"> = COMPUTE_PBKDF2_SHA256(</w:t>
+      </w:r>
+      <w:proofErr w:type="spellStart"/>
+      <w:r>
+        <w:t>candidate_password</w:t>
+      </w:r>
+      <w:proofErr w:type="spellEnd"/>
+      <w:r>
+        <w:t>, salt, iterations)</w:t>
+      </w:r>
+    </w:p>
+    <w:p/>
+    <w:p>
+      <w:r>
+        <w:t xml:space="preserve">    IF </w:t>
+      </w:r>
+      <w:proofErr w:type="gramStart"/>
+      <w:r>
+        <w:t>LENGTH(</w:t>
+      </w:r>
+      <w:proofErr w:type="spellStart"/>
+      <w:proofErr w:type="gramEnd"/>
+      <w:r>
+        <w:t>original_hash</w:t>
+      </w:r>
+      <w:proofErr w:type="spellEnd"/>
+      <w:proofErr w:type="gramStart"/>
+      <w:r>
+        <w:t>) !</w:t>
+      </w:r>
+      <w:proofErr w:type="gramEnd"/>
+      <w:r>
+        <w:t xml:space="preserve">= </w:t>
+      </w:r>
+      <w:proofErr w:type="gramStart"/>
+      <w:r>
+        <w:t>LENGTH(</w:t>
+      </w:r>
+      <w:proofErr w:type="spellStart"/>
+      <w:proofErr w:type="gramEnd"/>
+      <w:r>
+        <w:t>candidate_hash</w:t>
+      </w:r>
+      <w:proofErr w:type="spellEnd"/>
+      <w:r>
+        <w:t>) THEN</w:t>
+      </w:r>
+    </w:p>
+    <w:p>
+      <w:r>
+        <w:t xml:space="preserve">        RETURN FALSE</w:t>
+      </w:r>
+    </w:p>
+    <w:p>
+      <w:r>
+        <w:t xml:space="preserve">    END IF</w:t>
+      </w:r>
+    </w:p>
+    <w:p/>
+    <w:p>
+      <w:r>
+        <w:t xml:space="preserve">    # Constant-time comparison using bitwise XOR accumulation to stop timing attacks</w:t>
+      </w:r>
+    </w:p>
+    <w:p>
+      <w:r>
+        <w:t xml:space="preserve">    INTEGER difference = 0</w:t>
+      </w:r>
+    </w:p>
+    <w:p>
+      <w:r>
+        <w:t xml:space="preserve">    FOR </w:t>
+      </w:r>
+      <w:proofErr w:type="spellStart"/>
+      <w:r>
+        <w:t>i</w:t>
+      </w:r>
+      <w:proofErr w:type="spellEnd"/>
+      <w:r>
+        <w:t xml:space="preserve"> FROM 0 TO </w:t>
+      </w:r>
+      <w:proofErr w:type="gramStart"/>
+      <w:r>
+        <w:t>LENGTH(</w:t>
+      </w:r>
+      <w:proofErr w:type="spellStart"/>
+      <w:proofErr w:type="gramEnd"/>
+      <w:r>
+        <w:t>original_hash</w:t>
+      </w:r>
+      <w:proofErr w:type="spellEnd"/>
+      <w:r>
+        <w:t>) - 1 DO</w:t>
+      </w:r>
+    </w:p>
+    <w:p>
+      <w:r>
+        <w:t xml:space="preserve">        difference = difference BITWISE_OR (</w:t>
+      </w:r>
+      <w:proofErr w:type="gramStart"/>
+      <w:r>
+        <w:t>ASCII(</w:t>
+      </w:r>
+      <w:proofErr w:type="spellStart"/>
+      <w:proofErr w:type="gramEnd"/>
+      <w:r>
+        <w:t>original_hash</w:t>
+      </w:r>
+      <w:proofErr w:type="spellEnd"/>
+      <w:r>
+        <w:t>[</w:t>
+      </w:r>
+      <w:proofErr w:type="spellStart"/>
+      <w:r>
+        <w:t>i</w:t>
+      </w:r>
+      <w:proofErr w:type="spellEnd"/>
+      <w:r>
+        <w:t xml:space="preserve">]) BITWISE_XOR </w:t>
+      </w:r>
+      <w:proofErr w:type="gramStart"/>
+      <w:r>
+        <w:t>ASCII(</w:t>
+      </w:r>
+      <w:proofErr w:type="spellStart"/>
+      <w:proofErr w:type="gramEnd"/>
+      <w:r>
+        <w:t>candidate_hash</w:t>
+      </w:r>
+      <w:proofErr w:type="spellEnd"/>
+      <w:r>
+        <w:t>[</w:t>
+      </w:r>
+      <w:proofErr w:type="spellStart"/>
+      <w:r>
+        <w:t>i</w:t>
+      </w:r>
+      <w:proofErr w:type="spellEnd"/>
+      <w:r>
+        <w:t>]))</w:t>
+      </w:r>
+    </w:p>
+    <w:p>
+      <w:r>
+        <w:t xml:space="preserve">    END FOR</w:t>
+      </w:r>
+    </w:p>
+    <w:p/>
+    <w:p>
+      <w:r>
+        <w:t xml:space="preserve">    RETURN (difference == 0)</w:t>
+      </w:r>
+    </w:p>
+    <w:p>
+      <w:r>
+        <w:t>END FUNCTION</w:t>
+      </w:r>
+    </w:p>
+    <w:p/>
+    <w:p>
+      <w:r>
+        <w:t xml:space="preserve">3.2.6 Iterative Development Test Plan Matrix </w:t>
+      </w:r>
+    </w:p>
+    <w:p>
+      <w:r>
+        <w:t>To ensure systematic testing throughout the build phase, I have created a development test matrix covering normal, boundary, and erroneous data types.</w:t>
+      </w:r>
+    </w:p>
+    <w:p/>
+    <w:tbl>
+      <w:tblPr>
+        <w:tblW w:w="0" w:type="auto"/>
+        <w:tblCellMar>
+          <w:top w:w="15" w:type="dxa"/>
+          <w:left w:w="15" w:type="dxa"/>
+          <w:bottom w:w="15" w:type="dxa"/>
+          <w:right w:w="15" w:type="dxa"/>
+        </w:tblCellMar>
+        <w:tblLook w:val="04A0" w:firstRow="1" w:lastRow="0" w:firstColumn="1" w:lastColumn="0" w:noHBand="0" w:noVBand="1"/>
+      </w:tblPr>
+      <w:tblGrid>
+        <w:gridCol w:w="613"/>
+        <w:gridCol w:w="1596"/>
+        <w:gridCol w:w="2321"/>
+        <w:gridCol w:w="3146"/>
+        <w:gridCol w:w="1330"/>
+      </w:tblGrid>
+      <w:tr>
+        <w:tc>
+          <w:tcPr>
+            <w:tcW w:w="0" w:type="auto"/>
+            <w:tcBorders>
+              <w:top w:val="single" w:sz="8" w:space="0" w:color="000000"/>
+              <w:left w:val="single" w:sz="8" w:space="0" w:color="000000"/>
+              <w:bottom w:val="single" w:sz="8" w:space="0" w:color="000000"/>
+              <w:right w:val="single" w:sz="8" w:space="0" w:color="000000"/>
+            </w:tcBorders>
+            <w:tcMar>
+              <w:top w:w="100" w:type="dxa"/>
+              <w:left w:w="100" w:type="dxa"/>
+              <w:bottom w:w="100" w:type="dxa"/>
+              <w:right w:w="100" w:type="dxa"/>
+            </w:tcMar>
+            <w:hideMark/>
+          </w:tcPr>
+          <w:p>
+            <w:pPr>
+              <w:spacing w:after="0" w:line="240" w:lineRule="auto"/>
+              <w:rPr>
+                <w:rFonts w:ascii="Times New Roman" w:eastAsia="Times New Roman" w:hAnsi="Times New Roman" w:cs="Times New Roman"/>
+                <w:kern w:val="0"/>
+                <w:sz w:val="24"/>
+                <w:szCs w:val="24"/>
+                <w:lang w:eastAsia="en-IN"/>
+                <w14:ligatures w14:val="none"/>
+              </w:rPr>
+            </w:pPr>
+            <w:r>
+              <w:rPr>
+                <w:rFonts w:ascii="Calibri" w:eastAsia="Times New Roman" w:hAnsi="Calibri" w:cs="Calibri"/>
+                <w:color w:val="000000"/>
+                <w:kern w:val="0"/>
+                <w:lang w:eastAsia="en-IN"/>
+                <w14:ligatures w14:val="none"/>
+              </w:rPr>
+              <w:t>Test ID</w:t>
+            </w:r>
+          </w:p>
+        </w:tc>
+        <w:tc>
+          <w:tcPr>
+            <w:tcW w:w="0" w:type="auto"/>
+            <w:tcBorders>
+              <w:top w:val="single" w:sz="8" w:space="0" w:color="000000"/>
+              <w:left w:val="single" w:sz="8" w:space="0" w:color="000000"/>
+              <w:bottom w:val="single" w:sz="8" w:space="0" w:color="000000"/>
+              <w:right w:val="single" w:sz="8" w:space="0" w:color="000000"/>
+            </w:tcBorders>
+            <w:tcMar>
+              <w:top w:w="100" w:type="dxa"/>
+              <w:left w:w="100" w:type="dxa"/>
+              <w:bottom w:w="100" w:type="dxa"/>
+              <w:right w:w="100" w:type="dxa"/>
+            </w:tcMar>
+            <w:hideMark/>
+          </w:tcPr>
+          <w:p>
+            <w:pPr>
+              <w:spacing w:after="0" w:line="240" w:lineRule="auto"/>
+              <w:rPr>
+                <w:rFonts w:ascii="Times New Roman" w:eastAsia="Times New Roman" w:hAnsi="Times New Roman" w:cs="Times New Roman"/>
+                <w:kern w:val="0"/>
+                <w:sz w:val="24"/>
+                <w:szCs w:val="24"/>
+                <w:lang w:eastAsia="en-IN"/>
+                <w14:ligatures w14:val="none"/>
+              </w:rPr>
+            </w:pPr>
+            <w:r>
+              <w:rPr>
+                <w:rFonts w:ascii="Calibri" w:eastAsia="Times New Roman" w:hAnsi="Calibri" w:cs="Calibri"/>
+                <w:color w:val="000000"/>
+                <w:kern w:val="0"/>
+                <w:lang w:eastAsia="en-IN"/>
+                <w14:ligatures w14:val="none"/>
+              </w:rPr>
+              <w:t>Milestone Features</w:t>
+            </w:r>
+          </w:p>
+        </w:tc>
+        <w:tc>
+          <w:tcPr>
+            <w:tcW w:w="0" w:type="auto"/>
+            <w:tcBorders>
+              <w:top w:val="single" w:sz="8" w:space="0" w:color="000000"/>
+              <w:left w:val="single" w:sz="8" w:space="0" w:color="000000"/>
+              <w:bottom w:val="single" w:sz="8" w:space="0" w:color="000000"/>
+              <w:right w:val="single" w:sz="8" w:space="0" w:color="000000"/>
+            </w:tcBorders>
+            <w:tcMar>
+              <w:top w:w="100" w:type="dxa"/>
+              <w:left w:w="100" w:type="dxa"/>
+              <w:bottom w:w="100" w:type="dxa"/>
+              <w:right w:w="100" w:type="dxa"/>
+            </w:tcMar>
+            <w:hideMark/>
+          </w:tcPr>
+          <w:p>
+            <w:pPr>
+              <w:spacing w:after="0" w:line="240" w:lineRule="auto"/>
+              <w:rPr>
+                <w:rFonts w:ascii="Times New Roman" w:eastAsia="Times New Roman" w:hAnsi="Times New Roman" w:cs="Times New Roman"/>
+                <w:kern w:val="0"/>
+                <w:sz w:val="24"/>
+                <w:szCs w:val="24"/>
+                <w:lang w:eastAsia="en-IN"/>
+                <w14:ligatures w14:val="none"/>
+              </w:rPr>
+            </w:pPr>
+            <w:r>
+              <w:rPr>
+                <w:rFonts w:ascii="Calibri" w:eastAsia="Times New Roman" w:hAnsi="Calibri" w:cs="Calibri"/>
+                <w:color w:val="000000"/>
+                <w:kern w:val="0"/>
+                <w:lang w:eastAsia="en-IN"/>
+                <w14:ligatures w14:val="none"/>
+              </w:rPr>
+              <w:t>Test Description &amp; Inputs</w:t>
+            </w:r>
+          </w:p>
+        </w:tc>
+        <w:tc>
+          <w:tcPr>
+            <w:tcW w:w="0" w:type="auto"/>
+            <w:tcBorders>
+              <w:top w:val="single" w:sz="8" w:space="0" w:color="000000"/>
+              <w:left w:val="single" w:sz="8" w:space="0" w:color="000000"/>
+              <w:bottom w:val="single" w:sz="8" w:space="0" w:color="000000"/>
+              <w:right w:val="single" w:sz="8" w:space="0" w:color="000000"/>
+            </w:tcBorders>
+            <w:tcMar>
+              <w:top w:w="100" w:type="dxa"/>
+              <w:left w:w="100" w:type="dxa"/>
+              <w:bottom w:w="100" w:type="dxa"/>
+              <w:right w:w="100" w:type="dxa"/>
+            </w:tcMar>
+            <w:hideMark/>
+          </w:tcPr>
+          <w:p>
+            <w:pPr>
+              <w:spacing w:after="0" w:line="240" w:lineRule="auto"/>
+              <w:rPr>
+                <w:rFonts w:ascii="Times New Roman" w:eastAsia="Times New Roman" w:hAnsi="Times New Roman" w:cs="Times New Roman"/>
+                <w:kern w:val="0"/>
+                <w:sz w:val="24"/>
+                <w:szCs w:val="24"/>
+                <w:lang w:eastAsia="en-IN"/>
+                <w14:ligatures w14:val="none"/>
+              </w:rPr>
+            </w:pPr>
+            <w:r>
+              <w:rPr>
+                <w:rFonts w:ascii="Calibri" w:eastAsia="Times New Roman" w:hAnsi="Calibri" w:cs="Calibri"/>
+                <w:color w:val="000000"/>
+                <w:kern w:val="0"/>
+                <w:lang w:eastAsia="en-IN"/>
+                <w14:ligatures w14:val="none"/>
+              </w:rPr>
+              <w:t>Expected Output/Behaviour</w:t>
+            </w:r>
+          </w:p>
+        </w:tc>
+        <w:tc>
+          <w:tcPr>
+            <w:tcW w:w="0" w:type="auto"/>
+            <w:tcBorders>
+              <w:top w:val="single" w:sz="8" w:space="0" w:color="000000"/>
+              <w:left w:val="single" w:sz="8" w:space="0" w:color="000000"/>
+              <w:bottom w:val="single" w:sz="8" w:space="0" w:color="000000"/>
+              <w:right w:val="single" w:sz="8" w:space="0" w:color="000000"/>
+            </w:tcBorders>
+            <w:tcMar>
+              <w:top w:w="100" w:type="dxa"/>
+              <w:left w:w="100" w:type="dxa"/>
+              <w:bottom w:w="100" w:type="dxa"/>
+              <w:right w:w="100" w:type="dxa"/>
+            </w:tcMar>
+            <w:hideMark/>
+          </w:tcPr>
+          <w:p>
+            <w:pPr>
+              <w:spacing w:after="0" w:line="240" w:lineRule="auto"/>
+              <w:rPr>
+                <w:rFonts w:ascii="Times New Roman" w:eastAsia="Times New Roman" w:hAnsi="Times New Roman" w:cs="Times New Roman"/>
+                <w:kern w:val="0"/>
+                <w:sz w:val="24"/>
+                <w:szCs w:val="24"/>
+                <w:lang w:eastAsia="en-IN"/>
+                <w14:ligatures w14:val="none"/>
+              </w:rPr>
+            </w:pPr>
+            <w:r>
+              <w:rPr>
+                <w:rFonts w:ascii="Calibri" w:eastAsia="Times New Roman" w:hAnsi="Calibri" w:cs="Calibri"/>
+                <w:color w:val="000000"/>
+                <w:kern w:val="0"/>
+                <w:lang w:eastAsia="en-IN"/>
+                <w14:ligatures w14:val="none"/>
+              </w:rPr>
+              <w:t>Data Type Category</w:t>
+            </w:r>
+          </w:p>
+        </w:tc>
+      </w:tr>
+      <w:tr>
+        <w:tc>
+          <w:tcPr>
+            <w:tcW w:w="0" w:type="auto"/>
+            <w:tcBorders>
+              <w:top w:val="single" w:sz="8" w:space="0" w:color="000000"/>
+              <w:left w:val="single" w:sz="8" w:space="0" w:color="000000"/>
+              <w:bottom w:val="single" w:sz="8" w:space="0" w:color="000000"/>
+              <w:right w:val="single" w:sz="8" w:space="0" w:color="000000"/>
+            </w:tcBorders>
+            <w:tcMar>
+              <w:top w:w="100" w:type="dxa"/>
+              <w:left w:w="100" w:type="dxa"/>
+              <w:bottom w:w="100" w:type="dxa"/>
+              <w:right w:w="100" w:type="dxa"/>
+            </w:tcMar>
+            <w:hideMark/>
+          </w:tcPr>
+          <w:p>
+            <w:pPr>
+              <w:spacing w:after="0" w:line="240" w:lineRule="auto"/>
+              <w:rPr>
+                <w:rFonts w:ascii="Times New Roman" w:eastAsia="Times New Roman" w:hAnsi="Times New Roman" w:cs="Times New Roman"/>
+                <w:kern w:val="0"/>
+                <w:sz w:val="24"/>
+                <w:szCs w:val="24"/>
+                <w:lang w:eastAsia="en-IN"/>
+                <w14:ligatures w14:val="none"/>
+              </w:rPr>
+            </w:pPr>
+            <w:r>
+              <w:rPr>
+                <w:rFonts w:ascii="Calibri" w:eastAsia="Times New Roman" w:hAnsi="Calibri" w:cs="Calibri"/>
+                <w:color w:val="000000"/>
+                <w:kern w:val="0"/>
+                <w:lang w:eastAsia="en-IN"/>
+                <w14:ligatures w14:val="none"/>
+              </w:rPr>
+              <w:t>T1</w:t>
+            </w:r>
+          </w:p>
+        </w:tc>
+        <w:tc>
+          <w:tcPr>
+            <w:tcW w:w="0" w:type="auto"/>
+            <w:tcBorders>
+              <w:top w:val="single" w:sz="8" w:space="0" w:color="000000"/>
+              <w:left w:val="single" w:sz="8" w:space="0" w:color="000000"/>
+              <w:bottom w:val="single" w:sz="8" w:space="0" w:color="000000"/>
+              <w:right w:val="single" w:sz="8" w:space="0" w:color="000000"/>
+            </w:tcBorders>
+            <w:tcMar>
+              <w:top w:w="100" w:type="dxa"/>
+              <w:left w:w="100" w:type="dxa"/>
+              <w:bottom w:w="100" w:type="dxa"/>
+              <w:right w:w="100" w:type="dxa"/>
+            </w:tcMar>
+            <w:hideMark/>
+          </w:tcPr>
+          <w:p>
+            <w:pPr>
+              <w:spacing w:after="0" w:line="240" w:lineRule="auto"/>
+              <w:rPr>
+                <w:rFonts w:ascii="Times New Roman" w:eastAsia="Times New Roman" w:hAnsi="Times New Roman" w:cs="Times New Roman"/>
+                <w:kern w:val="0"/>
+                <w:sz w:val="24"/>
+                <w:szCs w:val="24"/>
+                <w:lang w:eastAsia="en-IN"/>
+                <w14:ligatures w14:val="none"/>
+              </w:rPr>
+            </w:pPr>
+            <w:r>
+              <w:rPr>
+                <w:rFonts w:ascii="Calibri" w:eastAsia="Times New Roman" w:hAnsi="Calibri" w:cs="Calibri"/>
+                <w:color w:val="000000"/>
+                <w:kern w:val="0"/>
+                <w:lang w:eastAsia="en-IN"/>
+                <w14:ligatures w14:val="none"/>
+              </w:rPr>
+              <w:t>Authentication</w:t>
+            </w:r>
+          </w:p>
+        </w:tc>
+        <w:tc>
+          <w:tcPr>
+            <w:tcW w:w="0" w:type="auto"/>
+            <w:tcBorders>
+              <w:top w:val="single" w:sz="8" w:space="0" w:color="000000"/>
+              <w:left w:val="single" w:sz="8" w:space="0" w:color="000000"/>
+              <w:bottom w:val="single" w:sz="8" w:space="0" w:color="000000"/>
+              <w:right w:val="single" w:sz="8" w:space="0" w:color="000000"/>
+            </w:tcBorders>
+            <w:tcMar>
+              <w:top w:w="100" w:type="dxa"/>
+              <w:left w:w="100" w:type="dxa"/>
+              <w:bottom w:w="100" w:type="dxa"/>
+              <w:right w:w="100" w:type="dxa"/>
+            </w:tcMar>
+            <w:hideMark/>
+          </w:tcPr>
+          <w:p>
+            <w:pPr>
+              <w:spacing w:after="0" w:line="240" w:lineRule="auto"/>
+              <w:rPr>
+                <w:rFonts w:ascii="Times New Roman" w:eastAsia="Times New Roman" w:hAnsi="Times New Roman" w:cs="Times New Roman"/>
+                <w:kern w:val="0"/>
+                <w:sz w:val="24"/>
+                <w:szCs w:val="24"/>
+                <w:lang w:eastAsia="en-IN"/>
+                <w14:ligatures w14:val="none"/>
+              </w:rPr>
+            </w:pPr>
+            <w:r>
+              <w:rPr>
+                <w:rFonts w:ascii="Calibri" w:eastAsia="Times New Roman" w:hAnsi="Calibri" w:cs="Calibri"/>
+                <w:color w:val="000000"/>
+                <w:kern w:val="0"/>
+                <w:lang w:eastAsia="en-IN"/>
+                <w14:ligatures w14:val="none"/>
+              </w:rPr>
+              <w:t>Valid signup: Username trader1, Password SecurePass123! </w:t>
+            </w:r>
+          </w:p>
+        </w:tc>
+        <w:tc>
+          <w:tcPr>
+            <w:tcW w:w="0" w:type="auto"/>
+            <w:tcBorders>
+              <w:top w:val="single" w:sz="8" w:space="0" w:color="000000"/>
+              <w:left w:val="single" w:sz="8" w:space="0" w:color="000000"/>
+              <w:bottom w:val="single" w:sz="8" w:space="0" w:color="000000"/>
+              <w:right w:val="single" w:sz="8" w:space="0" w:color="000000"/>
+            </w:tcBorders>
+            <w:tcMar>
+              <w:top w:w="100" w:type="dxa"/>
+              <w:left w:w="100" w:type="dxa"/>
+              <w:bottom w:w="100" w:type="dxa"/>
+              <w:right w:w="100" w:type="dxa"/>
+            </w:tcMar>
+            <w:hideMark/>
+          </w:tcPr>
+          <w:p>
+            <w:pPr>
+              <w:spacing w:after="0" w:line="240" w:lineRule="auto"/>
+              <w:rPr>
+                <w:rFonts w:ascii="Times New Roman" w:eastAsia="Times New Roman" w:hAnsi="Times New Roman" w:cs="Times New Roman"/>
+                <w:kern w:val="0"/>
+                <w:sz w:val="24"/>
+                <w:szCs w:val="24"/>
+                <w:lang w:eastAsia="en-IN"/>
+                <w14:ligatures w14:val="none"/>
+              </w:rPr>
+            </w:pPr>
+            <w:r>
+              <w:rPr>
+                <w:rFonts w:ascii="Calibri" w:eastAsia="Times New Roman" w:hAnsi="Calibri" w:cs="Calibri"/>
+                <w:color w:val="000000"/>
+                <w:kern w:val="0"/>
+                <w:lang w:eastAsia="en-IN"/>
+                <w14:ligatures w14:val="none"/>
+              </w:rPr>
+              <w:t>User registered successfully, password stored as salted PBKDF2-HMAC-SHA256 string (100k iterations).</w:t>
+            </w:r>
+          </w:p>
+        </w:tc>
+        <w:tc>
+          <w:tcPr>
+            <w:tcW w:w="0" w:type="auto"/>
+            <w:tcBorders>
+              <w:top w:val="single" w:sz="8" w:space="0" w:color="000000"/>
+              <w:left w:val="single" w:sz="8" w:space="0" w:color="000000"/>
+              <w:bottom w:val="single" w:sz="8" w:space="0" w:color="000000"/>
+              <w:right w:val="single" w:sz="8" w:space="0" w:color="000000"/>
+            </w:tcBorders>
+            <w:tcMar>
+              <w:top w:w="100" w:type="dxa"/>
+              <w:left w:w="100" w:type="dxa"/>
+              <w:bottom w:w="100" w:type="dxa"/>
+              <w:right w:w="100" w:type="dxa"/>
+            </w:tcMar>
+            <w:hideMark/>
+          </w:tcPr>
+          <w:p>
+            <w:pPr>
+              <w:spacing w:after="0" w:line="240" w:lineRule="auto"/>
+              <w:rPr>
+                <w:rFonts w:ascii="Times New Roman" w:eastAsia="Times New Roman" w:hAnsi="Times New Roman" w:cs="Times New Roman"/>
+                <w:kern w:val="0"/>
+                <w:sz w:val="24"/>
+                <w:szCs w:val="24"/>
+                <w:lang w:eastAsia="en-IN"/>
+                <w14:ligatures w14:val="none"/>
+              </w:rPr>
+            </w:pPr>
+            <w:r>
+              <w:rPr>
+                <w:rFonts w:ascii="Calibri" w:eastAsia="Times New Roman" w:hAnsi="Calibri" w:cs="Calibri"/>
+                <w:color w:val="000000"/>
+                <w:kern w:val="0"/>
+                <w:lang w:eastAsia="en-IN"/>
+                <w14:ligatures w14:val="none"/>
+              </w:rPr>
+              <w:t>Normal </w:t>
+            </w:r>
+          </w:p>
+        </w:tc>
+      </w:tr>
+      <w:tr>
+        <w:tc>
+          <w:tcPr>
+            <w:tcW w:w="0" w:type="auto"/>
+            <w:tcBorders>
+              <w:top w:val="single" w:sz="8" w:space="0" w:color="000000"/>
+              <w:left w:val="single" w:sz="8" w:space="0" w:color="000000"/>
+              <w:bottom w:val="single" w:sz="8" w:space="0" w:color="000000"/>
+              <w:right w:val="single" w:sz="8" w:space="0" w:color="000000"/>
+            </w:tcBorders>
+            <w:tcMar>
+              <w:top w:w="100" w:type="dxa"/>
+              <w:left w:w="100" w:type="dxa"/>
+              <w:bottom w:w="100" w:type="dxa"/>
+              <w:right w:w="100" w:type="dxa"/>
+            </w:tcMar>
+            <w:hideMark/>
+          </w:tcPr>
+          <w:p>
+            <w:pPr>
+              <w:spacing w:after="0" w:line="240" w:lineRule="auto"/>
+              <w:rPr>
+                <w:rFonts w:ascii="Times New Roman" w:eastAsia="Times New Roman" w:hAnsi="Times New Roman" w:cs="Times New Roman"/>
+                <w:kern w:val="0"/>
+                <w:sz w:val="24"/>
+                <w:szCs w:val="24"/>
+                <w:lang w:eastAsia="en-IN"/>
+                <w14:ligatures w14:val="none"/>
+              </w:rPr>
+            </w:pPr>
+            <w:r>
+              <w:rPr>
+                <w:rFonts w:ascii="Calibri" w:eastAsia="Times New Roman" w:hAnsi="Calibri" w:cs="Calibri"/>
+                <w:color w:val="000000"/>
+                <w:kern w:val="0"/>
+                <w:lang w:eastAsia="en-IN"/>
+                <w14:ligatures w14:val="none"/>
+              </w:rPr>
+              <w:t>T2</w:t>
+            </w:r>
+          </w:p>
+        </w:tc>
+        <w:tc>
+          <w:tcPr>
+            <w:tcW w:w="0" w:type="auto"/>
+            <w:tcBorders>
+              <w:top w:val="single" w:sz="8" w:space="0" w:color="000000"/>
+              <w:left w:val="single" w:sz="8" w:space="0" w:color="000000"/>
+              <w:bottom w:val="single" w:sz="8" w:space="0" w:color="000000"/>
+              <w:right w:val="single" w:sz="8" w:space="0" w:color="000000"/>
+            </w:tcBorders>
+            <w:tcMar>
+              <w:top w:w="100" w:type="dxa"/>
+              <w:left w:w="100" w:type="dxa"/>
+              <w:bottom w:w="100" w:type="dxa"/>
+              <w:right w:w="100" w:type="dxa"/>
+            </w:tcMar>
+            <w:hideMark/>
+          </w:tcPr>
+          <w:p>
+            <w:pPr>
+              <w:spacing w:after="0" w:line="240" w:lineRule="auto"/>
+              <w:rPr>
+                <w:rFonts w:ascii="Times New Roman" w:eastAsia="Times New Roman" w:hAnsi="Times New Roman" w:cs="Times New Roman"/>
+                <w:kern w:val="0"/>
+                <w:sz w:val="24"/>
+                <w:szCs w:val="24"/>
+                <w:lang w:eastAsia="en-IN"/>
+                <w14:ligatures w14:val="none"/>
+              </w:rPr>
+            </w:pPr>
+            <w:r>
+              <w:rPr>
+                <w:rFonts w:ascii="Calibri" w:eastAsia="Times New Roman" w:hAnsi="Calibri" w:cs="Calibri"/>
+                <w:color w:val="000000"/>
+                <w:kern w:val="0"/>
+                <w:lang w:eastAsia="en-IN"/>
+                <w14:ligatures w14:val="none"/>
+              </w:rPr>
+              <w:t>Authentication</w:t>
+            </w:r>
+          </w:p>
+        </w:tc>
+        <w:tc>
+          <w:tcPr>
+            <w:tcW w:w="0" w:type="auto"/>
+            <w:tcBorders>
+              <w:top w:val="single" w:sz="8" w:space="0" w:color="000000"/>
+              <w:left w:val="single" w:sz="8" w:space="0" w:color="000000"/>
+              <w:bottom w:val="single" w:sz="8" w:space="0" w:color="000000"/>
+              <w:right w:val="single" w:sz="8" w:space="0" w:color="000000"/>
+            </w:tcBorders>
+            <w:tcMar>
+              <w:top w:w="100" w:type="dxa"/>
+              <w:left w:w="100" w:type="dxa"/>
+              <w:bottom w:w="100" w:type="dxa"/>
+              <w:right w:w="100" w:type="dxa"/>
+            </w:tcMar>
+            <w:hideMark/>
+          </w:tcPr>
+          <w:p>
+            <w:pPr>
+              <w:spacing w:after="0" w:line="240" w:lineRule="auto"/>
+              <w:rPr>
+                <w:rFonts w:ascii="Times New Roman" w:eastAsia="Times New Roman" w:hAnsi="Times New Roman" w:cs="Times New Roman"/>
+                <w:kern w:val="0"/>
+                <w:sz w:val="24"/>
+                <w:szCs w:val="24"/>
+                <w:lang w:eastAsia="en-IN"/>
+                <w14:ligatures w14:val="none"/>
+              </w:rPr>
+            </w:pPr>
+            <w:r>
+              <w:rPr>
+                <w:rFonts w:ascii="Calibri" w:eastAsia="Times New Roman" w:hAnsi="Calibri" w:cs="Calibri"/>
+                <w:color w:val="000000"/>
+                <w:kern w:val="0"/>
+                <w:lang w:eastAsia="en-IN"/>
+                <w14:ligatures w14:val="none"/>
+              </w:rPr>
+              <w:t>Attempt signup with username ab (&lt;3 characters). </w:t>
+            </w:r>
+          </w:p>
+        </w:tc>
+        <w:tc>
+          <w:tcPr>
+            <w:tcW w:w="0" w:type="auto"/>
+            <w:tcBorders>
+              <w:top w:val="single" w:sz="8" w:space="0" w:color="000000"/>
+              <w:left w:val="single" w:sz="8" w:space="0" w:color="000000"/>
+              <w:bottom w:val="single" w:sz="8" w:space="0" w:color="000000"/>
+              <w:right w:val="single" w:sz="8" w:space="0" w:color="000000"/>
+            </w:tcBorders>
+            <w:tcMar>
+              <w:top w:w="100" w:type="dxa"/>
+              <w:left w:w="100" w:type="dxa"/>
+              <w:bottom w:w="100" w:type="dxa"/>
+              <w:right w:w="100" w:type="dxa"/>
+            </w:tcMar>
+            <w:hideMark/>
+          </w:tcPr>
+          <w:p>
+            <w:pPr>
+              <w:spacing w:after="0" w:line="240" w:lineRule="auto"/>
+              <w:rPr>
+                <w:rFonts w:ascii="Times New Roman" w:eastAsia="Times New Roman" w:hAnsi="Times New Roman" w:cs="Times New Roman"/>
+                <w:kern w:val="0"/>
+                <w:sz w:val="24"/>
+                <w:szCs w:val="24"/>
+                <w:lang w:eastAsia="en-IN"/>
+                <w14:ligatures w14:val="none"/>
+              </w:rPr>
+            </w:pPr>
+            <w:r>
+              <w:rPr>
+                <w:rFonts w:ascii="Calibri" w:eastAsia="Times New Roman" w:hAnsi="Calibri" w:cs="Calibri"/>
+                <w:color w:val="000000"/>
+                <w:kern w:val="0"/>
+                <w:lang w:eastAsia="en-IN"/>
+                <w14:ligatures w14:val="none"/>
+              </w:rPr>
+              <w:t>Input rejected with validation message: "Username must be at least 3 characters". </w:t>
+            </w:r>
+          </w:p>
+        </w:tc>
+        <w:tc>
+          <w:tcPr>
+            <w:tcW w:w="0" w:type="auto"/>
+            <w:tcBorders>
+              <w:top w:val="single" w:sz="8" w:space="0" w:color="000000"/>
+              <w:left w:val="single" w:sz="8" w:space="0" w:color="000000"/>
+              <w:bottom w:val="single" w:sz="8" w:space="0" w:color="000000"/>
+              <w:right w:val="single" w:sz="8" w:space="0" w:color="000000"/>
+            </w:tcBorders>
+            <w:tcMar>
+              <w:top w:w="100" w:type="dxa"/>
+              <w:left w:w="100" w:type="dxa"/>
+              <w:bottom w:w="100" w:type="dxa"/>
+              <w:right w:w="100" w:type="dxa"/>
+            </w:tcMar>
+            <w:hideMark/>
+          </w:tcPr>
+          <w:p>
+            <w:pPr>
+              <w:spacing w:after="0" w:line="240" w:lineRule="auto"/>
+              <w:rPr>
+                <w:rFonts w:ascii="Times New Roman" w:eastAsia="Times New Roman" w:hAnsi="Times New Roman" w:cs="Times New Roman"/>
+                <w:kern w:val="0"/>
+                <w:sz w:val="24"/>
+                <w:szCs w:val="24"/>
+                <w:lang w:eastAsia="en-IN"/>
+                <w14:ligatures w14:val="none"/>
+              </w:rPr>
+            </w:pPr>
+            <w:r>
+              <w:rPr>
+                <w:rFonts w:ascii="Calibri" w:eastAsia="Times New Roman" w:hAnsi="Calibri" w:cs="Calibri"/>
+                <w:color w:val="000000"/>
+                <w:kern w:val="0"/>
+                <w:lang w:eastAsia="en-IN"/>
+                <w14:ligatures w14:val="none"/>
+              </w:rPr>
+              <w:t>Boundary / Erroneous </w:t>
+            </w:r>
+          </w:p>
+        </w:tc>
+      </w:tr>
+      <w:tr>
+        <w:tc>
+          <w:tcPr>
+            <w:tcW w:w="0" w:type="auto"/>
+            <w:tcBorders>
+              <w:top w:val="single" w:sz="8" w:space="0" w:color="000000"/>
+              <w:left w:val="single" w:sz="8" w:space="0" w:color="000000"/>
+              <w:bottom w:val="single" w:sz="8" w:space="0" w:color="000000"/>
+              <w:right w:val="single" w:sz="8" w:space="0" w:color="000000"/>
+            </w:tcBorders>
+            <w:tcMar>
+              <w:top w:w="100" w:type="dxa"/>
+              <w:left w:w="100" w:type="dxa"/>
+              <w:bottom w:w="100" w:type="dxa"/>
+              <w:right w:w="100" w:type="dxa"/>
+            </w:tcMar>
+            <w:hideMark/>
+          </w:tcPr>
+          <w:p>
+            <w:pPr>
+              <w:spacing w:after="0" w:line="240" w:lineRule="auto"/>
+              <w:rPr>
+                <w:rFonts w:ascii="Times New Roman" w:eastAsia="Times New Roman" w:hAnsi="Times New Roman" w:cs="Times New Roman"/>
+                <w:kern w:val="0"/>
+                <w:sz w:val="24"/>
+                <w:szCs w:val="24"/>
+                <w:lang w:eastAsia="en-IN"/>
+                <w14:ligatures w14:val="none"/>
+              </w:rPr>
+            </w:pPr>
+            <w:r>
+              <w:rPr>
+                <w:rFonts w:ascii="Calibri" w:eastAsia="Times New Roman" w:hAnsi="Calibri" w:cs="Calibri"/>
+                <w:color w:val="000000"/>
+                <w:kern w:val="0"/>
+                <w:lang w:eastAsia="en-IN"/>
+                <w14:ligatures w14:val="none"/>
+              </w:rPr>
+              <w:t>T3</w:t>
+            </w:r>
+          </w:p>
+        </w:tc>
+        <w:tc>
+          <w:tcPr>
+            <w:tcW w:w="0" w:type="auto"/>
+            <w:tcBorders>
+              <w:top w:val="single" w:sz="8" w:space="0" w:color="000000"/>
+              <w:left w:val="single" w:sz="8" w:space="0" w:color="000000"/>
+              <w:bottom w:val="single" w:sz="8" w:space="0" w:color="000000"/>
+              <w:right w:val="single" w:sz="8" w:space="0" w:color="000000"/>
+            </w:tcBorders>
+            <w:tcMar>
+              <w:top w:w="100" w:type="dxa"/>
+              <w:left w:w="100" w:type="dxa"/>
+              <w:bottom w:w="100" w:type="dxa"/>
+              <w:right w:w="100" w:type="dxa"/>
+            </w:tcMar>
+            <w:hideMark/>
+          </w:tcPr>
+          <w:p>
+            <w:pPr>
+              <w:spacing w:after="0" w:line="240" w:lineRule="auto"/>
+              <w:rPr>
+                <w:rFonts w:ascii="Times New Roman" w:eastAsia="Times New Roman" w:hAnsi="Times New Roman" w:cs="Times New Roman"/>
+                <w:kern w:val="0"/>
+                <w:sz w:val="24"/>
+                <w:szCs w:val="24"/>
+                <w:lang w:eastAsia="en-IN"/>
+                <w14:ligatures w14:val="none"/>
+              </w:rPr>
+            </w:pPr>
+            <w:r>
+              <w:rPr>
+                <w:rFonts w:ascii="Calibri" w:eastAsia="Times New Roman" w:hAnsi="Calibri" w:cs="Calibri"/>
+                <w:color w:val="000000"/>
+                <w:kern w:val="0"/>
+                <w:lang w:eastAsia="en-IN"/>
+                <w14:ligatures w14:val="none"/>
+              </w:rPr>
+              <w:t>Lockout Guard</w:t>
+            </w:r>
+          </w:p>
+        </w:tc>
+        <w:tc>
+          <w:tcPr>
+            <w:tcW w:w="0" w:type="auto"/>
+            <w:tcBorders>
+              <w:top w:val="single" w:sz="8" w:space="0" w:color="000000"/>
+              <w:left w:val="single" w:sz="8" w:space="0" w:color="000000"/>
+              <w:bottom w:val="single" w:sz="8" w:space="0" w:color="000000"/>
+              <w:right w:val="single" w:sz="8" w:space="0" w:color="000000"/>
+            </w:tcBorders>
+            <w:tcMar>
+              <w:top w:w="100" w:type="dxa"/>
+              <w:left w:w="100" w:type="dxa"/>
+              <w:bottom w:w="100" w:type="dxa"/>
+              <w:right w:w="100" w:type="dxa"/>
+            </w:tcMar>
+            <w:hideMark/>
+          </w:tcPr>
+          <w:p>
+            <w:pPr>
+              <w:spacing w:after="0" w:line="240" w:lineRule="auto"/>
+              <w:rPr>
+                <w:rFonts w:ascii="Times New Roman" w:eastAsia="Times New Roman" w:hAnsi="Times New Roman" w:cs="Times New Roman"/>
+                <w:kern w:val="0"/>
+                <w:sz w:val="24"/>
+                <w:szCs w:val="24"/>
+                <w:lang w:eastAsia="en-IN"/>
+                <w14:ligatures w14:val="none"/>
+              </w:rPr>
+            </w:pPr>
+            <w:r>
+              <w:rPr>
+                <w:rFonts w:ascii="Calibri" w:eastAsia="Times New Roman" w:hAnsi="Calibri" w:cs="Calibri"/>
+                <w:color w:val="000000"/>
+                <w:kern w:val="0"/>
+                <w:lang w:eastAsia="en-IN"/>
+                <w14:ligatures w14:val="none"/>
+              </w:rPr>
+              <w:t>Enter wrong password 3 consecutive times for trader1 </w:t>
+            </w:r>
+          </w:p>
+        </w:tc>
+        <w:tc>
+          <w:tcPr>
+            <w:tcW w:w="0" w:type="auto"/>
+            <w:tcBorders>
+              <w:top w:val="single" w:sz="8" w:space="0" w:color="000000"/>
+              <w:left w:val="single" w:sz="8" w:space="0" w:color="000000"/>
+              <w:bottom w:val="single" w:sz="8" w:space="0" w:color="000000"/>
+              <w:right w:val="single" w:sz="8" w:space="0" w:color="000000"/>
+            </w:tcBorders>
+            <w:tcMar>
+              <w:top w:w="100" w:type="dxa"/>
+              <w:left w:w="100" w:type="dxa"/>
+              <w:bottom w:w="100" w:type="dxa"/>
+              <w:right w:w="100" w:type="dxa"/>
+            </w:tcMar>
+            <w:hideMark/>
+          </w:tcPr>
+          <w:p>
+            <w:pPr>
+              <w:spacing w:after="0" w:line="240" w:lineRule="auto"/>
+              <w:rPr>
+                <w:rFonts w:ascii="Times New Roman" w:eastAsia="Times New Roman" w:hAnsi="Times New Roman" w:cs="Times New Roman"/>
+                <w:kern w:val="0"/>
+                <w:sz w:val="24"/>
+                <w:szCs w:val="24"/>
+                <w:lang w:eastAsia="en-IN"/>
+                <w14:ligatures w14:val="none"/>
+              </w:rPr>
+            </w:pPr>
+            <w:r>
+              <w:rPr>
+                <w:rFonts w:ascii="Calibri" w:eastAsia="Times New Roman" w:hAnsi="Calibri" w:cs="Calibri"/>
+                <w:color w:val="000000"/>
+                <w:kern w:val="0"/>
+                <w:lang w:eastAsia="en-IN"/>
+                <w14:ligatures w14:val="none"/>
+              </w:rPr>
+              <w:t xml:space="preserve">3rd failed attempt sets </w:t>
+            </w:r>
+            <w:proofErr w:type="spellStart"/>
+            <w:r>
+              <w:rPr>
+                <w:rFonts w:ascii="Calibri" w:eastAsia="Times New Roman" w:hAnsi="Calibri" w:cs="Calibri"/>
+                <w:color w:val="000000"/>
+                <w:kern w:val="0"/>
+                <w:lang w:eastAsia="en-IN"/>
+                <w14:ligatures w14:val="none"/>
+              </w:rPr>
+              <w:t>lockout_until</w:t>
+            </w:r>
+            <w:proofErr w:type="spellEnd"/>
+            <w:r>
+              <w:rPr>
+                <w:rFonts w:ascii="Calibri" w:eastAsia="Times New Roman" w:hAnsi="Calibri" w:cs="Calibri"/>
+                <w:color w:val="000000"/>
+                <w:kern w:val="0"/>
+                <w:lang w:eastAsia="en-IN"/>
+                <w14:ligatures w14:val="none"/>
+              </w:rPr>
+              <w:t xml:space="preserve"> timestamp (+15 mins) and constant-time comparison </w:t>
+            </w:r>
+            <w:proofErr w:type="gramStart"/>
+            <w:r>
+              <w:rPr>
+                <w:rFonts w:ascii="Calibri" w:eastAsia="Times New Roman" w:hAnsi="Calibri" w:cs="Calibri"/>
+                <w:color w:val="000000"/>
+                <w:kern w:val="0"/>
+                <w:lang w:eastAsia="en-IN"/>
+                <w14:ligatures w14:val="none"/>
+              </w:rPr>
+              <w:t>rejects</w:t>
+            </w:r>
+            <w:proofErr w:type="gramEnd"/>
+            <w:r>
+              <w:rPr>
+                <w:rFonts w:ascii="Calibri" w:eastAsia="Times New Roman" w:hAnsi="Calibri" w:cs="Calibri"/>
+                <w:color w:val="000000"/>
+                <w:kern w:val="0"/>
+                <w:lang w:eastAsia="en-IN"/>
+                <w14:ligatures w14:val="none"/>
+              </w:rPr>
+              <w:t xml:space="preserve"> authentication.  </w:t>
+            </w:r>
+          </w:p>
+        </w:tc>
+        <w:tc>
+          <w:tcPr>
+            <w:tcW w:w="0" w:type="auto"/>
+            <w:tcBorders>
+              <w:top w:val="single" w:sz="8" w:space="0" w:color="000000"/>
+              <w:left w:val="single" w:sz="8" w:space="0" w:color="000000"/>
+              <w:bottom w:val="single" w:sz="8" w:space="0" w:color="000000"/>
+              <w:right w:val="single" w:sz="8" w:space="0" w:color="000000"/>
+            </w:tcBorders>
+            <w:tcMar>
+              <w:top w:w="100" w:type="dxa"/>
+              <w:left w:w="100" w:type="dxa"/>
+              <w:bottom w:w="100" w:type="dxa"/>
+              <w:right w:w="100" w:type="dxa"/>
+            </w:tcMar>
+            <w:hideMark/>
+          </w:tcPr>
+          <w:p>
+            <w:pPr>
+              <w:spacing w:after="0" w:line="240" w:lineRule="auto"/>
+              <w:rPr>
+                <w:rFonts w:ascii="Times New Roman" w:eastAsia="Times New Roman" w:hAnsi="Times New Roman" w:cs="Times New Roman"/>
+                <w:kern w:val="0"/>
+                <w:sz w:val="24"/>
+                <w:szCs w:val="24"/>
+                <w:lang w:eastAsia="en-IN"/>
+                <w14:ligatures w14:val="none"/>
+              </w:rPr>
+            </w:pPr>
+            <w:r>
+              <w:rPr>
+                <w:rFonts w:ascii="Calibri" w:eastAsia="Times New Roman" w:hAnsi="Calibri" w:cs="Calibri"/>
+                <w:color w:val="000000"/>
+                <w:kern w:val="0"/>
+                <w:lang w:eastAsia="en-IN"/>
+                <w14:ligatures w14:val="none"/>
+              </w:rPr>
+              <w:t>Erroneous / Security </w:t>
+            </w:r>
+          </w:p>
+        </w:tc>
+      </w:tr>
+      <w:tr>
+        <w:tc>
+          <w:tcPr>
+            <w:tcW w:w="0" w:type="auto"/>
+            <w:tcBorders>
+              <w:top w:val="single" w:sz="8" w:space="0" w:color="000000"/>
+              <w:left w:val="single" w:sz="8" w:space="0" w:color="000000"/>
+              <w:bottom w:val="single" w:sz="8" w:space="0" w:color="000000"/>
+              <w:right w:val="single" w:sz="8" w:space="0" w:color="000000"/>
+            </w:tcBorders>
+            <w:tcMar>
+              <w:top w:w="100" w:type="dxa"/>
+              <w:left w:w="100" w:type="dxa"/>
+              <w:bottom w:w="100" w:type="dxa"/>
+              <w:right w:w="100" w:type="dxa"/>
+            </w:tcMar>
+            <w:hideMark/>
+          </w:tcPr>
+          <w:p>
+            <w:pPr>
+              <w:spacing w:after="0" w:line="240" w:lineRule="auto"/>
+              <w:rPr>
+                <w:rFonts w:ascii="Times New Roman" w:eastAsia="Times New Roman" w:hAnsi="Times New Roman" w:cs="Times New Roman"/>
+                <w:kern w:val="0"/>
+                <w:sz w:val="24"/>
+                <w:szCs w:val="24"/>
+                <w:lang w:eastAsia="en-IN"/>
+                <w14:ligatures w14:val="none"/>
+              </w:rPr>
+            </w:pPr>
+            <w:r>
+              <w:rPr>
+                <w:rFonts w:ascii="Calibri" w:eastAsia="Times New Roman" w:hAnsi="Calibri" w:cs="Calibri"/>
+                <w:color w:val="000000"/>
+                <w:kern w:val="0"/>
+                <w:lang w:eastAsia="en-IN"/>
+                <w14:ligatures w14:val="none"/>
+              </w:rPr>
+              <w:t>T4</w:t>
+            </w:r>
+          </w:p>
+        </w:tc>
+        <w:tc>
+          <w:tcPr>
+            <w:tcW w:w="0" w:type="auto"/>
+            <w:tcBorders>
+              <w:top w:val="single" w:sz="8" w:space="0" w:color="000000"/>
+              <w:left w:val="single" w:sz="8" w:space="0" w:color="000000"/>
+              <w:bottom w:val="single" w:sz="8" w:space="0" w:color="000000"/>
+              <w:right w:val="single" w:sz="8" w:space="0" w:color="000000"/>
+            </w:tcBorders>
+            <w:tcMar>
+              <w:top w:w="100" w:type="dxa"/>
+              <w:left w:w="100" w:type="dxa"/>
+              <w:bottom w:w="100" w:type="dxa"/>
+              <w:right w:w="100" w:type="dxa"/>
+            </w:tcMar>
+            <w:hideMark/>
+          </w:tcPr>
+          <w:p>
+            <w:pPr>
+              <w:spacing w:after="0" w:line="240" w:lineRule="auto"/>
+              <w:rPr>
+                <w:rFonts w:ascii="Times New Roman" w:eastAsia="Times New Roman" w:hAnsi="Times New Roman" w:cs="Times New Roman"/>
+                <w:kern w:val="0"/>
+                <w:sz w:val="24"/>
+                <w:szCs w:val="24"/>
+                <w:lang w:eastAsia="en-IN"/>
+                <w14:ligatures w14:val="none"/>
+              </w:rPr>
+            </w:pPr>
+            <w:r>
+              <w:rPr>
+                <w:rFonts w:ascii="Calibri" w:eastAsia="Times New Roman" w:hAnsi="Calibri" w:cs="Calibri"/>
+                <w:color w:val="000000"/>
+                <w:kern w:val="0"/>
+                <w:lang w:eastAsia="en-IN"/>
+                <w14:ligatures w14:val="none"/>
+              </w:rPr>
+              <w:t>Data Parser</w:t>
+            </w:r>
+          </w:p>
+        </w:tc>
+        <w:tc>
+          <w:tcPr>
+            <w:tcW w:w="0" w:type="auto"/>
+            <w:tcBorders>
+              <w:top w:val="single" w:sz="8" w:space="0" w:color="000000"/>
+              <w:left w:val="single" w:sz="8" w:space="0" w:color="000000"/>
+              <w:bottom w:val="single" w:sz="8" w:space="0" w:color="000000"/>
+              <w:right w:val="single" w:sz="8" w:space="0" w:color="000000"/>
+            </w:tcBorders>
+            <w:tcMar>
+              <w:top w:w="100" w:type="dxa"/>
+              <w:left w:w="100" w:type="dxa"/>
+              <w:bottom w:w="100" w:type="dxa"/>
+              <w:right w:w="100" w:type="dxa"/>
+            </w:tcMar>
+            <w:hideMark/>
+          </w:tcPr>
+          <w:p>
+            <w:pPr>
+              <w:spacing w:after="0" w:line="240" w:lineRule="auto"/>
+              <w:rPr>
+                <w:rFonts w:ascii="Times New Roman" w:eastAsia="Times New Roman" w:hAnsi="Times New Roman" w:cs="Times New Roman"/>
+                <w:kern w:val="0"/>
+                <w:sz w:val="24"/>
+                <w:szCs w:val="24"/>
+                <w:lang w:eastAsia="en-IN"/>
+                <w14:ligatures w14:val="none"/>
+              </w:rPr>
+            </w:pPr>
+            <w:r>
+              <w:rPr>
+                <w:rFonts w:ascii="Calibri" w:eastAsia="Times New Roman" w:hAnsi="Calibri" w:cs="Calibri"/>
+                <w:color w:val="000000"/>
+                <w:kern w:val="0"/>
+                <w:lang w:eastAsia="en-IN"/>
+                <w14:ligatures w14:val="none"/>
+              </w:rPr>
+              <w:t>Request stock feed for ticker AAPL </w:t>
+            </w:r>
+          </w:p>
+        </w:tc>
+        <w:tc>
+          <w:tcPr>
+            <w:tcW w:w="0" w:type="auto"/>
+            <w:tcBorders>
+              <w:top w:val="single" w:sz="8" w:space="0" w:color="000000"/>
+              <w:left w:val="single" w:sz="8" w:space="0" w:color="000000"/>
+              <w:bottom w:val="single" w:sz="8" w:space="0" w:color="000000"/>
+              <w:right w:val="single" w:sz="8" w:space="0" w:color="000000"/>
+            </w:tcBorders>
+            <w:tcMar>
+              <w:top w:w="100" w:type="dxa"/>
+              <w:left w:w="100" w:type="dxa"/>
+              <w:bottom w:w="100" w:type="dxa"/>
+              <w:right w:w="100" w:type="dxa"/>
+            </w:tcMar>
+            <w:hideMark/>
+          </w:tcPr>
+          <w:p>
+            <w:pPr>
+              <w:spacing w:after="0" w:line="240" w:lineRule="auto"/>
+              <w:rPr>
+                <w:rFonts w:ascii="Times New Roman" w:eastAsia="Times New Roman" w:hAnsi="Times New Roman" w:cs="Times New Roman"/>
+                <w:kern w:val="0"/>
+                <w:sz w:val="24"/>
+                <w:szCs w:val="24"/>
+                <w:lang w:eastAsia="en-IN"/>
+                <w14:ligatures w14:val="none"/>
+              </w:rPr>
+            </w:pPr>
+            <w:r>
+              <w:rPr>
+                <w:rFonts w:ascii="Calibri" w:eastAsia="Times New Roman" w:hAnsi="Calibri" w:cs="Calibri"/>
+                <w:color w:val="000000"/>
+                <w:kern w:val="0"/>
+                <w:lang w:eastAsia="en-IN"/>
+                <w14:ligatures w14:val="none"/>
+              </w:rPr>
+              <w:t xml:space="preserve">Fetch and parse JSON response within &lt;500ms using native </w:t>
+            </w:r>
+            <w:proofErr w:type="spellStart"/>
+            <w:r>
+              <w:rPr>
+                <w:rFonts w:ascii="Calibri" w:eastAsia="Times New Roman" w:hAnsi="Calibri" w:cs="Calibri"/>
+                <w:color w:val="000000"/>
+                <w:kern w:val="0"/>
+                <w:lang w:eastAsia="en-IN"/>
+                <w14:ligatures w14:val="none"/>
+              </w:rPr>
+              <w:t>urllib</w:t>
+            </w:r>
+            <w:proofErr w:type="spellEnd"/>
+            <w:r>
+              <w:rPr>
+                <w:rFonts w:ascii="Calibri" w:eastAsia="Times New Roman" w:hAnsi="Calibri" w:cs="Calibri"/>
+                <w:color w:val="000000"/>
+                <w:kern w:val="0"/>
+                <w:lang w:eastAsia="en-IN"/>
+                <w14:ligatures w14:val="none"/>
+              </w:rPr>
+              <w:t>. </w:t>
+            </w:r>
+          </w:p>
+        </w:tc>
+        <w:tc>
+          <w:tcPr>
+            <w:tcW w:w="0" w:type="auto"/>
+            <w:tcBorders>
+              <w:top w:val="single" w:sz="8" w:space="0" w:color="000000"/>
+              <w:left w:val="single" w:sz="8" w:space="0" w:color="000000"/>
+              <w:bottom w:val="single" w:sz="8" w:space="0" w:color="000000"/>
+              <w:right w:val="single" w:sz="8" w:space="0" w:color="000000"/>
+            </w:tcBorders>
+            <w:tcMar>
+              <w:top w:w="100" w:type="dxa"/>
+              <w:left w:w="100" w:type="dxa"/>
+              <w:bottom w:w="100" w:type="dxa"/>
+              <w:right w:w="100" w:type="dxa"/>
+            </w:tcMar>
+            <w:hideMark/>
+          </w:tcPr>
+          <w:p>
+            <w:pPr>
+              <w:spacing w:after="0" w:line="240" w:lineRule="auto"/>
+              <w:rPr>
+                <w:rFonts w:ascii="Times New Roman" w:eastAsia="Times New Roman" w:hAnsi="Times New Roman" w:cs="Times New Roman"/>
+                <w:kern w:val="0"/>
+                <w:sz w:val="24"/>
+                <w:szCs w:val="24"/>
+                <w:lang w:eastAsia="en-IN"/>
+                <w14:ligatures w14:val="none"/>
+              </w:rPr>
+            </w:pPr>
+            <w:r>
+              <w:rPr>
+                <w:rFonts w:ascii="Calibri" w:eastAsia="Times New Roman" w:hAnsi="Calibri" w:cs="Calibri"/>
+                <w:color w:val="000000"/>
+                <w:kern w:val="0"/>
+                <w:lang w:eastAsia="en-IN"/>
+                <w14:ligatures w14:val="none"/>
+              </w:rPr>
+              <w:t>Normal </w:t>
+            </w:r>
+          </w:p>
+        </w:tc>
+      </w:tr>
+      <w:tr>
+        <w:tc>
+          <w:tcPr>
+            <w:tcW w:w="0" w:type="auto"/>
+            <w:tcBorders>
+              <w:top w:val="single" w:sz="8" w:space="0" w:color="000000"/>
+              <w:left w:val="single" w:sz="8" w:space="0" w:color="000000"/>
+              <w:bottom w:val="single" w:sz="8" w:space="0" w:color="000000"/>
+              <w:right w:val="single" w:sz="8" w:space="0" w:color="000000"/>
+            </w:tcBorders>
+            <w:tcMar>
+              <w:top w:w="100" w:type="dxa"/>
+              <w:left w:w="100" w:type="dxa"/>
+              <w:bottom w:w="100" w:type="dxa"/>
+              <w:right w:w="100" w:type="dxa"/>
+            </w:tcMar>
+            <w:hideMark/>
+          </w:tcPr>
+          <w:p>
+            <w:pPr>
+              <w:spacing w:after="0" w:line="240" w:lineRule="auto"/>
+              <w:rPr>
+                <w:rFonts w:ascii="Times New Roman" w:eastAsia="Times New Roman" w:hAnsi="Times New Roman" w:cs="Times New Roman"/>
+                <w:kern w:val="0"/>
+                <w:sz w:val="24"/>
+                <w:szCs w:val="24"/>
+                <w:lang w:eastAsia="en-IN"/>
+                <w14:ligatures w14:val="none"/>
+              </w:rPr>
+            </w:pPr>
+            <w:r>
+              <w:rPr>
+                <w:rFonts w:ascii="Calibri" w:eastAsia="Times New Roman" w:hAnsi="Calibri" w:cs="Calibri"/>
+                <w:color w:val="000000"/>
+                <w:kern w:val="0"/>
+                <w:lang w:eastAsia="en-IN"/>
+                <w14:ligatures w14:val="none"/>
+              </w:rPr>
+              <w:t>T5</w:t>
+            </w:r>
+          </w:p>
+        </w:tc>
+        <w:tc>
+          <w:tcPr>
+            <w:tcW w:w="0" w:type="auto"/>
+            <w:tcBorders>
+              <w:top w:val="single" w:sz="8" w:space="0" w:color="000000"/>
+              <w:left w:val="single" w:sz="8" w:space="0" w:color="000000"/>
+              <w:bottom w:val="single" w:sz="8" w:space="0" w:color="000000"/>
+              <w:right w:val="single" w:sz="8" w:space="0" w:color="000000"/>
+            </w:tcBorders>
+            <w:tcMar>
+              <w:top w:w="100" w:type="dxa"/>
+              <w:left w:w="100" w:type="dxa"/>
+              <w:bottom w:w="100" w:type="dxa"/>
+              <w:right w:w="100" w:type="dxa"/>
+            </w:tcMar>
+            <w:hideMark/>
+          </w:tcPr>
+          <w:p>
+            <w:pPr>
+              <w:spacing w:after="0" w:line="240" w:lineRule="auto"/>
+              <w:rPr>
+                <w:rFonts w:ascii="Times New Roman" w:eastAsia="Times New Roman" w:hAnsi="Times New Roman" w:cs="Times New Roman"/>
+                <w:kern w:val="0"/>
+                <w:sz w:val="24"/>
+                <w:szCs w:val="24"/>
+                <w:lang w:eastAsia="en-IN"/>
+                <w14:ligatures w14:val="none"/>
+              </w:rPr>
+            </w:pPr>
+            <w:r>
+              <w:rPr>
+                <w:rFonts w:ascii="Calibri" w:eastAsia="Times New Roman" w:hAnsi="Calibri" w:cs="Calibri"/>
+                <w:color w:val="000000"/>
+                <w:kern w:val="0"/>
+                <w:lang w:eastAsia="en-IN"/>
+                <w14:ligatures w14:val="none"/>
+              </w:rPr>
+              <w:t>Data Parser</w:t>
+            </w:r>
+          </w:p>
+        </w:tc>
+        <w:tc>
+          <w:tcPr>
+            <w:tcW w:w="0" w:type="auto"/>
+            <w:tcBorders>
+              <w:top w:val="single" w:sz="8" w:space="0" w:color="000000"/>
+              <w:left w:val="single" w:sz="8" w:space="0" w:color="000000"/>
+              <w:bottom w:val="single" w:sz="8" w:space="0" w:color="000000"/>
+              <w:right w:val="single" w:sz="8" w:space="0" w:color="000000"/>
+            </w:tcBorders>
+            <w:tcMar>
+              <w:top w:w="100" w:type="dxa"/>
+              <w:left w:w="100" w:type="dxa"/>
+              <w:bottom w:w="100" w:type="dxa"/>
+              <w:right w:w="100" w:type="dxa"/>
+            </w:tcMar>
+            <w:hideMark/>
+          </w:tcPr>
+          <w:p>
+            <w:pPr>
+              <w:spacing w:after="0" w:line="240" w:lineRule="auto"/>
+              <w:rPr>
+                <w:rFonts w:ascii="Times New Roman" w:eastAsia="Times New Roman" w:hAnsi="Times New Roman" w:cs="Times New Roman"/>
+                <w:kern w:val="0"/>
+                <w:sz w:val="24"/>
+                <w:szCs w:val="24"/>
+                <w:lang w:eastAsia="en-IN"/>
+                <w14:ligatures w14:val="none"/>
+              </w:rPr>
+            </w:pPr>
+            <w:r>
+              <w:rPr>
+                <w:rFonts w:ascii="Calibri" w:eastAsia="Times New Roman" w:hAnsi="Calibri" w:cs="Calibri"/>
+                <w:color w:val="000000"/>
+                <w:kern w:val="0"/>
+                <w:lang w:eastAsia="en-IN"/>
+                <w14:ligatures w14:val="none"/>
+              </w:rPr>
+              <w:t>Request stock feed for non-existent ticker INVALID123 </w:t>
+            </w:r>
+          </w:p>
+        </w:tc>
+        <w:tc>
+          <w:tcPr>
+            <w:tcW w:w="0" w:type="auto"/>
+            <w:tcBorders>
+              <w:top w:val="single" w:sz="8" w:space="0" w:color="000000"/>
+              <w:left w:val="single" w:sz="8" w:space="0" w:color="000000"/>
+              <w:bottom w:val="single" w:sz="8" w:space="0" w:color="000000"/>
+              <w:right w:val="single" w:sz="8" w:space="0" w:color="000000"/>
+            </w:tcBorders>
+            <w:tcMar>
+              <w:top w:w="100" w:type="dxa"/>
+              <w:left w:w="100" w:type="dxa"/>
+              <w:bottom w:w="100" w:type="dxa"/>
+              <w:right w:w="100" w:type="dxa"/>
+            </w:tcMar>
+            <w:hideMark/>
+          </w:tcPr>
+          <w:p>
+            <w:pPr>
+              <w:spacing w:after="0" w:line="240" w:lineRule="auto"/>
+              <w:rPr>
+                <w:rFonts w:ascii="Times New Roman" w:eastAsia="Times New Roman" w:hAnsi="Times New Roman" w:cs="Times New Roman"/>
+                <w:kern w:val="0"/>
+                <w:sz w:val="24"/>
+                <w:szCs w:val="24"/>
+                <w:lang w:eastAsia="en-IN"/>
+                <w14:ligatures w14:val="none"/>
+              </w:rPr>
+            </w:pPr>
+            <w:r>
+              <w:rPr>
+                <w:rFonts w:ascii="Calibri" w:eastAsia="Times New Roman" w:hAnsi="Calibri" w:cs="Calibri"/>
+                <w:color w:val="000000"/>
+                <w:kern w:val="0"/>
+                <w:lang w:eastAsia="en-IN"/>
+                <w14:ligatures w14:val="none"/>
+              </w:rPr>
+              <w:t>Custom error message displayed: "Stock symbol not found". </w:t>
+            </w:r>
+          </w:p>
+        </w:tc>
+        <w:tc>
+          <w:tcPr>
+            <w:tcW w:w="0" w:type="auto"/>
+            <w:tcBorders>
+              <w:top w:val="single" w:sz="8" w:space="0" w:color="000000"/>
+              <w:left w:val="single" w:sz="8" w:space="0" w:color="000000"/>
+              <w:bottom w:val="single" w:sz="8" w:space="0" w:color="000000"/>
+              <w:right w:val="single" w:sz="8" w:space="0" w:color="000000"/>
+            </w:tcBorders>
+            <w:tcMar>
+              <w:top w:w="100" w:type="dxa"/>
+              <w:left w:w="100" w:type="dxa"/>
+              <w:bottom w:w="100" w:type="dxa"/>
+              <w:right w:w="100" w:type="dxa"/>
+            </w:tcMar>
+            <w:hideMark/>
+          </w:tcPr>
+          <w:p>
+            <w:pPr>
+              <w:spacing w:after="0" w:line="240" w:lineRule="auto"/>
+              <w:rPr>
+                <w:rFonts w:ascii="Times New Roman" w:eastAsia="Times New Roman" w:hAnsi="Times New Roman" w:cs="Times New Roman"/>
+                <w:kern w:val="0"/>
+                <w:sz w:val="24"/>
+                <w:szCs w:val="24"/>
+                <w:lang w:eastAsia="en-IN"/>
+                <w14:ligatures w14:val="none"/>
+              </w:rPr>
+            </w:pPr>
+            <w:r>
+              <w:rPr>
+                <w:rFonts w:ascii="Calibri" w:eastAsia="Times New Roman" w:hAnsi="Calibri" w:cs="Calibri"/>
+                <w:color w:val="000000"/>
+                <w:kern w:val="0"/>
+                <w:lang w:eastAsia="en-IN"/>
+                <w14:ligatures w14:val="none"/>
+              </w:rPr>
+              <w:t>Erroneous </w:t>
+            </w:r>
+          </w:p>
+        </w:tc>
+      </w:tr>
+      <w:tr>
+        <w:tc>
+          <w:tcPr>
+            <w:tcW w:w="0" w:type="auto"/>
+            <w:tcBorders>
+              <w:top w:val="single" w:sz="8" w:space="0" w:color="000000"/>
+              <w:left w:val="single" w:sz="8" w:space="0" w:color="000000"/>
+              <w:bottom w:val="single" w:sz="8" w:space="0" w:color="000000"/>
+              <w:right w:val="single" w:sz="8" w:space="0" w:color="000000"/>
+            </w:tcBorders>
+            <w:tcMar>
+              <w:top w:w="100" w:type="dxa"/>
+              <w:left w:w="100" w:type="dxa"/>
+              <w:bottom w:w="100" w:type="dxa"/>
+              <w:right w:w="100" w:type="dxa"/>
+            </w:tcMar>
+            <w:hideMark/>
+          </w:tcPr>
+          <w:p>
+            <w:pPr>
+              <w:spacing w:after="0" w:line="240" w:lineRule="auto"/>
+              <w:rPr>
+                <w:rFonts w:ascii="Times New Roman" w:eastAsia="Times New Roman" w:hAnsi="Times New Roman" w:cs="Times New Roman"/>
+                <w:kern w:val="0"/>
+                <w:sz w:val="24"/>
+                <w:szCs w:val="24"/>
+                <w:lang w:eastAsia="en-IN"/>
+                <w14:ligatures w14:val="none"/>
+              </w:rPr>
+            </w:pPr>
+            <w:r>
+              <w:rPr>
+                <w:rFonts w:ascii="Calibri" w:eastAsia="Times New Roman" w:hAnsi="Calibri" w:cs="Calibri"/>
+                <w:color w:val="000000"/>
+                <w:kern w:val="0"/>
+                <w:lang w:eastAsia="en-IN"/>
+                <w14:ligatures w14:val="none"/>
+              </w:rPr>
+              <w:t>T6</w:t>
+            </w:r>
+          </w:p>
+        </w:tc>
+        <w:tc>
+          <w:tcPr>
+            <w:tcW w:w="0" w:type="auto"/>
+            <w:tcBorders>
+              <w:top w:val="single" w:sz="8" w:space="0" w:color="000000"/>
+              <w:left w:val="single" w:sz="8" w:space="0" w:color="000000"/>
+              <w:bottom w:val="single" w:sz="8" w:space="0" w:color="000000"/>
+              <w:right w:val="single" w:sz="8" w:space="0" w:color="000000"/>
+            </w:tcBorders>
+            <w:tcMar>
+              <w:top w:w="100" w:type="dxa"/>
+              <w:left w:w="100" w:type="dxa"/>
+              <w:bottom w:w="100" w:type="dxa"/>
+              <w:right w:w="100" w:type="dxa"/>
+            </w:tcMar>
+            <w:hideMark/>
+          </w:tcPr>
+          <w:p>
+            <w:pPr>
+              <w:spacing w:after="0" w:line="240" w:lineRule="auto"/>
+              <w:rPr>
+                <w:rFonts w:ascii="Times New Roman" w:eastAsia="Times New Roman" w:hAnsi="Times New Roman" w:cs="Times New Roman"/>
+                <w:kern w:val="0"/>
+                <w:sz w:val="24"/>
+                <w:szCs w:val="24"/>
+                <w:lang w:eastAsia="en-IN"/>
+                <w14:ligatures w14:val="none"/>
+              </w:rPr>
+            </w:pPr>
+            <w:r>
+              <w:rPr>
+                <w:rFonts w:ascii="Calibri" w:eastAsia="Times New Roman" w:hAnsi="Calibri" w:cs="Calibri"/>
+                <w:color w:val="000000"/>
+                <w:kern w:val="0"/>
+                <w:lang w:eastAsia="en-IN"/>
+                <w14:ligatures w14:val="none"/>
+              </w:rPr>
+              <w:t>Pure DSA Math</w:t>
+            </w:r>
+          </w:p>
+        </w:tc>
+        <w:tc>
+          <w:tcPr>
+            <w:tcW w:w="0" w:type="auto"/>
+            <w:tcBorders>
+              <w:top w:val="single" w:sz="8" w:space="0" w:color="000000"/>
+              <w:left w:val="single" w:sz="8" w:space="0" w:color="000000"/>
+              <w:bottom w:val="single" w:sz="8" w:space="0" w:color="000000"/>
+              <w:right w:val="single" w:sz="8" w:space="0" w:color="000000"/>
+            </w:tcBorders>
+            <w:tcMar>
+              <w:top w:w="100" w:type="dxa"/>
+              <w:left w:w="100" w:type="dxa"/>
+              <w:bottom w:w="100" w:type="dxa"/>
+              <w:right w:w="100" w:type="dxa"/>
+            </w:tcMar>
+            <w:hideMark/>
+          </w:tcPr>
+          <w:p>
+            <w:pPr>
+              <w:spacing w:after="0" w:line="240" w:lineRule="auto"/>
+              <w:rPr>
+                <w:rFonts w:ascii="Times New Roman" w:eastAsia="Times New Roman" w:hAnsi="Times New Roman" w:cs="Times New Roman"/>
+                <w:kern w:val="0"/>
+                <w:sz w:val="24"/>
+                <w:szCs w:val="24"/>
+                <w:lang w:eastAsia="en-IN"/>
+                <w14:ligatures w14:val="none"/>
+              </w:rPr>
+            </w:pPr>
+            <w:r>
+              <w:rPr>
+                <w:rFonts w:ascii="Calibri" w:eastAsia="Times New Roman" w:hAnsi="Calibri" w:cs="Calibri"/>
+                <w:color w:val="000000"/>
+                <w:kern w:val="0"/>
+                <w:lang w:eastAsia="en-IN"/>
+                <w14:ligatures w14:val="none"/>
+              </w:rPr>
+              <w:t>Pass array of 20 historical prices to Linear Regression function. </w:t>
+            </w:r>
+          </w:p>
+        </w:tc>
+        <w:tc>
+          <w:tcPr>
+            <w:tcW w:w="0" w:type="auto"/>
+            <w:tcBorders>
+              <w:top w:val="single" w:sz="8" w:space="0" w:color="000000"/>
+              <w:left w:val="single" w:sz="8" w:space="0" w:color="000000"/>
+              <w:bottom w:val="single" w:sz="8" w:space="0" w:color="000000"/>
+              <w:right w:val="single" w:sz="8" w:space="0" w:color="000000"/>
+            </w:tcBorders>
+            <w:tcMar>
+              <w:top w:w="100" w:type="dxa"/>
+              <w:left w:w="100" w:type="dxa"/>
+              <w:bottom w:w="100" w:type="dxa"/>
+              <w:right w:w="100" w:type="dxa"/>
+            </w:tcMar>
+            <w:hideMark/>
+          </w:tcPr>
+          <w:p>
+            <w:pPr>
+              <w:spacing w:after="0" w:line="240" w:lineRule="auto"/>
+              <w:rPr>
+                <w:rFonts w:ascii="Times New Roman" w:eastAsia="Times New Roman" w:hAnsi="Times New Roman" w:cs="Times New Roman"/>
+                <w:kern w:val="0"/>
+                <w:sz w:val="24"/>
+                <w:szCs w:val="24"/>
+                <w:lang w:eastAsia="en-IN"/>
+                <w14:ligatures w14:val="none"/>
+              </w:rPr>
+            </w:pPr>
+            <w:r>
+              <w:rPr>
+                <w:rFonts w:ascii="Calibri" w:eastAsia="Times New Roman" w:hAnsi="Calibri" w:cs="Calibri"/>
+                <w:color w:val="000000"/>
+                <w:kern w:val="0"/>
+                <w:lang w:eastAsia="en-IN"/>
+                <w14:ligatures w14:val="none"/>
+              </w:rPr>
+              <w:t>Returns list of 7 valid forecasted float values. </w:t>
+            </w:r>
+          </w:p>
+        </w:tc>
+        <w:tc>
+          <w:tcPr>
+            <w:tcW w:w="0" w:type="auto"/>
+            <w:tcBorders>
+              <w:top w:val="single" w:sz="8" w:space="0" w:color="000000"/>
+              <w:left w:val="single" w:sz="8" w:space="0" w:color="000000"/>
+              <w:bottom w:val="single" w:sz="8" w:space="0" w:color="000000"/>
+              <w:right w:val="single" w:sz="8" w:space="0" w:color="000000"/>
+            </w:tcBorders>
+            <w:tcMar>
+              <w:top w:w="100" w:type="dxa"/>
+              <w:left w:w="100" w:type="dxa"/>
+              <w:bottom w:w="100" w:type="dxa"/>
+              <w:right w:w="100" w:type="dxa"/>
+            </w:tcMar>
+            <w:hideMark/>
+          </w:tcPr>
+          <w:p>
+            <w:pPr>
+              <w:spacing w:after="0" w:line="240" w:lineRule="auto"/>
+              <w:rPr>
+                <w:rFonts w:ascii="Times New Roman" w:eastAsia="Times New Roman" w:hAnsi="Times New Roman" w:cs="Times New Roman"/>
+                <w:kern w:val="0"/>
+                <w:sz w:val="24"/>
+                <w:szCs w:val="24"/>
+                <w:lang w:eastAsia="en-IN"/>
+                <w14:ligatures w14:val="none"/>
+              </w:rPr>
+            </w:pPr>
+            <w:r>
+              <w:rPr>
+                <w:rFonts w:ascii="Calibri" w:eastAsia="Times New Roman" w:hAnsi="Calibri" w:cs="Calibri"/>
+                <w:color w:val="000000"/>
+                <w:kern w:val="0"/>
+                <w:lang w:eastAsia="en-IN"/>
+                <w14:ligatures w14:val="none"/>
+              </w:rPr>
+              <w:t>Normal </w:t>
+            </w:r>
+          </w:p>
+        </w:tc>
+      </w:tr>
+      <w:tr>
+        <w:tc>
+          <w:tcPr>
+            <w:tcW w:w="0" w:type="auto"/>
+            <w:tcBorders>
+              <w:top w:val="single" w:sz="8" w:space="0" w:color="000000"/>
+              <w:left w:val="single" w:sz="8" w:space="0" w:color="000000"/>
+              <w:bottom w:val="single" w:sz="8" w:space="0" w:color="000000"/>
+              <w:right w:val="single" w:sz="8" w:space="0" w:color="000000"/>
+            </w:tcBorders>
+            <w:tcMar>
+              <w:top w:w="100" w:type="dxa"/>
+              <w:left w:w="100" w:type="dxa"/>
+              <w:bottom w:w="100" w:type="dxa"/>
+              <w:right w:w="100" w:type="dxa"/>
+            </w:tcMar>
+            <w:hideMark/>
+          </w:tcPr>
+          <w:p>
+            <w:pPr>
+              <w:spacing w:after="0" w:line="240" w:lineRule="auto"/>
+              <w:rPr>
+                <w:rFonts w:ascii="Times New Roman" w:eastAsia="Times New Roman" w:hAnsi="Times New Roman" w:cs="Times New Roman"/>
+                <w:kern w:val="0"/>
+                <w:sz w:val="24"/>
+                <w:szCs w:val="24"/>
+                <w:lang w:eastAsia="en-IN"/>
+                <w14:ligatures w14:val="none"/>
+              </w:rPr>
+            </w:pPr>
+            <w:r>
+              <w:rPr>
+                <w:rFonts w:ascii="Calibri" w:eastAsia="Times New Roman" w:hAnsi="Calibri" w:cs="Calibri"/>
+                <w:color w:val="000000"/>
+                <w:kern w:val="0"/>
+                <w:lang w:eastAsia="en-IN"/>
+                <w14:ligatures w14:val="none"/>
+              </w:rPr>
+              <w:t>T7</w:t>
+            </w:r>
+          </w:p>
+        </w:tc>
+        <w:tc>
+          <w:tcPr>
+            <w:tcW w:w="0" w:type="auto"/>
+            <w:tcBorders>
+              <w:top w:val="single" w:sz="8" w:space="0" w:color="000000"/>
+              <w:left w:val="single" w:sz="8" w:space="0" w:color="000000"/>
+              <w:bottom w:val="single" w:sz="8" w:space="0" w:color="000000"/>
+              <w:right w:val="single" w:sz="8" w:space="0" w:color="000000"/>
+            </w:tcBorders>
+            <w:tcMar>
+              <w:top w:w="100" w:type="dxa"/>
+              <w:left w:w="100" w:type="dxa"/>
+              <w:bottom w:w="100" w:type="dxa"/>
+              <w:right w:w="100" w:type="dxa"/>
+            </w:tcMar>
+            <w:hideMark/>
+          </w:tcPr>
+          <w:p>
+            <w:pPr>
+              <w:spacing w:after="0" w:line="240" w:lineRule="auto"/>
+              <w:rPr>
+                <w:rFonts w:ascii="Times New Roman" w:eastAsia="Times New Roman" w:hAnsi="Times New Roman" w:cs="Times New Roman"/>
+                <w:kern w:val="0"/>
+                <w:sz w:val="24"/>
+                <w:szCs w:val="24"/>
+                <w:lang w:eastAsia="en-IN"/>
+                <w14:ligatures w14:val="none"/>
+              </w:rPr>
+            </w:pPr>
+            <w:r>
+              <w:rPr>
+                <w:rFonts w:ascii="Calibri" w:eastAsia="Times New Roman" w:hAnsi="Calibri" w:cs="Calibri"/>
+                <w:color w:val="000000"/>
+                <w:kern w:val="0"/>
+                <w:lang w:eastAsia="en-IN"/>
+                <w14:ligatures w14:val="none"/>
+              </w:rPr>
+              <w:t>Pure DSA Math</w:t>
+            </w:r>
+          </w:p>
+        </w:tc>
+        <w:tc>
+          <w:tcPr>
+            <w:tcW w:w="0" w:type="auto"/>
+            <w:tcBorders>
+              <w:top w:val="single" w:sz="8" w:space="0" w:color="000000"/>
+              <w:left w:val="single" w:sz="8" w:space="0" w:color="000000"/>
+              <w:bottom w:val="single" w:sz="8" w:space="0" w:color="000000"/>
+              <w:right w:val="single" w:sz="8" w:space="0" w:color="000000"/>
+            </w:tcBorders>
+            <w:tcMar>
+              <w:top w:w="100" w:type="dxa"/>
+              <w:left w:w="100" w:type="dxa"/>
+              <w:bottom w:w="100" w:type="dxa"/>
+              <w:right w:w="100" w:type="dxa"/>
+            </w:tcMar>
+            <w:hideMark/>
+          </w:tcPr>
+          <w:p>
+            <w:pPr>
+              <w:spacing w:after="0" w:line="240" w:lineRule="auto"/>
+              <w:rPr>
+                <w:rFonts w:ascii="Times New Roman" w:eastAsia="Times New Roman" w:hAnsi="Times New Roman" w:cs="Times New Roman"/>
+                <w:kern w:val="0"/>
+                <w:sz w:val="24"/>
+                <w:szCs w:val="24"/>
+                <w:lang w:eastAsia="en-IN"/>
+                <w14:ligatures w14:val="none"/>
+              </w:rPr>
+            </w:pPr>
+            <w:r>
+              <w:rPr>
+                <w:rFonts w:ascii="Calibri" w:eastAsia="Times New Roman" w:hAnsi="Calibri" w:cs="Calibri"/>
+                <w:color w:val="000000"/>
+                <w:kern w:val="0"/>
+                <w:lang w:eastAsia="en-IN"/>
+                <w14:ligatures w14:val="none"/>
+              </w:rPr>
+              <w:t>Pass empty array [] to RSI function. </w:t>
+            </w:r>
+          </w:p>
+        </w:tc>
+        <w:tc>
+          <w:tcPr>
+            <w:tcW w:w="0" w:type="auto"/>
+            <w:tcBorders>
+              <w:top w:val="single" w:sz="8" w:space="0" w:color="000000"/>
+              <w:left w:val="single" w:sz="8" w:space="0" w:color="000000"/>
+              <w:bottom w:val="single" w:sz="8" w:space="0" w:color="000000"/>
+              <w:right w:val="single" w:sz="8" w:space="0" w:color="000000"/>
+            </w:tcBorders>
+            <w:tcMar>
+              <w:top w:w="100" w:type="dxa"/>
+              <w:left w:w="100" w:type="dxa"/>
+              <w:bottom w:w="100" w:type="dxa"/>
+              <w:right w:w="100" w:type="dxa"/>
+            </w:tcMar>
+            <w:hideMark/>
+          </w:tcPr>
+          <w:p>
+            <w:pPr>
+              <w:spacing w:after="0" w:line="240" w:lineRule="auto"/>
+              <w:rPr>
+                <w:rFonts w:ascii="Times New Roman" w:eastAsia="Times New Roman" w:hAnsi="Times New Roman" w:cs="Times New Roman"/>
+                <w:kern w:val="0"/>
+                <w:sz w:val="24"/>
+                <w:szCs w:val="24"/>
+                <w:lang w:eastAsia="en-IN"/>
+                <w14:ligatures w14:val="none"/>
+              </w:rPr>
+            </w:pPr>
+            <w:r>
+              <w:rPr>
+                <w:rFonts w:ascii="Calibri" w:eastAsia="Times New Roman" w:hAnsi="Calibri" w:cs="Calibri"/>
+                <w:color w:val="000000"/>
+                <w:kern w:val="0"/>
+                <w:lang w:eastAsia="en-IN"/>
+                <w14:ligatures w14:val="none"/>
+              </w:rPr>
+              <w:t>Gracefully handles empty list, returns default neutral RSI value (50.0). </w:t>
+            </w:r>
+          </w:p>
+        </w:tc>
+        <w:tc>
+          <w:tcPr>
+            <w:tcW w:w="0" w:type="auto"/>
+            <w:tcBorders>
+              <w:top w:val="single" w:sz="8" w:space="0" w:color="000000"/>
+              <w:left w:val="single" w:sz="8" w:space="0" w:color="000000"/>
+              <w:bottom w:val="single" w:sz="8" w:space="0" w:color="000000"/>
+              <w:right w:val="single" w:sz="8" w:space="0" w:color="000000"/>
+            </w:tcBorders>
+            <w:tcMar>
+              <w:top w:w="100" w:type="dxa"/>
+              <w:left w:w="100" w:type="dxa"/>
+              <w:bottom w:w="100" w:type="dxa"/>
+              <w:right w:w="100" w:type="dxa"/>
+            </w:tcMar>
+            <w:hideMark/>
+          </w:tcPr>
+          <w:p>
+            <w:pPr>
+              <w:spacing w:after="0" w:line="240" w:lineRule="auto"/>
+              <w:rPr>
+                <w:rFonts w:ascii="Times New Roman" w:eastAsia="Times New Roman" w:hAnsi="Times New Roman" w:cs="Times New Roman"/>
+                <w:kern w:val="0"/>
+                <w:sz w:val="24"/>
+                <w:szCs w:val="24"/>
+                <w:lang w:eastAsia="en-IN"/>
+                <w14:ligatures w14:val="none"/>
+              </w:rPr>
+            </w:pPr>
+            <w:r>
+              <w:rPr>
+                <w:rFonts w:ascii="Calibri" w:eastAsia="Times New Roman" w:hAnsi="Calibri" w:cs="Calibri"/>
+                <w:color w:val="000000"/>
+                <w:kern w:val="0"/>
+                <w:lang w:eastAsia="en-IN"/>
+                <w14:ligatures w14:val="none"/>
+              </w:rPr>
+              <w:t>Erroneous </w:t>
+            </w:r>
+          </w:p>
+        </w:tc>
+      </w:tr>
+      <w:tr>
+        <w:tc>
+          <w:tcPr>
+            <w:tcW w:w="0" w:type="auto"/>
+            <w:tcBorders>
+              <w:top w:val="single" w:sz="8" w:space="0" w:color="000000"/>
+              <w:left w:val="single" w:sz="8" w:space="0" w:color="000000"/>
+              <w:bottom w:val="single" w:sz="8" w:space="0" w:color="000000"/>
+              <w:right w:val="single" w:sz="8" w:space="0" w:color="000000"/>
+            </w:tcBorders>
+            <w:tcMar>
+              <w:top w:w="100" w:type="dxa"/>
+              <w:left w:w="100" w:type="dxa"/>
+              <w:bottom w:w="100" w:type="dxa"/>
+              <w:right w:w="100" w:type="dxa"/>
+            </w:tcMar>
+            <w:hideMark/>
+          </w:tcPr>
+          <w:p>
+            <w:pPr>
+              <w:spacing w:after="0" w:line="240" w:lineRule="auto"/>
+              <w:rPr>
+                <w:rFonts w:ascii="Times New Roman" w:eastAsia="Times New Roman" w:hAnsi="Times New Roman" w:cs="Times New Roman"/>
+                <w:kern w:val="0"/>
+                <w:sz w:val="24"/>
+                <w:szCs w:val="24"/>
+                <w:lang w:eastAsia="en-IN"/>
+                <w14:ligatures w14:val="none"/>
+              </w:rPr>
+            </w:pPr>
+            <w:r>
+              <w:rPr>
+                <w:rFonts w:ascii="Calibri" w:eastAsia="Times New Roman" w:hAnsi="Calibri" w:cs="Calibri"/>
+                <w:color w:val="000000"/>
+                <w:kern w:val="0"/>
+                <w:lang w:eastAsia="en-IN"/>
+                <w14:ligatures w14:val="none"/>
+              </w:rPr>
+              <w:t>T8</w:t>
+            </w:r>
+          </w:p>
+        </w:tc>
+        <w:tc>
+          <w:tcPr>
+            <w:tcW w:w="0" w:type="auto"/>
+            <w:tcBorders>
+              <w:top w:val="single" w:sz="8" w:space="0" w:color="000000"/>
+              <w:left w:val="single" w:sz="8" w:space="0" w:color="000000"/>
+              <w:bottom w:val="single" w:sz="8" w:space="0" w:color="000000"/>
+              <w:right w:val="single" w:sz="8" w:space="0" w:color="000000"/>
+            </w:tcBorders>
+            <w:tcMar>
+              <w:top w:w="100" w:type="dxa"/>
+              <w:left w:w="100" w:type="dxa"/>
+              <w:bottom w:w="100" w:type="dxa"/>
+              <w:right w:w="100" w:type="dxa"/>
+            </w:tcMar>
+            <w:hideMark/>
+          </w:tcPr>
+          <w:p>
+            <w:pPr>
+              <w:spacing w:after="0" w:line="240" w:lineRule="auto"/>
+              <w:rPr>
+                <w:rFonts w:ascii="Times New Roman" w:eastAsia="Times New Roman" w:hAnsi="Times New Roman" w:cs="Times New Roman"/>
+                <w:kern w:val="0"/>
+                <w:sz w:val="24"/>
+                <w:szCs w:val="24"/>
+                <w:lang w:eastAsia="en-IN"/>
+                <w14:ligatures w14:val="none"/>
+              </w:rPr>
+            </w:pPr>
+            <w:r>
+              <w:rPr>
+                <w:rFonts w:ascii="Calibri" w:eastAsia="Times New Roman" w:hAnsi="Calibri" w:cs="Calibri"/>
+                <w:color w:val="000000"/>
+                <w:kern w:val="0"/>
+                <w:lang w:eastAsia="en-IN"/>
+                <w14:ligatures w14:val="none"/>
+              </w:rPr>
+              <w:t>Alert Engine</w:t>
+            </w:r>
+          </w:p>
+        </w:tc>
+        <w:tc>
+          <w:tcPr>
+            <w:tcW w:w="0" w:type="auto"/>
+            <w:tcBorders>
+              <w:top w:val="single" w:sz="8" w:space="0" w:color="000000"/>
+              <w:left w:val="single" w:sz="8" w:space="0" w:color="000000"/>
+              <w:bottom w:val="single" w:sz="8" w:space="0" w:color="000000"/>
+              <w:right w:val="single" w:sz="8" w:space="0" w:color="000000"/>
+            </w:tcBorders>
+            <w:tcMar>
+              <w:top w:w="100" w:type="dxa"/>
+              <w:left w:w="100" w:type="dxa"/>
+              <w:bottom w:w="100" w:type="dxa"/>
+              <w:right w:w="100" w:type="dxa"/>
+            </w:tcMar>
+            <w:hideMark/>
+          </w:tcPr>
+          <w:p>
+            <w:pPr>
+              <w:spacing w:after="0" w:line="240" w:lineRule="auto"/>
+              <w:rPr>
+                <w:rFonts w:ascii="Times New Roman" w:eastAsia="Times New Roman" w:hAnsi="Times New Roman" w:cs="Times New Roman"/>
+                <w:kern w:val="0"/>
+                <w:sz w:val="24"/>
+                <w:szCs w:val="24"/>
+                <w:lang w:eastAsia="en-IN"/>
+                <w14:ligatures w14:val="none"/>
+              </w:rPr>
+            </w:pPr>
+            <w:r>
+              <w:rPr>
+                <w:rFonts w:ascii="Calibri" w:eastAsia="Times New Roman" w:hAnsi="Calibri" w:cs="Calibri"/>
+                <w:color w:val="000000"/>
+                <w:kern w:val="0"/>
+                <w:lang w:eastAsia="en-IN"/>
+                <w14:ligatures w14:val="none"/>
+              </w:rPr>
+              <w:t>Create price alert: Ticker TSLA, Target $200.00, Condition ABOVE </w:t>
+            </w:r>
+          </w:p>
+        </w:tc>
+        <w:tc>
+          <w:tcPr>
+            <w:tcW w:w="0" w:type="auto"/>
+            <w:tcBorders>
+              <w:top w:val="single" w:sz="8" w:space="0" w:color="000000"/>
+              <w:left w:val="single" w:sz="8" w:space="0" w:color="000000"/>
+              <w:bottom w:val="single" w:sz="8" w:space="0" w:color="000000"/>
+              <w:right w:val="single" w:sz="8" w:space="0" w:color="000000"/>
+            </w:tcBorders>
+            <w:tcMar>
+              <w:top w:w="100" w:type="dxa"/>
+              <w:left w:w="100" w:type="dxa"/>
+              <w:bottom w:w="100" w:type="dxa"/>
+              <w:right w:w="100" w:type="dxa"/>
+            </w:tcMar>
+            <w:hideMark/>
+          </w:tcPr>
+          <w:p>
+            <w:pPr>
+              <w:spacing w:after="0" w:line="240" w:lineRule="auto"/>
+              <w:rPr>
+                <w:rFonts w:ascii="Times New Roman" w:eastAsia="Times New Roman" w:hAnsi="Times New Roman" w:cs="Times New Roman"/>
+                <w:kern w:val="0"/>
+                <w:sz w:val="24"/>
+                <w:szCs w:val="24"/>
+                <w:lang w:eastAsia="en-IN"/>
+                <w14:ligatures w14:val="none"/>
+              </w:rPr>
+            </w:pPr>
+            <w:r>
+              <w:rPr>
+                <w:rFonts w:ascii="Calibri" w:eastAsia="Times New Roman" w:hAnsi="Calibri" w:cs="Calibri"/>
+                <w:color w:val="000000"/>
+                <w:kern w:val="0"/>
+                <w:lang w:eastAsia="en-IN"/>
+                <w14:ligatures w14:val="none"/>
+              </w:rPr>
+              <w:t xml:space="preserve">Alert saved to database with </w:t>
+            </w:r>
+            <w:proofErr w:type="spellStart"/>
+            <w:r>
+              <w:rPr>
+                <w:rFonts w:ascii="Calibri" w:eastAsia="Times New Roman" w:hAnsi="Calibri" w:cs="Calibri"/>
+                <w:color w:val="000000"/>
+                <w:kern w:val="0"/>
+                <w:lang w:eastAsia="en-IN"/>
+                <w14:ligatures w14:val="none"/>
+              </w:rPr>
+              <w:t>is_active</w:t>
+            </w:r>
+            <w:proofErr w:type="spellEnd"/>
+            <w:r>
+              <w:rPr>
+                <w:rFonts w:ascii="Calibri" w:eastAsia="Times New Roman" w:hAnsi="Calibri" w:cs="Calibri"/>
+                <w:color w:val="000000"/>
+                <w:kern w:val="0"/>
+                <w:lang w:eastAsia="en-IN"/>
+                <w14:ligatures w14:val="none"/>
+              </w:rPr>
+              <w:t xml:space="preserve"> = 1 linked via Foreign Key </w:t>
+            </w:r>
+            <w:proofErr w:type="spellStart"/>
+            <w:r>
+              <w:rPr>
+                <w:rFonts w:ascii="Calibri" w:eastAsia="Times New Roman" w:hAnsi="Calibri" w:cs="Calibri"/>
+                <w:color w:val="000000"/>
+                <w:kern w:val="0"/>
+                <w:lang w:eastAsia="en-IN"/>
+                <w14:ligatures w14:val="none"/>
+              </w:rPr>
+              <w:t>user_id</w:t>
+            </w:r>
+            <w:proofErr w:type="spellEnd"/>
+            <w:r>
+              <w:rPr>
+                <w:rFonts w:ascii="Calibri" w:eastAsia="Times New Roman" w:hAnsi="Calibri" w:cs="Calibri"/>
+                <w:color w:val="000000"/>
+                <w:kern w:val="0"/>
+                <w:lang w:eastAsia="en-IN"/>
+                <w14:ligatures w14:val="none"/>
+              </w:rPr>
+              <w:t>. </w:t>
+            </w:r>
+          </w:p>
+        </w:tc>
+        <w:tc>
+          <w:tcPr>
+            <w:tcW w:w="0" w:type="auto"/>
+            <w:tcBorders>
+              <w:top w:val="single" w:sz="8" w:space="0" w:color="000000"/>
+              <w:left w:val="single" w:sz="8" w:space="0" w:color="000000"/>
+              <w:bottom w:val="single" w:sz="8" w:space="0" w:color="000000"/>
+              <w:right w:val="single" w:sz="8" w:space="0" w:color="000000"/>
+            </w:tcBorders>
+            <w:tcMar>
+              <w:top w:w="100" w:type="dxa"/>
+              <w:left w:w="100" w:type="dxa"/>
+              <w:bottom w:w="100" w:type="dxa"/>
+              <w:right w:w="100" w:type="dxa"/>
+            </w:tcMar>
+            <w:hideMark/>
+          </w:tcPr>
+          <w:p>
+            <w:pPr>
+              <w:spacing w:after="0" w:line="240" w:lineRule="auto"/>
+              <w:rPr>
+                <w:rFonts w:ascii="Times New Roman" w:eastAsia="Times New Roman" w:hAnsi="Times New Roman" w:cs="Times New Roman"/>
+                <w:kern w:val="0"/>
+                <w:sz w:val="24"/>
+                <w:szCs w:val="24"/>
+                <w:lang w:eastAsia="en-IN"/>
+                <w14:ligatures w14:val="none"/>
+              </w:rPr>
+            </w:pPr>
+            <w:r>
+              <w:rPr>
+                <w:rFonts w:ascii="Calibri" w:eastAsia="Times New Roman" w:hAnsi="Calibri" w:cs="Calibri"/>
+                <w:color w:val="000000"/>
+                <w:kern w:val="0"/>
+                <w:lang w:eastAsia="en-IN"/>
+                <w14:ligatures w14:val="none"/>
+              </w:rPr>
+              <w:t>Normal </w:t>
+            </w:r>
+          </w:p>
+        </w:tc>
+      </w:tr>
+    </w:tbl>
+    <w:p>
+      <w:r>
+        <w:lastRenderedPageBreak/>
+        <w:t>Section 3.3</w:t>
+      </w:r>
+    </w:p>
+    <w:p>
+      <w:r>
+        <w:rPr>
+          <w:noProof/>
+        </w:rPr>
+        <w:drawing>
+          <wp:inline distT="0" distB="0" distL="0" distR="0" wp14:anchorId="3D672310" wp14:editId="48D76E6D">
+            <wp:extent cx="4122777" cy="3215919"/>
+            <wp:effectExtent l="0" t="0" r="0" b="3810"/>
+            <wp:docPr id="556371737" name="Picture 1"/>
+            <wp:cNvGraphicFramePr>
+              <a:graphicFrameLocks xmlns:a="http://schemas.openxmlformats.org/drawingml/2006/main" noChangeAspect="1"/>
+            </wp:cNvGraphicFramePr>
+            <a:graphic xmlns:a="http://schemas.openxmlformats.org/drawingml/2006/main">
+              <a:graphicData uri="http://schemas.openxmlformats.org/drawingml/2006/picture">
+                <pic:pic xmlns:pic="http://schemas.openxmlformats.org/drawingml/2006/picture">
+                  <pic:nvPicPr>
+                    <pic:cNvPr id="556371737" name="Picture 556371737"/>
+                    <pic:cNvPicPr/>
+                  </pic:nvPicPr>
+                  <pic:blipFill>
+                    <a:blip r:embed="rId19">
+                      <a:extLst>
+                        <a:ext uri="{28A0092B-C50C-407E-A947-70E740481C1C}">
+                          <a14:useLocalDpi xmlns:a14="http://schemas.microsoft.com/office/drawing/2010/main" val="0"/>
+                        </a:ext>
+                      </a:extLst>
+                    </a:blip>
+                    <a:stretch>
+                      <a:fillRect/>
+                    </a:stretch>
+                  </pic:blipFill>
+                  <pic:spPr>
+                    <a:xfrm>
+                      <a:off x="0" y="0"/>
+                      <a:ext cx="4122777" cy="3215919"/>
+                    </a:xfrm>
+                    <a:prstGeom prst="rect">
+                      <a:avLst/>
+                    </a:prstGeom>
+                  </pic:spPr>
+                </pic:pic>
+              </a:graphicData>
+            </a:graphic>
+          </wp:inline>
+        </w:drawing>
+      </w:r>
+    </w:p>
+    <w:p/>
+    <w:p>
+      <w:r>
+        <w:rPr>
+          <w:noProof/>
+        </w:rPr>
+        <w:drawing>
+          <wp:inline distT="0" distB="0" distL="0" distR="0" wp14:anchorId="06FC34CE" wp14:editId="20C8D437">
+            <wp:extent cx="5731510" cy="1172210"/>
+            <wp:effectExtent l="0" t="0" r="2540" b="8890"/>
+            <wp:docPr id="998962740" name="Picture 1"/>
+            <wp:cNvGraphicFramePr>
+              <a:graphicFrameLocks xmlns:a="http://schemas.openxmlformats.org/drawingml/2006/main" noChangeAspect="1"/>
+            </wp:cNvGraphicFramePr>
+            <a:graphic xmlns:a="http://schemas.openxmlformats.org/drawingml/2006/main">
+              <a:graphicData uri="http://schemas.openxmlformats.org/drawingml/2006/picture">
+                <pic:pic xmlns:pic="http://schemas.openxmlformats.org/drawingml/2006/picture">
+                  <pic:nvPicPr>
+                    <pic:cNvPr id="998962740" name=""/>
+                    <pic:cNvPicPr/>
+                  </pic:nvPicPr>
+                  <pic:blipFill>
+                    <a:blip r:embed="rId20"/>
+                    <a:stretch>
+                      <a:fillRect/>
+                    </a:stretch>
+                  </pic:blipFill>
+                  <pic:spPr>
+                    <a:xfrm>
+                      <a:off x="0" y="0"/>
+                      <a:ext cx="5731510" cy="1172210"/>
+                    </a:xfrm>
+                    <a:prstGeom prst="rect">
+                      <a:avLst/>
+                    </a:prstGeom>
+                  </pic:spPr>
+                </pic:pic>
+              </a:graphicData>
+            </a:graphic>
+          </wp:inline>
+        </w:drawing>
+      </w:r>
+    </w:p>
+    <w:p/>
+    <w:p>
+      <w:r>
+        <w:rPr>
+          <w:noProof/>
+        </w:rPr>
+        <w:drawing>
+          <wp:inline distT="0" distB="0" distL="0" distR="0" wp14:anchorId="59A6ED24" wp14:editId="75791625">
+            <wp:extent cx="5731510" cy="2073275"/>
+            <wp:effectExtent l="0" t="0" r="2540" b="3175"/>
+            <wp:docPr id="644126422" name="Picture 1"/>
+            <wp:cNvGraphicFramePr>
+              <a:graphicFrameLocks xmlns:a="http://schemas.openxmlformats.org/drawingml/2006/main" noChangeAspect="1"/>
+            </wp:cNvGraphicFramePr>
+            <a:graphic xmlns:a="http://schemas.openxmlformats.org/drawingml/2006/main">
+              <a:graphicData uri="http://schemas.openxmlformats.org/drawingml/2006/picture">
+                <pic:pic xmlns:pic="http://schemas.openxmlformats.org/drawingml/2006/picture">
+                  <pic:nvPicPr>
+                    <pic:cNvPr id="644126422" name="Picture 644126422"/>
+                    <pic:cNvPicPr/>
+                  </pic:nvPicPr>
+                  <pic:blipFill>
+                    <a:blip r:embed="rId21" cstate="print">
+                      <a:extLst>
+                        <a:ext uri="{28A0092B-C50C-407E-A947-70E740481C1C}">
+                          <a14:useLocalDpi xmlns:a14="http://schemas.microsoft.com/office/drawing/2010/main" val="0"/>
+                        </a:ext>
+                      </a:extLst>
+                    </a:blip>
+                    <a:stretch>
+                      <a:fillRect/>
+                    </a:stretch>
+                  </pic:blipFill>
+                  <pic:spPr>
+                    <a:xfrm>
+                      <a:off x="0" y="0"/>
+                      <a:ext cx="5731510" cy="2073275"/>
+                    </a:xfrm>
+                    <a:prstGeom prst="rect">
+                      <a:avLst/>
+                    </a:prstGeom>
+                  </pic:spPr>
+                </pic:pic>
+              </a:graphicData>
+            </a:graphic>
+          </wp:inline>
+        </w:drawing>
+      </w:r>
+    </w:p>
     <w:sectPr>
-      <w:headerReference w:type="default" r:id="rId11"/>
+      <w:headerReference w:type="default" r:id="rId22"/>
       <w:pgSz w:w="11906" w:h="16838"/>
       <w:pgMar w:top="1440" w:right="1440" w:bottom="1440" w:left="1440" w:header="708" w:footer="708" w:gutter="0"/>
       <w:cols w:space="708"/>
@@ -1705,7 +6185,7 @@
 </file>
 
 <file path=word/endnotes.xml><?xml version="1.0" encoding="utf-8"?>
-<w:endnotes xmlns:wpc="http://schemas.microsoft.com/office/word/2010/wordprocessingCanvas" xmlns:cx="http://schemas.microsoft.com/office/drawing/2014/chartex" xmlns:cx1="http://schemas.microsoft.com/office/drawing/2015/9/8/chartex" xmlns:cx2="http://schemas.microsoft.com/office/drawing/2015/10/21/chartex" xmlns:cx3="http://schemas.microsoft.com/office/drawing/2016/5/9/chartex" xmlns:cx4="http://schemas.microsoft.com/office/drawing/2016/5/10/chartex" xmlns:cx5="http://schemas.microsoft.com/office/drawing/2016/5/11/chartex" xmlns:cx6="http://schemas.microsoft.com/office/drawing/2016/5/12/chartex" xmlns:cx7="http://schemas.microsoft.com/office/drawing/2016/5/13/chartex" xmlns:cx8="http://schemas.microsoft.com/office/drawing/2016/5/14/chartex" xmlns:mc="http://schemas.openxmlformats.org/markup-compatibility/2006" xmlns:aink="http://schemas.microsoft.com/office/drawing/2016/ink" xmlns:am3d="http://schemas.microsoft.com/office/drawing/2017/model3d" xmlns:o="urn:schemas-microsoft-com:office:office" xmlns:oel="http://schemas.microsoft.com/office/2019/extlst" xmlns:r="http://schemas.openxmlformats.org/officeDocument/2006/relationships" xmlns:m="http://schemas.openxmlformats.org/officeDocument/2006/math" xmlns:v="urn:schemas-microsoft-com:vml" xmlns:wp14="http://schemas.microsoft.com/office/word/2010/wordprocessingDrawing" xmlns:wp="http://schemas.openxmlformats.org/drawingml/2006/wordprocessingDrawing" xmlns:w10="urn:schemas-microsoft-com:office:word" xmlns:w="http://schemas.openxmlformats.org/wordprocessingml/2006/main" xmlns:w14="http://schemas.microsoft.com/office/word/2010/wordml" xmlns:w15="http://schemas.microsoft.com/office/word/2012/wordml" xmlns:w16cei="http://schemas.microsoft.com/office/word/2026/wordml/cei" xmlns:w16cex="http://schemas.microsoft.com/office/word/2018/wordml/cex" xmlns:w16cid="http://schemas.microsoft.com/office/word/2016/wordml/cid" xmlns:w16="http://schemas.microsoft.com/office/word/2018/wordml" xmlns:w16du="http://schemas.microsoft.com/office/word/2023/wordml/word16du" xmlns:w16sdtdh="http://schemas.microsoft.com/office/word/2020/wordml/sdtdatahash" xmlns:w16sdtfl="http://schemas.microsoft.com/office/word/2024/wordml/sdtformatlock" xmlns:w16se="http://schemas.microsoft.com/office/word/2015/wordml/symex" xmlns:wpg="http://schemas.microsoft.com/office/word/2010/wordprocessingGroup" xmlns:wpi="http://schemas.microsoft.com/office/word/2010/wordprocessingInk" xmlns:wne="http://schemas.microsoft.com/office/word/2006/wordml" xmlns:wps="http://schemas.microsoft.com/office/word/2010/wordprocessingShape" mc:Ignorable="w14 w15 w16se w16cid w16 w16cex w16sdtdh w16sdtfl w16du wp14">
+<w:endnotes xmlns:wpc="http://schemas.microsoft.com/office/word/2010/wordprocessingCanvas" xmlns:cx="http://schemas.microsoft.com/office/drawing/2014/chartex" xmlns:cx1="http://schemas.microsoft.com/office/drawing/2015/9/8/chartex" xmlns:cx2="http://schemas.microsoft.com/office/drawing/2015/10/21/chartex" xmlns:cx3="http://schemas.microsoft.com/office/drawing/2016/5/9/chartex" xmlns:cx4="http://schemas.microsoft.com/office/drawing/2016/5/10/chartex" xmlns:cx5="http://schemas.microsoft.com/office/drawing/2016/5/11/chartex" xmlns:cx6="http://schemas.microsoft.com/office/drawing/2016/5/12/chartex" xmlns:cx7="http://schemas.microsoft.com/office/drawing/2016/5/13/chartex" xmlns:cx8="http://schemas.microsoft.com/office/drawing/2016/5/14/chartex" xmlns:mc="http://schemas.openxmlformats.org/markup-compatibility/2006" xmlns:aink="http://schemas.microsoft.com/office/drawing/2016/ink" xmlns:am3d="http://schemas.microsoft.com/office/drawing/2017/model3d" xmlns:o="urn:schemas-microsoft-com:office:office" xmlns:oel="http://schemas.microsoft.com/office/2019/extlst" xmlns:r="http://schemas.openxmlformats.org/officeDocument/2006/relationships" xmlns:m="http://schemas.openxmlformats.org/officeDocument/2006/math" xmlns:v="urn:schemas-microsoft-com:vml" xmlns:wp14="http://schemas.microsoft.com/office/word/2010/wordprocessingDrawing" xmlns:wp="http://schemas.openxmlformats.org/drawingml/2006/wordprocessingDrawing" xmlns:w10="urn:schemas-microsoft-com:office:word" xmlns:w="http://schemas.openxmlformats.org/wordprocessingml/2006/main" xmlns:w14="http://schemas.microsoft.com/office/word/2010/wordml" xmlns:w15="http://schemas.microsoft.com/office/word/2012/wordml" xmlns:w16cex="http://schemas.microsoft.com/office/word/2018/wordml/cex" xmlns:w16cid="http://schemas.microsoft.com/office/word/2016/wordml/cid" xmlns:w16="http://schemas.microsoft.com/office/word/2018/wordml" xmlns:w16du="http://schemas.microsoft.com/office/word/2023/wordml/word16du" xmlns:w16sdtdh="http://schemas.microsoft.com/office/word/2020/wordml/sdtdatahash" xmlns:w16sdtfl="http://schemas.microsoft.com/office/word/2024/wordml/sdtformatlock" xmlns:w16se="http://schemas.microsoft.com/office/word/2015/wordml/symex" xmlns:wpg="http://schemas.microsoft.com/office/word/2010/wordprocessingGroup" xmlns:wpi="http://schemas.microsoft.com/office/word/2010/wordprocessingInk" xmlns:wne="http://schemas.microsoft.com/office/word/2006/wordml" xmlns:wps="http://schemas.microsoft.com/office/word/2010/wordprocessingShape" mc:Ignorable="w14 w15 w16se w16cid w16 w16cex w16sdtdh w16sdtfl w16du wp14">
   <w:endnote w:type="separator" w:id="-1">
     <w:p>
       <w:pPr>
@@ -1730,7 +6210,7 @@
 </file>
 
 <file path=word/footnotes.xml><?xml version="1.0" encoding="utf-8"?>
-<w:footnotes xmlns:wpc="http://schemas.microsoft.com/office/word/2010/wordprocessingCanvas" xmlns:cx="http://schemas.microsoft.com/office/drawing/2014/chartex" xmlns:cx1="http://schemas.microsoft.com/office/drawing/2015/9/8/chartex" xmlns:cx2="http://schemas.microsoft.com/office/drawing/2015/10/21/chartex" xmlns:cx3="http://schemas.microsoft.com/office/drawing/2016/5/9/chartex" xmlns:cx4="http://schemas.microsoft.com/office/drawing/2016/5/10/chartex" xmlns:cx5="http://schemas.microsoft.com/office/drawing/2016/5/11/chartex" xmlns:cx6="http://schemas.microsoft.com/office/drawing/2016/5/12/chartex" xmlns:cx7="http://schemas.microsoft.com/office/drawing/2016/5/13/chartex" xmlns:cx8="http://schemas.microsoft.com/office/drawing/2016/5/14/chartex" xmlns:mc="http://schemas.openxmlformats.org/markup-compatibility/2006" xmlns:aink="http://schemas.microsoft.com/office/drawing/2016/ink" xmlns:am3d="http://schemas.microsoft.com/office/drawing/2017/model3d" xmlns:o="urn:schemas-microsoft-com:office:office" xmlns:oel="http://schemas.microsoft.com/office/2019/extlst" xmlns:r="http://schemas.openxmlformats.org/officeDocument/2006/relationships" xmlns:m="http://schemas.openxmlformats.org/officeDocument/2006/math" xmlns:v="urn:schemas-microsoft-com:vml" xmlns:wp14="http://schemas.microsoft.com/office/word/2010/wordprocessingDrawing" xmlns:wp="http://schemas.openxmlformats.org/drawingml/2006/wordprocessingDrawing" xmlns:w10="urn:schemas-microsoft-com:office:word" xmlns:w="http://schemas.openxmlformats.org/wordprocessingml/2006/main" xmlns:w14="http://schemas.microsoft.com/office/word/2010/wordml" xmlns:w15="http://schemas.microsoft.com/office/word/2012/wordml" xmlns:w16cei="http://schemas.microsoft.com/office/word/2026/wordml/cei" xmlns:w16cex="http://schemas.microsoft.com/office/word/2018/wordml/cex" xmlns:w16cid="http://schemas.microsoft.com/office/word/2016/wordml/cid" xmlns:w16="http://schemas.microsoft.com/office/word/2018/wordml" xmlns:w16du="http://schemas.microsoft.com/office/word/2023/wordml/word16du" xmlns:w16sdtdh="http://schemas.microsoft.com/office/word/2020/wordml/sdtdatahash" xmlns:w16sdtfl="http://schemas.microsoft.com/office/word/2024/wordml/sdtformatlock" xmlns:w16se="http://schemas.microsoft.com/office/word/2015/wordml/symex" xmlns:wpg="http://schemas.microsoft.com/office/word/2010/wordprocessingGroup" xmlns:wpi="http://schemas.microsoft.com/office/word/2010/wordprocessingInk" xmlns:wne="http://schemas.microsoft.com/office/word/2006/wordml" xmlns:wps="http://schemas.microsoft.com/office/word/2010/wordprocessingShape" mc:Ignorable="w14 w15 w16se w16cid w16 w16cex w16sdtdh w16sdtfl w16du wp14">
+<w:footnotes xmlns:wpc="http://schemas.microsoft.com/office/word/2010/wordprocessingCanvas" xmlns:cx="http://schemas.microsoft.com/office/drawing/2014/chartex" xmlns:cx1="http://schemas.microsoft.com/office/drawing/2015/9/8/chartex" xmlns:cx2="http://schemas.microsoft.com/office/drawing/2015/10/21/chartex" xmlns:cx3="http://schemas.microsoft.com/office/drawing/2016/5/9/chartex" xmlns:cx4="http://schemas.microsoft.com/office/drawing/2016/5/10/chartex" xmlns:cx5="http://schemas.microsoft.com/office/drawing/2016/5/11/chartex" xmlns:cx6="http://schemas.microsoft.com/office/drawing/2016/5/12/chartex" xmlns:cx7="http://schemas.microsoft.com/office/drawing/2016/5/13/chartex" xmlns:cx8="http://schemas.microsoft.com/office/drawing/2016/5/14/chartex" xmlns:mc="http://schemas.openxmlformats.org/markup-compatibility/2006" xmlns:aink="http://schemas.microsoft.com/office/drawing/2016/ink" xmlns:am3d="http://schemas.microsoft.com/office/drawing/2017/model3d" xmlns:o="urn:schemas-microsoft-com:office:office" xmlns:oel="http://schemas.microsoft.com/office/2019/extlst" xmlns:r="http://schemas.openxmlformats.org/officeDocument/2006/relationships" xmlns:m="http://schemas.openxmlformats.org/officeDocument/2006/math" xmlns:v="urn:schemas-microsoft-com:vml" xmlns:wp14="http://schemas.microsoft.com/office/word/2010/wordprocessingDrawing" xmlns:wp="http://schemas.openxmlformats.org/drawingml/2006/wordprocessingDrawing" xmlns:w10="urn:schemas-microsoft-com:office:word" xmlns:w="http://schemas.openxmlformats.org/wordprocessingml/2006/main" xmlns:w14="http://schemas.microsoft.com/office/word/2010/wordml" xmlns:w15="http://schemas.microsoft.com/office/word/2012/wordml" xmlns:w16cex="http://schemas.microsoft.com/office/word/2018/wordml/cex" xmlns:w16cid="http://schemas.microsoft.com/office/word/2016/wordml/cid" xmlns:w16="http://schemas.microsoft.com/office/word/2018/wordml" xmlns:w16du="http://schemas.microsoft.com/office/word/2023/wordml/word16du" xmlns:w16sdtdh="http://schemas.microsoft.com/office/word/2020/wordml/sdtdatahash" xmlns:w16sdtfl="http://schemas.microsoft.com/office/word/2024/wordml/sdtformatlock" xmlns:w16se="http://schemas.microsoft.com/office/word/2015/wordml/symex" xmlns:wpg="http://schemas.microsoft.com/office/word/2010/wordprocessingGroup" xmlns:wpi="http://schemas.microsoft.com/office/word/2010/wordprocessingInk" xmlns:wne="http://schemas.microsoft.com/office/word/2006/wordml" xmlns:wps="http://schemas.microsoft.com/office/word/2010/wordprocessingShape" mc:Ignorable="w14 w15 w16se w16cid w16 w16cex w16sdtdh w16sdtfl w16du wp14">
   <w:footnote w:type="separator" w:id="-1">
     <w:p>
       <w:pPr>
@@ -1755,7 +6235,7 @@
 </file>
 
 <file path=word/header1.xml><?xml version="1.0" encoding="utf-8"?>
-<w:hdr xmlns:wpc="http://schemas.microsoft.com/office/word/2010/wordprocessingCanvas" xmlns:cx="http://schemas.microsoft.com/office/drawing/2014/chartex" xmlns:cx1="http://schemas.microsoft.com/office/drawing/2015/9/8/chartex" xmlns:cx2="http://schemas.microsoft.com/office/drawing/2015/10/21/chartex" xmlns:cx3="http://schemas.microsoft.com/office/drawing/2016/5/9/chartex" xmlns:cx4="http://schemas.microsoft.com/office/drawing/2016/5/10/chartex" xmlns:cx5="http://schemas.microsoft.com/office/drawing/2016/5/11/chartex" xmlns:cx6="http://schemas.microsoft.com/office/drawing/2016/5/12/chartex" xmlns:cx7="http://schemas.microsoft.com/office/drawing/2016/5/13/chartex" xmlns:cx8="http://schemas.microsoft.com/office/drawing/2016/5/14/chartex" xmlns:mc="http://schemas.openxmlformats.org/markup-compatibility/2006" xmlns:aink="http://schemas.microsoft.com/office/drawing/2016/ink" xmlns:am3d="http://schemas.microsoft.com/office/drawing/2017/model3d" xmlns:o="urn:schemas-microsoft-com:office:office" xmlns:oel="http://schemas.microsoft.com/office/2019/extlst" xmlns:r="http://schemas.openxmlformats.org/officeDocument/2006/relationships" xmlns:m="http://schemas.openxmlformats.org/officeDocument/2006/math" xmlns:v="urn:schemas-microsoft-com:vml" xmlns:wp14="http://schemas.microsoft.com/office/word/2010/wordprocessingDrawing" xmlns:wp="http://schemas.openxmlformats.org/drawingml/2006/wordprocessingDrawing" xmlns:w10="urn:schemas-microsoft-com:office:word" xmlns:w="http://schemas.openxmlformats.org/wordprocessingml/2006/main" xmlns:w14="http://schemas.microsoft.com/office/word/2010/wordml" xmlns:w15="http://schemas.microsoft.com/office/word/2012/wordml" xmlns:w16cei="http://schemas.microsoft.com/office/word/2026/wordml/cei" xmlns:w16cex="http://schemas.microsoft.com/office/word/2018/wordml/cex" xmlns:w16cid="http://schemas.microsoft.com/office/word/2016/wordml/cid" xmlns:w16="http://schemas.microsoft.com/office/word/2018/wordml" xmlns:w16du="http://schemas.microsoft.com/office/word/2023/wordml/word16du" xmlns:w16sdtdh="http://schemas.microsoft.com/office/word/2020/wordml/sdtdatahash" xmlns:w16sdtfl="http://schemas.microsoft.com/office/word/2024/wordml/sdtformatlock" xmlns:w16se="http://schemas.microsoft.com/office/word/2015/wordml/symex" xmlns:wpg="http://schemas.microsoft.com/office/word/2010/wordprocessingGroup" xmlns:wpi="http://schemas.microsoft.com/office/word/2010/wordprocessingInk" xmlns:wne="http://schemas.microsoft.com/office/word/2006/wordml" xmlns:wps="http://schemas.microsoft.com/office/word/2010/wordprocessingShape" mc:Ignorable="w14 w15 w16se w16cid w16 w16cex w16sdtdh w16sdtfl w16du wp14">
+<w:hdr xmlns:wpc="http://schemas.microsoft.com/office/word/2010/wordprocessingCanvas" xmlns:cx="http://schemas.microsoft.com/office/drawing/2014/chartex" xmlns:cx1="http://schemas.microsoft.com/office/drawing/2015/9/8/chartex" xmlns:cx2="http://schemas.microsoft.com/office/drawing/2015/10/21/chartex" xmlns:cx3="http://schemas.microsoft.com/office/drawing/2016/5/9/chartex" xmlns:cx4="http://schemas.microsoft.com/office/drawing/2016/5/10/chartex" xmlns:cx5="http://schemas.microsoft.com/office/drawing/2016/5/11/chartex" xmlns:cx6="http://schemas.microsoft.com/office/drawing/2016/5/12/chartex" xmlns:cx7="http://schemas.microsoft.com/office/drawing/2016/5/13/chartex" xmlns:cx8="http://schemas.microsoft.com/office/drawing/2016/5/14/chartex" xmlns:mc="http://schemas.openxmlformats.org/markup-compatibility/2006" xmlns:aink="http://schemas.microsoft.com/office/drawing/2016/ink" xmlns:am3d="http://schemas.microsoft.com/office/drawing/2017/model3d" xmlns:o="urn:schemas-microsoft-com:office:office" xmlns:oel="http://schemas.microsoft.com/office/2019/extlst" xmlns:r="http://schemas.openxmlformats.org/officeDocument/2006/relationships" xmlns:m="http://schemas.openxmlformats.org/officeDocument/2006/math" xmlns:v="urn:schemas-microsoft-com:vml" xmlns:wp14="http://schemas.microsoft.com/office/word/2010/wordprocessingDrawing" xmlns:wp="http://schemas.openxmlformats.org/drawingml/2006/wordprocessingDrawing" xmlns:w10="urn:schemas-microsoft-com:office:word" xmlns:w="http://schemas.openxmlformats.org/wordprocessingml/2006/main" xmlns:w14="http://schemas.microsoft.com/office/word/2010/wordml" xmlns:w15="http://schemas.microsoft.com/office/word/2012/wordml" xmlns:w16cex="http://schemas.microsoft.com/office/word/2018/wordml/cex" xmlns:w16cid="http://schemas.microsoft.com/office/word/2016/wordml/cid" xmlns:w16="http://schemas.microsoft.com/office/word/2018/wordml" xmlns:w16du="http://schemas.microsoft.com/office/word/2023/wordml/word16du" xmlns:w16sdtdh="http://schemas.microsoft.com/office/word/2020/wordml/sdtdatahash" xmlns:w16sdtfl="http://schemas.microsoft.com/office/word/2024/wordml/sdtformatlock" xmlns:w16se="http://schemas.microsoft.com/office/word/2015/wordml/symex" xmlns:wpg="http://schemas.microsoft.com/office/word/2010/wordprocessingGroup" xmlns:wpi="http://schemas.microsoft.com/office/word/2010/wordprocessingInk" xmlns:wne="http://schemas.microsoft.com/office/word/2006/wordml" xmlns:wps="http://schemas.microsoft.com/office/word/2010/wordprocessingShape" mc:Ignorable="w14 w15 w16se w16cid w16 w16cex w16sdtdh w16sdtfl w16du wp14">
   <w:sdt>
     <w:sdtPr>
       <w:rPr>
@@ -1837,7 +6317,7 @@
 </file>
 
 <file path=word/numbering.xml><?xml version="1.0" encoding="utf-8"?>
-<w:numbering xmlns:wpc="http://schemas.microsoft.com/office/word/2010/wordprocessingCanvas" xmlns:cx="http://schemas.microsoft.com/office/drawing/2014/chartex" xmlns:cx1="http://schemas.microsoft.com/office/drawing/2015/9/8/chartex" xmlns:cx2="http://schemas.microsoft.com/office/drawing/2015/10/21/chartex" xmlns:cx3="http://schemas.microsoft.com/office/drawing/2016/5/9/chartex" xmlns:cx4="http://schemas.microsoft.com/office/drawing/2016/5/10/chartex" xmlns:cx5="http://schemas.microsoft.com/office/drawing/2016/5/11/chartex" xmlns:cx6="http://schemas.microsoft.com/office/drawing/2016/5/12/chartex" xmlns:cx7="http://schemas.microsoft.com/office/drawing/2016/5/13/chartex" xmlns:cx8="http://schemas.microsoft.com/office/drawing/2016/5/14/chartex" xmlns:mc="http://schemas.openxmlformats.org/markup-compatibility/2006" xmlns:aink="http://schemas.microsoft.com/office/drawing/2016/ink" xmlns:am3d="http://schemas.microsoft.com/office/drawing/2017/model3d" xmlns:o="urn:schemas-microsoft-com:office:office" xmlns:oel="http://schemas.microsoft.com/office/2019/extlst" xmlns:r="http://schemas.openxmlformats.org/officeDocument/2006/relationships" xmlns:m="http://schemas.openxmlformats.org/officeDocument/2006/math" xmlns:v="urn:schemas-microsoft-com:vml" xmlns:wp14="http://schemas.microsoft.com/office/word/2010/wordprocessingDrawing" xmlns:wp="http://schemas.openxmlformats.org/drawingml/2006/wordprocessingDrawing" xmlns:w10="urn:schemas-microsoft-com:office:word" xmlns:w="http://schemas.openxmlformats.org/wordprocessingml/2006/main" xmlns:w14="http://schemas.microsoft.com/office/word/2010/wordml" xmlns:w15="http://schemas.microsoft.com/office/word/2012/wordml" xmlns:w16cei="http://schemas.microsoft.com/office/word/2026/wordml/cei" xmlns:w16cex="http://schemas.microsoft.com/office/word/2018/wordml/cex" xmlns:w16cid="http://schemas.microsoft.com/office/word/2016/wordml/cid" xmlns:w16="http://schemas.microsoft.com/office/word/2018/wordml" xmlns:w16du="http://schemas.microsoft.com/office/word/2023/wordml/word16du" xmlns:w16sdtdh="http://schemas.microsoft.com/office/word/2020/wordml/sdtdatahash" xmlns:w16sdtfl="http://schemas.microsoft.com/office/word/2024/wordml/sdtformatlock" xmlns:w16se="http://schemas.microsoft.com/office/word/2015/wordml/symex" xmlns:wpg="http://schemas.microsoft.com/office/word/2010/wordprocessingGroup" xmlns:wpi="http://schemas.microsoft.com/office/word/2010/wordprocessingInk" xmlns:wne="http://schemas.microsoft.com/office/word/2006/wordml" xmlns:wps="http://schemas.microsoft.com/office/word/2010/wordprocessingShape" mc:Ignorable="w14 w15 w16se w16cid w16 w16cex w16sdtdh w16sdtfl w16du wp14">
+<w:numbering xmlns:wpc="http://schemas.microsoft.com/office/word/2010/wordprocessingCanvas" xmlns:cx="http://schemas.microsoft.com/office/drawing/2014/chartex" xmlns:cx1="http://schemas.microsoft.com/office/drawing/2015/9/8/chartex" xmlns:cx2="http://schemas.microsoft.com/office/drawing/2015/10/21/chartex" xmlns:cx3="http://schemas.microsoft.com/office/drawing/2016/5/9/chartex" xmlns:cx4="http://schemas.microsoft.com/office/drawing/2016/5/10/chartex" xmlns:cx5="http://schemas.microsoft.com/office/drawing/2016/5/11/chartex" xmlns:cx6="http://schemas.microsoft.com/office/drawing/2016/5/12/chartex" xmlns:cx7="http://schemas.microsoft.com/office/drawing/2016/5/13/chartex" xmlns:cx8="http://schemas.microsoft.com/office/drawing/2016/5/14/chartex" xmlns:mc="http://schemas.openxmlformats.org/markup-compatibility/2006" xmlns:aink="http://schemas.microsoft.com/office/drawing/2016/ink" xmlns:am3d="http://schemas.microsoft.com/office/drawing/2017/model3d" xmlns:o="urn:schemas-microsoft-com:office:office" xmlns:oel="http://schemas.microsoft.com/office/2019/extlst" xmlns:r="http://schemas.openxmlformats.org/officeDocument/2006/relationships" xmlns:m="http://schemas.openxmlformats.org/officeDocument/2006/math" xmlns:v="urn:schemas-microsoft-com:vml" xmlns:wp14="http://schemas.microsoft.com/office/word/2010/wordprocessingDrawing" xmlns:wp="http://schemas.openxmlformats.org/drawingml/2006/wordprocessingDrawing" xmlns:w10="urn:schemas-microsoft-com:office:word" xmlns:w="http://schemas.openxmlformats.org/wordprocessingml/2006/main" xmlns:w14="http://schemas.microsoft.com/office/word/2010/wordml" xmlns:w15="http://schemas.microsoft.com/office/word/2012/wordml" xmlns:w16cex="http://schemas.microsoft.com/office/word/2018/wordml/cex" xmlns:w16cid="http://schemas.microsoft.com/office/word/2016/wordml/cid" xmlns:w16="http://schemas.microsoft.com/office/word/2018/wordml" xmlns:w16du="http://schemas.microsoft.com/office/word/2023/wordml/word16du" xmlns:w16sdtdh="http://schemas.microsoft.com/office/word/2020/wordml/sdtdatahash" xmlns:w16sdtfl="http://schemas.microsoft.com/office/word/2024/wordml/sdtformatlock" xmlns:w16se="http://schemas.microsoft.com/office/word/2015/wordml/symex" xmlns:wpg="http://schemas.microsoft.com/office/word/2010/wordprocessingGroup" xmlns:wpi="http://schemas.microsoft.com/office/word/2010/wordprocessingInk" xmlns:wne="http://schemas.microsoft.com/office/word/2006/wordml" xmlns:wps="http://schemas.microsoft.com/office/word/2010/wordprocessingShape" mc:Ignorable="w14 w15 w16se w16cid w16 w16cex w16sdtdh w16sdtfl w16du wp14">
   <w:abstractNum w:abstractNumId="0" w15:restartNumberingAfterBreak="0">
     <w:nsid w:val="000208B1"/>
     <w:multiLevelType w:val="hybridMultilevel"/>

</xml_diff>

<commit_message>
feat: complete native SMA, RSI, Linear Regression, and custom Merge Sort engine
</commit_message>
<xml_diff>
--- a/docs/Financial_stock_analysis_system.docx
+++ b/docs/Financial_stock_analysis_system.docx
@@ -3,7 +3,21 @@
 <w:document xmlns:wpc="http://schemas.microsoft.com/office/word/2010/wordprocessingCanvas" xmlns:cx="http://schemas.microsoft.com/office/drawing/2014/chartex" xmlns:cx1="http://schemas.microsoft.com/office/drawing/2015/9/8/chartex" xmlns:cx2="http://schemas.microsoft.com/office/drawing/2015/10/21/chartex" xmlns:cx3="http://schemas.microsoft.com/office/drawing/2016/5/9/chartex" xmlns:cx4="http://schemas.microsoft.com/office/drawing/2016/5/10/chartex" xmlns:cx5="http://schemas.microsoft.com/office/drawing/2016/5/11/chartex" xmlns:cx6="http://schemas.microsoft.com/office/drawing/2016/5/12/chartex" xmlns:cx7="http://schemas.microsoft.com/office/drawing/2016/5/13/chartex" xmlns:cx8="http://schemas.microsoft.com/office/drawing/2016/5/14/chartex" xmlns:mc="http://schemas.openxmlformats.org/markup-compatibility/2006" xmlns:aink="http://schemas.microsoft.com/office/drawing/2016/ink" xmlns:am3d="http://schemas.microsoft.com/office/drawing/2017/model3d" xmlns:o="urn:schemas-microsoft-com:office:office" xmlns:oel="http://schemas.microsoft.com/office/2019/extlst" xmlns:r="http://schemas.openxmlformats.org/officeDocument/2006/relationships" xmlns:m="http://schemas.openxmlformats.org/officeDocument/2006/math" xmlns:v="urn:schemas-microsoft-com:vml" xmlns:wp14="http://schemas.microsoft.com/office/word/2010/wordprocessingDrawing" xmlns:wp="http://schemas.openxmlformats.org/drawingml/2006/wordprocessingDrawing" xmlns:w10="urn:schemas-microsoft-com:office:word" xmlns:w="http://schemas.openxmlformats.org/wordprocessingml/2006/main" xmlns:w14="http://schemas.microsoft.com/office/word/2010/wordml" xmlns:w15="http://schemas.microsoft.com/office/word/2012/wordml" xmlns:w16cex="http://schemas.microsoft.com/office/word/2018/wordml/cex" xmlns:w16cid="http://schemas.microsoft.com/office/word/2016/wordml/cid" xmlns:w16="http://schemas.microsoft.com/office/word/2018/wordml" xmlns:w16du="http://schemas.microsoft.com/office/word/2023/wordml/word16du" xmlns:w16sdtdh="http://schemas.microsoft.com/office/word/2020/wordml/sdtdatahash" xmlns:w16sdtfl="http://schemas.microsoft.com/office/word/2024/wordml/sdtformatlock" xmlns:w16se="http://schemas.microsoft.com/office/word/2015/wordml/symex" xmlns:wpg="http://schemas.microsoft.com/office/word/2010/wordprocessingGroup" xmlns:wpi="http://schemas.microsoft.com/office/word/2010/wordprocessingInk" xmlns:wne="http://schemas.microsoft.com/office/word/2006/wordml" xmlns:wps="http://schemas.microsoft.com/office/word/2010/wordprocessingShape" mc:Ignorable="w14 w15 w16se w16cid w16 w16cex w16sdtdh w16sdtfl w16du wp14">
   <w:body>
     <w:p>
-      <w:r>
+      <w:pPr>
+        <w:rPr>
+          <w:b/>
+          <w:bCs/>
+          <w:sz w:val="28"/>
+          <w:szCs w:val="28"/>
+        </w:rPr>
+      </w:pPr>
+      <w:r>
+        <w:rPr>
+          <w:b/>
+          <w:bCs/>
+          <w:sz w:val="28"/>
+          <w:szCs w:val="28"/>
+        </w:rPr>
         <w:t>Section 3.1 Analysis</w:t>
       </w:r>
     </w:p>
@@ -21,13 +35,11 @@
       <w:r>
         <w:t>To solve this, I am building a self-contained Financial Stock Analytics &amp; Forecasting System. My goal is to create a web application that pulls live stock market data, calculates custom forecasting metrics (like Linear Regression, RSI, and SMA) purely in Python without third-party math packages, and presents visual predictions on an interactive dashboard.</w:t>
       </w:r>
+    </w:p>
+    <w:p/>
+    <w:p>
       <w:r>
         <w:t>3.1.2 Stakeholder Analysis &amp; Requirements</w:t>
-      </w:r>
-    </w:p>
-    <w:p>
-      <w:r>
-        <w:t xml:space="preserve"> </w:t>
       </w:r>
     </w:p>
     <w:p>
@@ -145,6 +157,18 @@
         <w:t>Automatic email notifications whenever a stock reaches a specified threshold.</w:t>
       </w:r>
     </w:p>
+    <w:p>
+      <w:pPr>
+        <w:pStyle w:val="ListParagraph"/>
+        <w:numPr>
+          <w:ilvl w:val="0"/>
+          <w:numId w:val="2"/>
+        </w:numPr>
+      </w:pPr>
+      <w:r>
+        <w:t>Quick-glance market leaderboard highlighting the Top 5 performing stocks ranked by daily percentage gain using a custom, transparent sorting algorithm.</w:t>
+      </w:r>
+    </w:p>
     <w:p/>
     <w:p>
       <w:r>
@@ -180,15 +204,7 @@
         </w:numPr>
       </w:pPr>
       <w:r>
-        <w:t xml:space="preserve">Data Parser: Fetches stock data from an external API using Python’s native </w:t>
-      </w:r>
-      <w:proofErr w:type="spellStart"/>
-      <w:r>
-        <w:t>urllib</w:t>
-      </w:r>
-      <w:proofErr w:type="spellEnd"/>
-      <w:r>
-        <w:t xml:space="preserve"> library and converts raw JSON responses into Python dictionaries.</w:t>
+        <w:t>Data Parser: Fetches stock data from an external API using Python’s native urllib library and converts raw JSON responses into Python dictionaries.</w:t>
       </w:r>
     </w:p>
     <w:p>
@@ -212,6 +228,7 @@
         </w:numPr>
       </w:pPr>
       <w:r>
+        <w:lastRenderedPageBreak/>
         <w:t>Background Alert Engine: Runs a non-blocking background thread (</w:t>
       </w:r>
       <w:proofErr w:type="spellStart"/>
@@ -234,20 +251,22 @@
         </w:numPr>
       </w:pPr>
       <w:r>
-        <w:lastRenderedPageBreak/>
         <w:t>Database &amp; Interface: Manages a 3NF SQLite database and renders dynamic web pages using Jinja2 templates and Chart.js.</w:t>
       </w:r>
     </w:p>
     <w:p>
+      <w:pPr>
+        <w:jc w:val="center"/>
+      </w:pPr>
       <w:r>
         <w:rPr>
           <w:noProof/>
         </w:rPr>
         <w:drawing>
-          <wp:inline distT="0" distB="0" distL="0" distR="0" wp14:anchorId="65A9E788" wp14:editId="5D662357">
-            <wp:extent cx="5731510" cy="3564255"/>
-            <wp:effectExtent l="0" t="0" r="2540" b="0"/>
-            <wp:docPr id="1072181707" name="Picture 2"/>
+          <wp:inline distT="0" distB="0" distL="0" distR="0" wp14:anchorId="7602D684" wp14:editId="6746A628">
+            <wp:extent cx="5731510" cy="3553460"/>
+            <wp:effectExtent l="152400" t="152400" r="364490" b="370840"/>
+            <wp:docPr id="1287577338" name="Picture 4"/>
             <wp:cNvGraphicFramePr>
               <a:graphicFrameLocks xmlns:a="http://schemas.openxmlformats.org/drawingml/2006/main" noChangeAspect="1"/>
             </wp:cNvGraphicFramePr>
@@ -255,7 +274,7 @@
               <a:graphicData uri="http://schemas.openxmlformats.org/drawingml/2006/picture">
                 <pic:pic xmlns:pic="http://schemas.openxmlformats.org/drawingml/2006/picture">
                   <pic:nvPicPr>
-                    <pic:cNvPr id="1072181707" name="Picture 1072181707"/>
+                    <pic:cNvPr id="1287577338" name="Picture 1287577338"/>
                     <pic:cNvPicPr/>
                   </pic:nvPicPr>
                   <pic:blipFill>
@@ -273,11 +292,21 @@
                   <pic:spPr>
                     <a:xfrm>
                       <a:off x="0" y="0"/>
-                      <a:ext cx="5731510" cy="3564255"/>
+                      <a:ext cx="5731510" cy="3553460"/>
                     </a:xfrm>
                     <a:prstGeom prst="rect">
                       <a:avLst/>
                     </a:prstGeom>
+                    <a:ln>
+                      <a:noFill/>
+                    </a:ln>
+                    <a:effectLst>
+                      <a:outerShdw blurRad="292100" dist="139700" dir="2700000" algn="tl" rotWithShape="0">
+                        <a:srgbClr val="333333">
+                          <a:alpha val="65000"/>
+                        </a:srgbClr>
+                      </a:outerShdw>
+                    </a:effectLst>
                   </pic:spPr>
                 </pic:pic>
               </a:graphicData>
@@ -344,8 +373,14 @@
       </w:r>
     </w:p>
     <w:p/>
-    <w:p>
-      <w:r>
+    <w:p/>
+    <w:p/>
+    <w:p/>
+    <w:p/>
+    <w:p/>
+    <w:p>
+      <w:r>
+        <w:lastRenderedPageBreak/>
         <w:t>3.1.5</w:t>
       </w:r>
       <w:r>
@@ -373,7 +408,17 @@
             <w:tcW w:w="988" w:type="dxa"/>
           </w:tcPr>
           <w:p>
-            <w:r>
+            <w:pPr>
+              <w:rPr>
+                <w:b/>
+                <w:bCs/>
+              </w:rPr>
+            </w:pPr>
+            <w:r>
+              <w:rPr>
+                <w:b/>
+                <w:bCs/>
+              </w:rPr>
               <w:t>ID</w:t>
             </w:r>
           </w:p>
@@ -383,7 +428,17 @@
             <w:tcW w:w="1984" w:type="dxa"/>
           </w:tcPr>
           <w:p>
-            <w:r>
+            <w:pPr>
+              <w:rPr>
+                <w:b/>
+                <w:bCs/>
+              </w:rPr>
+            </w:pPr>
+            <w:r>
+              <w:rPr>
+                <w:b/>
+                <w:bCs/>
+              </w:rPr>
               <w:t>Goal</w:t>
             </w:r>
           </w:p>
@@ -393,7 +448,17 @@
             <w:tcW w:w="2977" w:type="dxa"/>
           </w:tcPr>
           <w:p>
-            <w:r>
+            <w:pPr>
+              <w:rPr>
+                <w:b/>
+                <w:bCs/>
+              </w:rPr>
+            </w:pPr>
+            <w:r>
+              <w:rPr>
+                <w:b/>
+                <w:bCs/>
+              </w:rPr>
               <w:t>Description</w:t>
             </w:r>
           </w:p>
@@ -403,7 +468,17 @@
             <w:tcW w:w="3067" w:type="dxa"/>
           </w:tcPr>
           <w:p>
-            <w:r>
+            <w:pPr>
+              <w:rPr>
+                <w:b/>
+                <w:bCs/>
+              </w:rPr>
+            </w:pPr>
+            <w:r>
+              <w:rPr>
+                <w:b/>
+                <w:bCs/>
+              </w:rPr>
               <w:t>How It Will Be Tested</w:t>
             </w:r>
           </w:p>
@@ -481,15 +556,7 @@
           </w:tcPr>
           <w:p>
             <w:r>
-              <w:t xml:space="preserve">Fetch and process API JSON payload using native </w:t>
-            </w:r>
-            <w:proofErr w:type="spellStart"/>
-            <w:r>
-              <w:t>urllib</w:t>
-            </w:r>
-            <w:proofErr w:type="spellEnd"/>
-            <w:r>
-              <w:t xml:space="preserve"> in under 500ms.</w:t>
+              <w:t>Fetch and process API JSON payload using native urllib in under 500ms.</w:t>
             </w:r>
           </w:p>
         </w:tc>
@@ -499,28 +566,7 @@
           </w:tcPr>
           <w:p>
             <w:r>
-              <w:t xml:space="preserve">Measure API call execution time with </w:t>
-            </w:r>
-            <w:proofErr w:type="spellStart"/>
-            <w:proofErr w:type="gramStart"/>
-            <w:r>
-              <w:t>time.perf</w:t>
-            </w:r>
-            <w:proofErr w:type="gramEnd"/>
-            <w:r>
-              <w:t>_</w:t>
-            </w:r>
-            <w:proofErr w:type="gramStart"/>
-            <w:r>
-              <w:t>counter</w:t>
-            </w:r>
-            <w:proofErr w:type="spellEnd"/>
-            <w:r>
-              <w:t>(</w:t>
-            </w:r>
-            <w:proofErr w:type="gramEnd"/>
-            <w:r>
-              <w:t>)</w:t>
+              <w:t>Measure API call execution time with time.perf_counter()</w:t>
             </w:r>
           </w:p>
         </w:tc>
@@ -577,7 +623,6 @@
           </w:tcPr>
           <w:p>
             <w:r>
-              <w:lastRenderedPageBreak/>
               <w:t>SC</w:t>
             </w:r>
             <w:r>
@@ -702,6 +747,48 @@
           <w:p>
             <w:r>
               <w:t>Trigger price alert threshold and verify email arrival in inbox.</w:t>
+            </w:r>
+          </w:p>
+        </w:tc>
+      </w:tr>
+      <w:tr>
+        <w:tc>
+          <w:tcPr>
+            <w:tcW w:w="988" w:type="dxa"/>
+          </w:tcPr>
+          <w:p>
+            <w:r>
+              <w:t>SC7</w:t>
+            </w:r>
+          </w:p>
+        </w:tc>
+        <w:tc>
+          <w:tcPr>
+            <w:tcW w:w="1984" w:type="dxa"/>
+          </w:tcPr>
+          <w:p>
+            <w:r>
+              <w:t>Custom Sorting Engine</w:t>
+            </w:r>
+          </w:p>
+        </w:tc>
+        <w:tc>
+          <w:tcPr>
+            <w:tcW w:w="2977" w:type="dxa"/>
+          </w:tcPr>
+          <w:p>
+            <w:r>
+              <w:t>Rank a basket of market equities by daily percentage return using a hand-coded O(N log N) Merge Sort algorithm in pure Python.</w:t>
+            </w:r>
+          </w:p>
+        </w:tc>
+        <w:tc>
+          <w:tcPr>
+            <w:tcW w:w="3067" w:type="dxa"/>
+          </w:tcPr>
+          <w:p>
+            <w:r>
+              <w:t>Pass an unsorted array of equity returns to the sorting module and verify descending output order against a manual sort.</w:t>
             </w:r>
           </w:p>
         </w:tc>
@@ -710,7 +797,21 @@
     <w:p/>
     <w:p/>
     <w:p>
-      <w:r>
+      <w:pPr>
+        <w:rPr>
+          <w:b/>
+          <w:bCs/>
+          <w:sz w:val="28"/>
+          <w:szCs w:val="28"/>
+        </w:rPr>
+      </w:pPr>
+      <w:r>
+        <w:rPr>
+          <w:b/>
+          <w:bCs/>
+          <w:sz w:val="28"/>
+          <w:szCs w:val="28"/>
+        </w:rPr>
         <w:t>Section 3.2 Systems Design</w:t>
       </w:r>
     </w:p>
@@ -754,6 +855,7 @@
     <w:p/>
     <w:p>
       <w:r>
+        <w:lastRenderedPageBreak/>
         <w:t>2NF (Second Normal Form): Since all tables use single-column primary keys rather than composite keys, every non-key column depends completely on the primary key. This removes any partial dependencies.</w:t>
       </w:r>
     </w:p>
@@ -800,7 +902,17 @@
             <w:tcW w:w="1696" w:type="dxa"/>
           </w:tcPr>
           <w:p>
-            <w:r>
+            <w:pPr>
+              <w:rPr>
+                <w:b/>
+                <w:bCs/>
+              </w:rPr>
+            </w:pPr>
+            <w:r>
+              <w:rPr>
+                <w:b/>
+                <w:bCs/>
+              </w:rPr>
               <w:t>Field name</w:t>
             </w:r>
           </w:p>
@@ -810,7 +922,17 @@
             <w:tcW w:w="1985" w:type="dxa"/>
           </w:tcPr>
           <w:p>
-            <w:r>
+            <w:pPr>
+              <w:rPr>
+                <w:b/>
+                <w:bCs/>
+              </w:rPr>
+            </w:pPr>
+            <w:r>
+              <w:rPr>
+                <w:b/>
+                <w:bCs/>
+              </w:rPr>
               <w:t>Data Type</w:t>
             </w:r>
           </w:p>
@@ -820,7 +942,17 @@
             <w:tcW w:w="2268" w:type="dxa"/>
           </w:tcPr>
           <w:p>
-            <w:r>
+            <w:pPr>
+              <w:rPr>
+                <w:b/>
+                <w:bCs/>
+              </w:rPr>
+            </w:pPr>
+            <w:r>
+              <w:rPr>
+                <w:b/>
+                <w:bCs/>
+              </w:rPr>
               <w:t>Key Type</w:t>
             </w:r>
           </w:p>
@@ -830,13 +962,31 @@
             <w:tcW w:w="3067" w:type="dxa"/>
           </w:tcPr>
           <w:p>
-            <w:r>
+            <w:pPr>
+              <w:rPr>
+                <w:b/>
+                <w:bCs/>
+              </w:rPr>
+            </w:pPr>
+            <w:r>
+              <w:rPr>
+                <w:b/>
+                <w:bCs/>
+              </w:rPr>
               <w:t>Validation Rule</w:t>
             </w:r>
             <w:r>
+              <w:rPr>
+                <w:b/>
+                <w:bCs/>
+              </w:rPr>
               <w:t>/</w:t>
             </w:r>
             <w:r>
+              <w:rPr>
+                <w:b/>
+                <w:bCs/>
+              </w:rPr>
               <w:t>Constraints</w:t>
             </w:r>
           </w:p>
@@ -848,11 +998,9 @@
             <w:tcW w:w="1696" w:type="dxa"/>
           </w:tcPr>
           <w:p>
-            <w:proofErr w:type="spellStart"/>
             <w:r>
               <w:t>user_id</w:t>
             </w:r>
-            <w:proofErr w:type="spellEnd"/>
           </w:p>
         </w:tc>
         <w:tc>
@@ -936,7 +1084,6 @@
           <w:p>
             <w:proofErr w:type="spellStart"/>
             <w:r>
-              <w:lastRenderedPageBreak/>
               <w:t>password_hash</w:t>
             </w:r>
             <w:proofErr w:type="spellEnd"/>
@@ -1144,7 +1291,17 @@
             <w:tcW w:w="1696" w:type="dxa"/>
           </w:tcPr>
           <w:p>
-            <w:r>
+            <w:pPr>
+              <w:rPr>
+                <w:b/>
+                <w:bCs/>
+              </w:rPr>
+            </w:pPr>
+            <w:r>
+              <w:rPr>
+                <w:b/>
+                <w:bCs/>
+              </w:rPr>
               <w:t>Field name</w:t>
             </w:r>
           </w:p>
@@ -1154,7 +1311,17 @@
             <w:tcW w:w="1985" w:type="dxa"/>
           </w:tcPr>
           <w:p>
-            <w:r>
+            <w:pPr>
+              <w:rPr>
+                <w:b/>
+                <w:bCs/>
+              </w:rPr>
+            </w:pPr>
+            <w:r>
+              <w:rPr>
+                <w:b/>
+                <w:bCs/>
+              </w:rPr>
               <w:t>Data Type</w:t>
             </w:r>
           </w:p>
@@ -1164,7 +1331,17 @@
             <w:tcW w:w="2268" w:type="dxa"/>
           </w:tcPr>
           <w:p>
-            <w:r>
+            <w:pPr>
+              <w:rPr>
+                <w:b/>
+                <w:bCs/>
+              </w:rPr>
+            </w:pPr>
+            <w:r>
+              <w:rPr>
+                <w:b/>
+                <w:bCs/>
+              </w:rPr>
               <w:t>Key Type</w:t>
             </w:r>
           </w:p>
@@ -1174,7 +1351,17 @@
             <w:tcW w:w="3067" w:type="dxa"/>
           </w:tcPr>
           <w:p>
-            <w:r>
+            <w:pPr>
+              <w:rPr>
+                <w:b/>
+                <w:bCs/>
+              </w:rPr>
+            </w:pPr>
+            <w:r>
+              <w:rPr>
+                <w:b/>
+                <w:bCs/>
+              </w:rPr>
               <w:t>Validation Rule/Constraints</w:t>
             </w:r>
           </w:p>
@@ -1233,7 +1420,6 @@
             <w:tcW w:w="1696" w:type="dxa"/>
           </w:tcPr>
           <w:p>
-            <w:proofErr w:type="spellStart"/>
             <w:r>
               <w:t>u</w:t>
             </w:r>
@@ -1243,7 +1429,6 @@
             <w:r>
               <w:t>r_id</w:t>
             </w:r>
-            <w:proofErr w:type="spellEnd"/>
           </w:p>
         </w:tc>
         <w:tc>
@@ -1272,15 +1457,7 @@
           </w:tcPr>
           <w:p>
             <w:r>
-              <w:t>References users(</w:t>
-            </w:r>
-            <w:proofErr w:type="spellStart"/>
-            <w:r>
-              <w:t>user_id</w:t>
-            </w:r>
-            <w:proofErr w:type="spellEnd"/>
-            <w:r>
-              <w:t>)</w:t>
+              <w:t>References users(user_id)</w:t>
             </w:r>
           </w:p>
         </w:tc>
@@ -1421,11 +1598,9 @@
             <w:tcW w:w="1696" w:type="dxa"/>
           </w:tcPr>
           <w:p>
-            <w:proofErr w:type="spellStart"/>
             <w:r>
               <w:t>is_active</w:t>
             </w:r>
-            <w:proofErr w:type="spellEnd"/>
           </w:p>
         </w:tc>
         <w:tc>
@@ -1517,14 +1692,18 @@
     </w:p>
     <w:p/>
     <w:p>
+      <w:pPr>
+        <w:jc w:val="center"/>
+      </w:pPr>
       <w:r>
         <w:rPr>
           <w:noProof/>
         </w:rPr>
+        <w:lastRenderedPageBreak/>
         <w:drawing>
-          <wp:inline distT="0" distB="0" distL="0" distR="0" wp14:anchorId="7F006907" wp14:editId="3DF0E3F6">
-            <wp:extent cx="5731510" cy="3127375"/>
-            <wp:effectExtent l="0" t="0" r="2540" b="0"/>
+          <wp:inline distT="0" distB="0" distL="0" distR="0" wp14:anchorId="7F006907" wp14:editId="3C1E5A6E">
+            <wp:extent cx="4146550" cy="2262548"/>
+            <wp:effectExtent l="152400" t="152400" r="368300" b="366395"/>
             <wp:docPr id="224626761" name="Picture 19"/>
             <wp:cNvGraphicFramePr>
               <a:graphicFrameLocks xmlns:a="http://schemas.openxmlformats.org/drawingml/2006/main" noChangeAspect="1"/>
@@ -1551,11 +1730,21 @@
                   <pic:spPr>
                     <a:xfrm>
                       <a:off x="0" y="0"/>
-                      <a:ext cx="5731510" cy="3127375"/>
+                      <a:ext cx="4163534" cy="2271815"/>
                     </a:xfrm>
                     <a:prstGeom prst="rect">
                       <a:avLst/>
                     </a:prstGeom>
+                    <a:ln>
+                      <a:noFill/>
+                    </a:ln>
+                    <a:effectLst>
+                      <a:outerShdw blurRad="292100" dist="139700" dir="2700000" algn="tl" rotWithShape="0">
+                        <a:srgbClr val="333333">
+                          <a:alpha val="65000"/>
+                        </a:srgbClr>
+                      </a:outerShdw>
+                    </a:effectLst>
                   </pic:spPr>
                 </pic:pic>
               </a:graphicData>
@@ -1573,20 +1762,22 @@
     </w:p>
     <w:p>
       <w:r>
-        <w:lastRenderedPageBreak/>
         <w:t>Login &amp; Authentication Interface (login.html): I designed a simple, functional layout for logging in and signing up. It includes an alert message area at the bottom that dynamically displays feedback, such as incorrect password warnings or a 15-minute account lockout status.</w:t>
       </w:r>
     </w:p>
     <w:p/>
     <w:p>
+      <w:pPr>
+        <w:jc w:val="center"/>
+      </w:pPr>
       <w:r>
         <w:rPr>
           <w:noProof/>
         </w:rPr>
         <w:drawing>
-          <wp:inline distT="0" distB="0" distL="0" distR="0" wp14:anchorId="076F8F8A" wp14:editId="41539110">
-            <wp:extent cx="5731510" cy="3800475"/>
-            <wp:effectExtent l="0" t="0" r="2540" b="9525"/>
+          <wp:inline distT="0" distB="0" distL="0" distR="0" wp14:anchorId="076F8F8A" wp14:editId="689520F6">
+            <wp:extent cx="3994150" cy="2648459"/>
+            <wp:effectExtent l="152400" t="152400" r="368300" b="361950"/>
             <wp:docPr id="794678900" name="Picture 20"/>
             <wp:cNvGraphicFramePr>
               <a:graphicFrameLocks xmlns:a="http://schemas.openxmlformats.org/drawingml/2006/main" noChangeAspect="1"/>
@@ -1613,11 +1804,21 @@
                   <pic:spPr>
                     <a:xfrm>
                       <a:off x="0" y="0"/>
-                      <a:ext cx="5731510" cy="3800475"/>
+                      <a:ext cx="4005795" cy="2656180"/>
                     </a:xfrm>
                     <a:prstGeom prst="rect">
                       <a:avLst/>
                     </a:prstGeom>
+                    <a:ln>
+                      <a:noFill/>
+                    </a:ln>
+                    <a:effectLst>
+                      <a:outerShdw blurRad="292100" dist="139700" dir="2700000" algn="tl" rotWithShape="0">
+                        <a:srgbClr val="333333">
+                          <a:alpha val="65000"/>
+                        </a:srgbClr>
+                      </a:outerShdw>
+                    </a:effectLst>
                   </pic:spPr>
                 </pic:pic>
               </a:graphicData>
@@ -1640,16 +1841,19 @@
       </w:r>
     </w:p>
     <w:p>
+      <w:pPr>
+        <w:jc w:val="center"/>
+      </w:pPr>
       <w:r>
         <w:rPr>
           <w:noProof/>
         </w:rPr>
         <w:lastRenderedPageBreak/>
         <w:drawing>
-          <wp:inline distT="0" distB="0" distL="0" distR="0" wp14:anchorId="7F6BD072" wp14:editId="263F7316">
-            <wp:extent cx="5731510" cy="3821007"/>
-            <wp:effectExtent l="0" t="0" r="2540" b="8255"/>
-            <wp:docPr id="155372599" name="Picture 4"/>
+          <wp:inline distT="0" distB="0" distL="0" distR="0" wp14:anchorId="52A8017B" wp14:editId="48F7E190">
+            <wp:extent cx="4457700" cy="3011639"/>
+            <wp:effectExtent l="152400" t="152400" r="361950" b="360680"/>
+            <wp:docPr id="1154403154" name="Picture 1"/>
             <wp:cNvGraphicFramePr>
               <a:graphicFrameLocks xmlns:a="http://schemas.openxmlformats.org/drawingml/2006/main" noChangeAspect="1"/>
             </wp:cNvGraphicFramePr>
@@ -1657,7 +1861,7 @@
               <a:graphicData uri="http://schemas.openxmlformats.org/drawingml/2006/picture">
                 <pic:pic xmlns:pic="http://schemas.openxmlformats.org/drawingml/2006/picture">
                   <pic:nvPicPr>
-                    <pic:cNvPr id="155372599" name="Picture 155372599"/>
+                    <pic:cNvPr id="1154403154" name="Picture 1154403154"/>
                     <pic:cNvPicPr/>
                   </pic:nvPicPr>
                   <pic:blipFill>
@@ -1675,11 +1879,21 @@
                   <pic:spPr>
                     <a:xfrm>
                       <a:off x="0" y="0"/>
-                      <a:ext cx="5731510" cy="3821007"/>
+                      <a:ext cx="4466018" cy="3017259"/>
                     </a:xfrm>
                     <a:prstGeom prst="rect">
                       <a:avLst/>
                     </a:prstGeom>
+                    <a:ln>
+                      <a:noFill/>
+                    </a:ln>
+                    <a:effectLst>
+                      <a:outerShdw blurRad="292100" dist="139700" dir="2700000" algn="tl" rotWithShape="0">
+                        <a:srgbClr val="333333">
+                          <a:alpha val="65000"/>
+                        </a:srgbClr>
+                      </a:outerShdw>
+                    </a:effectLst>
                   </pic:spPr>
                 </pic:pic>
               </a:graphicData>
@@ -1702,17 +1916,25 @@
     <w:p/>
     <w:p>
       <w:r>
+        <w:t>Algorithm Flowchart: Forecasting &amp; Technical Metrics Engine</w:t>
+      </w:r>
+    </w:p>
+    <w:p/>
+    <w:p/>
+    <w:p>
+      <w:pPr>
+        <w:jc w:val="center"/>
+      </w:pPr>
+      <w:r>
         <w:rPr>
-          <w:rFonts w:ascii="Calibri" w:hAnsi="Calibri" w:cs="Calibri"/>
           <w:noProof/>
-          <w:color w:val="000000"/>
         </w:rPr>
         <w:lastRenderedPageBreak/>
         <w:drawing>
-          <wp:inline distT="0" distB="0" distL="0" distR="0" wp14:anchorId="51F0431E" wp14:editId="1424F4CB">
-            <wp:extent cx="5731510" cy="5017135"/>
-            <wp:effectExtent l="0" t="0" r="2540" b="0"/>
-            <wp:docPr id="396399362" name="Picture 10"/>
+          <wp:inline distT="0" distB="0" distL="0" distR="0" wp14:anchorId="55291684" wp14:editId="092523E0">
+            <wp:extent cx="3416300" cy="3770688"/>
+            <wp:effectExtent l="152400" t="152400" r="336550" b="344170"/>
+            <wp:docPr id="1516540531" name="Picture 3"/>
             <wp:cNvGraphicFramePr>
               <a:graphicFrameLocks xmlns:a="http://schemas.openxmlformats.org/drawingml/2006/main" noChangeAspect="1"/>
             </wp:cNvGraphicFramePr>
@@ -1720,10 +1942,8 @@
               <a:graphicData uri="http://schemas.openxmlformats.org/drawingml/2006/picture">
                 <pic:pic xmlns:pic="http://schemas.openxmlformats.org/drawingml/2006/picture">
                   <pic:nvPicPr>
-                    <pic:cNvPr id="0" name="Picture 46"/>
-                    <pic:cNvPicPr>
-                      <a:picLocks noChangeAspect="1" noChangeArrowheads="1"/>
-                    </pic:cNvPicPr>
+                    <pic:cNvPr id="1516540531" name="Picture 1516540531"/>
+                    <pic:cNvPicPr/>
                   </pic:nvPicPr>
                   <pic:blipFill>
                     <a:blip r:embed="rId11">
@@ -1733,23 +1953,28 @@
                         </a:ext>
                       </a:extLst>
                     </a:blip>
-                    <a:srcRect/>
                     <a:stretch>
                       <a:fillRect/>
                     </a:stretch>
                   </pic:blipFill>
-                  <pic:spPr bwMode="auto">
+                  <pic:spPr>
                     <a:xfrm>
                       <a:off x="0" y="0"/>
-                      <a:ext cx="5731510" cy="5017135"/>
+                      <a:ext cx="3425145" cy="3780450"/>
                     </a:xfrm>
                     <a:prstGeom prst="rect">
                       <a:avLst/>
                     </a:prstGeom>
-                    <a:noFill/>
                     <a:ln>
                       <a:noFill/>
                     </a:ln>
+                    <a:effectLst>
+                      <a:outerShdw blurRad="292100" dist="139700" dir="2700000" algn="tl" rotWithShape="0">
+                        <a:srgbClr val="333333">
+                          <a:alpha val="65000"/>
+                        </a:srgbClr>
+                      </a:outerShdw>
+                    </a:effectLst>
                   </pic:spPr>
                 </pic:pic>
               </a:graphicData>
@@ -1759,6 +1984,12 @@
       </w:r>
     </w:p>
     <w:p/>
+    <w:p/>
+    <w:p/>
+    <w:p/>
+    <w:p/>
+    <w:p/>
+    <w:p/>
     <w:p>
       <w:r>
         <w:t>Algorithm 1: 7-Day Linear Regression Forecasting (y = mx + c)</w:t>
@@ -1770,6 +2001,9 @@
       </w:r>
     </w:p>
     <w:p>
+      <w:pPr>
+        <w:jc w:val="center"/>
+      </w:pPr>
       <w:r>
         <w:rPr>
           <w:rFonts w:ascii="Calibri" w:hAnsi="Calibri" w:cs="Calibri"/>
@@ -1778,9 +2012,9 @@
         </w:rPr>
         <w:lastRenderedPageBreak/>
         <w:drawing>
-          <wp:inline distT="0" distB="0" distL="0" distR="0" wp14:anchorId="490C8812" wp14:editId="51FC18DD">
-            <wp:extent cx="3333750" cy="2324100"/>
-            <wp:effectExtent l="0" t="0" r="0" b="0"/>
+          <wp:inline distT="0" distB="0" distL="0" distR="0" wp14:anchorId="490C8812" wp14:editId="66C5AFD8">
+            <wp:extent cx="2870200" cy="2000939"/>
+            <wp:effectExtent l="152400" t="152400" r="368300" b="361315"/>
             <wp:docPr id="665967105" name="Picture 12"/>
             <wp:cNvGraphicFramePr>
               <a:graphicFrameLocks xmlns:a="http://schemas.openxmlformats.org/drawingml/2006/main" noChangeAspect="1"/>
@@ -1810,15 +2044,21 @@
                   <pic:spPr bwMode="auto">
                     <a:xfrm>
                       <a:off x="0" y="0"/>
-                      <a:ext cx="3333750" cy="2324100"/>
+                      <a:ext cx="2885140" cy="2011354"/>
                     </a:xfrm>
                     <a:prstGeom prst="rect">
                       <a:avLst/>
                     </a:prstGeom>
-                    <a:noFill/>
                     <a:ln>
                       <a:noFill/>
                     </a:ln>
+                    <a:effectLst>
+                      <a:outerShdw blurRad="292100" dist="139700" dir="2700000" algn="tl" rotWithShape="0">
+                        <a:srgbClr val="333333">
+                          <a:alpha val="65000"/>
+                        </a:srgbClr>
+                      </a:outerShdw>
+                    </a:effectLst>
                   </pic:spPr>
                 </pic:pic>
               </a:graphicData>
@@ -1831,9 +2071,9 @@
           <w:noProof/>
         </w:rPr>
         <w:drawing>
-          <wp:inline distT="0" distB="0" distL="0" distR="0" wp14:anchorId="32B009ED" wp14:editId="69C8A8AE">
+          <wp:inline distT="0" distB="0" distL="0" distR="0" wp14:anchorId="32B009ED" wp14:editId="0A7BD88B">
             <wp:extent cx="2847975" cy="2847975"/>
-            <wp:effectExtent l="0" t="0" r="9525" b="9525"/>
+            <wp:effectExtent l="152400" t="152400" r="371475" b="371475"/>
             <wp:docPr id="512003429" name="Picture 13"/>
             <wp:cNvGraphicFramePr>
               <a:graphicFrameLocks xmlns:a="http://schemas.openxmlformats.org/drawingml/2006/main" noChangeAspect="1"/>
@@ -1868,10 +2108,16 @@
                     <a:prstGeom prst="rect">
                       <a:avLst/>
                     </a:prstGeom>
-                    <a:noFill/>
                     <a:ln>
                       <a:noFill/>
                     </a:ln>
+                    <a:effectLst>
+                      <a:outerShdw blurRad="292100" dist="139700" dir="2700000" algn="tl" rotWithShape="0">
+                        <a:srgbClr val="333333">
+                          <a:alpha val="65000"/>
+                        </a:srgbClr>
+                      </a:outerShdw>
+                    </a:effectLst>
                   </pic:spPr>
                 </pic:pic>
               </a:graphicData>
@@ -1891,9 +2137,9 @@
           <w:noProof/>
         </w:rPr>
         <w:drawing>
-          <wp:inline distT="0" distB="0" distL="0" distR="0" wp14:anchorId="0D45DDA4" wp14:editId="7FDDCC92">
+          <wp:inline distT="0" distB="0" distL="0" distR="0" wp14:anchorId="0D45DDA4" wp14:editId="25FFADB8">
             <wp:extent cx="2800350" cy="752475"/>
-            <wp:effectExtent l="0" t="0" r="0" b="9525"/>
+            <wp:effectExtent l="152400" t="152400" r="361950" b="371475"/>
             <wp:docPr id="1486539266" name="Picture 14"/>
             <wp:cNvGraphicFramePr>
               <a:graphicFrameLocks xmlns:a="http://schemas.openxmlformats.org/drawingml/2006/main" noChangeAspect="1"/>
@@ -1928,10 +2174,16 @@
                     <a:prstGeom prst="rect">
                       <a:avLst/>
                     </a:prstGeom>
-                    <a:noFill/>
                     <a:ln>
                       <a:noFill/>
                     </a:ln>
+                    <a:effectLst>
+                      <a:outerShdw blurRad="292100" dist="139700" dir="2700000" algn="tl" rotWithShape="0">
+                        <a:srgbClr val="333333">
+                          <a:alpha val="65000"/>
+                        </a:srgbClr>
+                      </a:outerShdw>
+                    </a:effectLst>
                   </pic:spPr>
                 </pic:pic>
               </a:graphicData>
@@ -1945,10 +2197,11 @@
         <w:rPr>
           <w:noProof/>
         </w:rPr>
+        <w:lastRenderedPageBreak/>
         <w:drawing>
-          <wp:inline distT="0" distB="0" distL="0" distR="0" wp14:anchorId="342C1E83" wp14:editId="6B43F6FD">
+          <wp:inline distT="0" distB="0" distL="0" distR="0" wp14:anchorId="342C1E83" wp14:editId="3708C6F7">
             <wp:extent cx="3629025" cy="2028825"/>
-            <wp:effectExtent l="0" t="0" r="9525" b="9525"/>
+            <wp:effectExtent l="152400" t="152400" r="371475" b="371475"/>
             <wp:docPr id="1132155703" name="Picture 15"/>
             <wp:cNvGraphicFramePr>
               <a:graphicFrameLocks xmlns:a="http://schemas.openxmlformats.org/drawingml/2006/main" noChangeAspect="1"/>
@@ -1983,10 +2236,16 @@
                     <a:prstGeom prst="rect">
                       <a:avLst/>
                     </a:prstGeom>
-                    <a:noFill/>
                     <a:ln>
                       <a:noFill/>
                     </a:ln>
+                    <a:effectLst>
+                      <a:outerShdw blurRad="292100" dist="139700" dir="2700000" algn="tl" rotWithShape="0">
+                        <a:srgbClr val="333333">
+                          <a:alpha val="65000"/>
+                        </a:srgbClr>
+                      </a:outerShdw>
+                    </a:effectLst>
                   </pic:spPr>
                 </pic:pic>
               </a:graphicData>
@@ -3334,15 +3593,7 @@
       </w:r>
       <w:proofErr w:type="spellEnd"/>
       <w:r>
-        <w:t xml:space="preserve"> = NULL WHERE </w:t>
-      </w:r>
-      <w:proofErr w:type="spellStart"/>
-      <w:r>
-        <w:t>user_id</w:t>
-      </w:r>
-      <w:proofErr w:type="spellEnd"/>
-      <w:r>
-        <w:t xml:space="preserve"> </w:t>
+        <w:t xml:space="preserve"> = NULL WHERE user_id </w:t>
       </w:r>
       <w:proofErr w:type="gramStart"/>
       <w:r>
@@ -3469,15 +3720,7 @@
       </w:r>
       <w:proofErr w:type="spellEnd"/>
       <w:r>
-        <w:t xml:space="preserve"> = 0 WHERE </w:t>
-      </w:r>
-      <w:proofErr w:type="spellStart"/>
-      <w:r>
-        <w:t>user_id</w:t>
-      </w:r>
-      <w:proofErr w:type="spellEnd"/>
-      <w:r>
-        <w:t xml:space="preserve"> </w:t>
+        <w:t xml:space="preserve"> = 0 WHERE user_id </w:t>
       </w:r>
       <w:proofErr w:type="gramStart"/>
       <w:r>
@@ -3609,11 +3852,66 @@
       </w:r>
       <w:proofErr w:type="gramEnd"/>
       <w:r>
-        <w:t xml:space="preserve"> WHERE </w:t>
-      </w:r>
-      <w:proofErr w:type="spellStart"/>
-      <w:r>
-        <w:t>user_id</w:t>
+        <w:t xml:space="preserve"> WHERE user_id </w:t>
+      </w:r>
+      <w:proofErr w:type="gramStart"/>
+      <w:r>
+        <w:t>= ?</w:t>
+      </w:r>
+      <w:proofErr w:type="gramEnd"/>
+      <w:r>
+        <w:t xml:space="preserve">", </w:t>
+      </w:r>
+      <w:proofErr w:type="spellStart"/>
+      <w:r>
+        <w:t>new_attempts</w:t>
+      </w:r>
+      <w:proofErr w:type="spellEnd"/>
+      <w:r>
+        <w:t xml:space="preserve">, </w:t>
+      </w:r>
+      <w:proofErr w:type="spellStart"/>
+      <w:r>
+        <w:t>lockout_time</w:t>
+      </w:r>
+      <w:proofErr w:type="spellEnd"/>
+      <w:r>
+        <w:t xml:space="preserve">, </w:t>
+      </w:r>
+      <w:proofErr w:type="spellStart"/>
+      <w:r>
+        <w:t>user.user_id</w:t>
+      </w:r>
+      <w:proofErr w:type="spellEnd"/>
+      <w:r>
+        <w:t>)</w:t>
+      </w:r>
+    </w:p>
+    <w:p>
+      <w:r>
+        <w:t xml:space="preserve">            RETURN "ACCOUNT_LOCKED_OUT"</w:t>
+      </w:r>
+    </w:p>
+    <w:p>
+      <w:r>
+        <w:t xml:space="preserve">        ELSE</w:t>
+      </w:r>
+    </w:p>
+    <w:p>
+      <w:r>
+        <w:t xml:space="preserve">            EXECUTE_</w:t>
+      </w:r>
+      <w:proofErr w:type="gramStart"/>
+      <w:r>
+        <w:t>SQL(</w:t>
+      </w:r>
+      <w:proofErr w:type="gramEnd"/>
+      <w:r>
+        <w:t xml:space="preserve">"UPDATE users SET </w:t>
+      </w:r>
+      <w:proofErr w:type="spellStart"/>
+      <w:r>
+        <w:t>failed_attempts</w:t>
       </w:r>
       <w:proofErr w:type="spellEnd"/>
       <w:r>
@@ -3625,78 +3923,7 @@
       </w:r>
       <w:proofErr w:type="gramEnd"/>
       <w:r>
-        <w:t xml:space="preserve">", </w:t>
-      </w:r>
-      <w:proofErr w:type="spellStart"/>
-      <w:r>
-        <w:t>new_attempts</w:t>
-      </w:r>
-      <w:proofErr w:type="spellEnd"/>
-      <w:r>
-        <w:t xml:space="preserve">, </w:t>
-      </w:r>
-      <w:proofErr w:type="spellStart"/>
-      <w:r>
-        <w:t>lockout_time</w:t>
-      </w:r>
-      <w:proofErr w:type="spellEnd"/>
-      <w:r>
-        <w:t xml:space="preserve">, </w:t>
-      </w:r>
-      <w:proofErr w:type="spellStart"/>
-      <w:r>
-        <w:t>user.user_id</w:t>
-      </w:r>
-      <w:proofErr w:type="spellEnd"/>
-      <w:r>
-        <w:t>)</w:t>
-      </w:r>
-    </w:p>
-    <w:p>
-      <w:r>
-        <w:t xml:space="preserve">            RETURN "ACCOUNT_LOCKED_OUT"</w:t>
-      </w:r>
-    </w:p>
-    <w:p>
-      <w:r>
-        <w:t xml:space="preserve">        ELSE</w:t>
-      </w:r>
-    </w:p>
-    <w:p>
-      <w:r>
-        <w:t xml:space="preserve">            EXECUTE_</w:t>
-      </w:r>
-      <w:proofErr w:type="gramStart"/>
-      <w:r>
-        <w:t>SQL(</w:t>
-      </w:r>
-      <w:proofErr w:type="gramEnd"/>
-      <w:r>
-        <w:t xml:space="preserve">"UPDATE users SET </w:t>
-      </w:r>
-      <w:proofErr w:type="spellStart"/>
-      <w:r>
-        <w:t>failed_attempts</w:t>
-      </w:r>
-      <w:proofErr w:type="spellEnd"/>
-      <w:r>
-        <w:t xml:space="preserve"> </w:t>
-      </w:r>
-      <w:proofErr w:type="gramStart"/>
-      <w:r>
-        <w:t>= ?</w:t>
-      </w:r>
-      <w:proofErr w:type="gramEnd"/>
-      <w:r>
-        <w:t xml:space="preserve"> WHERE </w:t>
-      </w:r>
-      <w:proofErr w:type="spellStart"/>
-      <w:r>
-        <w:t>user_id</w:t>
-      </w:r>
-      <w:proofErr w:type="spellEnd"/>
-      <w:r>
-        <w:t xml:space="preserve"> </w:t>
+        <w:t xml:space="preserve"> WHERE user_id </w:t>
       </w:r>
       <w:proofErr w:type="gramStart"/>
       <w:r>
@@ -4016,6 +4243,490 @@
     <w:p>
       <w:r>
         <w:t xml:space="preserve">    RETURN (difference == 0)</w:t>
+      </w:r>
+    </w:p>
+    <w:p>
+      <w:r>
+        <w:t>END FUNCTION</w:t>
+      </w:r>
+    </w:p>
+    <w:p/>
+    <w:p>
+      <w:r>
+        <w:t>Algorithm 4: Custom Merge Sort (Top 5 Equities Ranking)</w:t>
+      </w:r>
+    </w:p>
+    <w:p>
+      <w:r>
+        <w:t>Purpose: Sorts an array of stock performance records in descending order based on percentage price change using a divide-and-conquer approach.</w:t>
+      </w:r>
+    </w:p>
+    <w:p>
+      <w:r>
+        <w:t xml:space="preserve">Time Complexity Justification: </w:t>
+      </w:r>
+      <w:proofErr w:type="gramStart"/>
+      <w:r>
+        <w:t>O(</w:t>
+      </w:r>
+      <w:proofErr w:type="gramEnd"/>
+      <w:r>
+        <w:t>N log N) in all cases (Best, Average, Worst), ensuring predictable and rapid ranking without using Python's built-</w:t>
+      </w:r>
+      <w:proofErr w:type="gramStart"/>
+      <w:r>
+        <w:t>in .sort</w:t>
+      </w:r>
+      <w:proofErr w:type="gramEnd"/>
+      <w:r>
+        <w:t>().</w:t>
+      </w:r>
+    </w:p>
+    <w:p/>
+    <w:p>
+      <w:r>
+        <w:t xml:space="preserve">FUNCTION </w:t>
+      </w:r>
+      <w:proofErr w:type="spellStart"/>
+      <w:r>
+        <w:t>merge_sort_stocks</w:t>
+      </w:r>
+      <w:proofErr w:type="spellEnd"/>
+      <w:r>
+        <w:t>(</w:t>
+      </w:r>
+      <w:proofErr w:type="spellStart"/>
+      <w:r>
+        <w:t>stock_list</w:t>
+      </w:r>
+      <w:proofErr w:type="spellEnd"/>
+      <w:r>
+        <w:t>)</w:t>
+      </w:r>
+    </w:p>
+    <w:p>
+      <w:r>
+        <w:t xml:space="preserve">    INTEGER n = </w:t>
+      </w:r>
+      <w:proofErr w:type="gramStart"/>
+      <w:r>
+        <w:t>LENGTH(</w:t>
+      </w:r>
+      <w:proofErr w:type="spellStart"/>
+      <w:proofErr w:type="gramEnd"/>
+      <w:r>
+        <w:t>stock_list</w:t>
+      </w:r>
+      <w:proofErr w:type="spellEnd"/>
+      <w:r>
+        <w:t>)</w:t>
+      </w:r>
+    </w:p>
+    <w:p>
+      <w:r>
+        <w:t xml:space="preserve">    IF n &lt;= 1 THEN</w:t>
+      </w:r>
+    </w:p>
+    <w:p>
+      <w:r>
+        <w:t xml:space="preserve">        RETURN </w:t>
+      </w:r>
+      <w:proofErr w:type="spellStart"/>
+      <w:r>
+        <w:t>stock_list</w:t>
+      </w:r>
+      <w:proofErr w:type="spellEnd"/>
+    </w:p>
+    <w:p>
+      <w:r>
+        <w:t xml:space="preserve">    END IF</w:t>
+      </w:r>
+    </w:p>
+    <w:p/>
+    <w:p>
+      <w:r>
+        <w:t xml:space="preserve">    INTEGER mid = n DIV 2</w:t>
+      </w:r>
+    </w:p>
+    <w:p>
+      <w:r>
+        <w:t xml:space="preserve">    ARRAY </w:t>
+      </w:r>
+      <w:proofErr w:type="spellStart"/>
+      <w:r>
+        <w:t>left_half</w:t>
+      </w:r>
+      <w:proofErr w:type="spellEnd"/>
+      <w:r>
+        <w:t xml:space="preserve"> = </w:t>
+      </w:r>
+      <w:proofErr w:type="spellStart"/>
+      <w:r>
+        <w:t>merge_sort_</w:t>
+      </w:r>
+      <w:proofErr w:type="gramStart"/>
+      <w:r>
+        <w:t>stocks</w:t>
+      </w:r>
+      <w:proofErr w:type="spellEnd"/>
+      <w:r>
+        <w:t>(SLICE(</w:t>
+      </w:r>
+      <w:proofErr w:type="spellStart"/>
+      <w:proofErr w:type="gramEnd"/>
+      <w:r>
+        <w:t>stock_list</w:t>
+      </w:r>
+      <w:proofErr w:type="spellEnd"/>
+      <w:r>
+        <w:t>, 0, mid))</w:t>
+      </w:r>
+    </w:p>
+    <w:p>
+      <w:r>
+        <w:t xml:space="preserve">    ARRAY </w:t>
+      </w:r>
+      <w:proofErr w:type="spellStart"/>
+      <w:r>
+        <w:t>right_half</w:t>
+      </w:r>
+      <w:proofErr w:type="spellEnd"/>
+      <w:r>
+        <w:t xml:space="preserve"> = </w:t>
+      </w:r>
+      <w:proofErr w:type="spellStart"/>
+      <w:r>
+        <w:t>merge_sort_</w:t>
+      </w:r>
+      <w:proofErr w:type="gramStart"/>
+      <w:r>
+        <w:t>stocks</w:t>
+      </w:r>
+      <w:proofErr w:type="spellEnd"/>
+      <w:r>
+        <w:t>(SLICE(</w:t>
+      </w:r>
+      <w:proofErr w:type="spellStart"/>
+      <w:proofErr w:type="gramEnd"/>
+      <w:r>
+        <w:t>stock_list</w:t>
+      </w:r>
+      <w:proofErr w:type="spellEnd"/>
+      <w:r>
+        <w:t>, mid, n))</w:t>
+      </w:r>
+    </w:p>
+    <w:p/>
+    <w:p>
+      <w:r>
+        <w:t xml:space="preserve">    RETURN </w:t>
+      </w:r>
+      <w:proofErr w:type="spellStart"/>
+      <w:r>
+        <w:t>merge_</w:t>
+      </w:r>
+      <w:proofErr w:type="gramStart"/>
+      <w:r>
+        <w:t>sublists</w:t>
+      </w:r>
+      <w:proofErr w:type="spellEnd"/>
+      <w:r>
+        <w:t>(</w:t>
+      </w:r>
+      <w:proofErr w:type="spellStart"/>
+      <w:proofErr w:type="gramEnd"/>
+      <w:r>
+        <w:t>left_half</w:t>
+      </w:r>
+      <w:proofErr w:type="spellEnd"/>
+      <w:r>
+        <w:t xml:space="preserve">, </w:t>
+      </w:r>
+      <w:proofErr w:type="spellStart"/>
+      <w:r>
+        <w:t>right_half</w:t>
+      </w:r>
+      <w:proofErr w:type="spellEnd"/>
+      <w:r>
+        <w:t>)</w:t>
+      </w:r>
+    </w:p>
+    <w:p>
+      <w:r>
+        <w:t>END FUNCTION</w:t>
+      </w:r>
+    </w:p>
+    <w:p/>
+    <w:p>
+      <w:r>
+        <w:t xml:space="preserve">FUNCTION </w:t>
+      </w:r>
+      <w:proofErr w:type="spellStart"/>
+      <w:r>
+        <w:t>merge_</w:t>
+      </w:r>
+      <w:proofErr w:type="gramStart"/>
+      <w:r>
+        <w:t>sublists</w:t>
+      </w:r>
+      <w:proofErr w:type="spellEnd"/>
+      <w:r>
+        <w:t>(</w:t>
+      </w:r>
+      <w:proofErr w:type="gramEnd"/>
+      <w:r>
+        <w:t>left, right)</w:t>
+      </w:r>
+    </w:p>
+    <w:p>
+      <w:r>
+        <w:t xml:space="preserve">    ARRAY result = []</w:t>
+      </w:r>
+    </w:p>
+    <w:p>
+      <w:r>
+        <w:t xml:space="preserve">    INTEGER </w:t>
+      </w:r>
+      <w:proofErr w:type="spellStart"/>
+      <w:r>
+        <w:t>i</w:t>
+      </w:r>
+      <w:proofErr w:type="spellEnd"/>
+      <w:r>
+        <w:t xml:space="preserve"> = 0</w:t>
+      </w:r>
+    </w:p>
+    <w:p>
+      <w:r>
+        <w:t xml:space="preserve">    INTEGER j = 0</w:t>
+      </w:r>
+    </w:p>
+    <w:p/>
+    <w:p>
+      <w:r>
+        <w:t xml:space="preserve">    WHILE </w:t>
+      </w:r>
+      <w:proofErr w:type="spellStart"/>
+      <w:r>
+        <w:t>i</w:t>
+      </w:r>
+      <w:proofErr w:type="spellEnd"/>
+      <w:r>
+        <w:t xml:space="preserve"> &lt; </w:t>
+      </w:r>
+      <w:proofErr w:type="gramStart"/>
+      <w:r>
+        <w:t>LENGTH(</w:t>
+      </w:r>
+      <w:proofErr w:type="gramEnd"/>
+      <w:r>
+        <w:t xml:space="preserve">left) AND j &lt; </w:t>
+      </w:r>
+      <w:proofErr w:type="gramStart"/>
+      <w:r>
+        <w:t>LENGTH(</w:t>
+      </w:r>
+      <w:proofErr w:type="gramEnd"/>
+      <w:r>
+        <w:t>right) DO</w:t>
+      </w:r>
+    </w:p>
+    <w:p>
+      <w:r>
+        <w:t xml:space="preserve">        IF left[</w:t>
+      </w:r>
+      <w:proofErr w:type="spellStart"/>
+      <w:r>
+        <w:t>i</w:t>
+      </w:r>
+      <w:proofErr w:type="spellEnd"/>
+      <w:proofErr w:type="gramStart"/>
+      <w:r>
+        <w:t>].</w:t>
+      </w:r>
+      <w:proofErr w:type="spellStart"/>
+      <w:r>
+        <w:t>daily</w:t>
+      </w:r>
+      <w:proofErr w:type="gramEnd"/>
+      <w:r>
+        <w:t>_return_pct</w:t>
+      </w:r>
+      <w:proofErr w:type="spellEnd"/>
+      <w:r>
+        <w:t xml:space="preserve"> &gt;= right[j</w:t>
+      </w:r>
+      <w:proofErr w:type="gramStart"/>
+      <w:r>
+        <w:t>].</w:t>
+      </w:r>
+      <w:proofErr w:type="spellStart"/>
+      <w:r>
+        <w:t>daily</w:t>
+      </w:r>
+      <w:proofErr w:type="gramEnd"/>
+      <w:r>
+        <w:t>_return_pct</w:t>
+      </w:r>
+      <w:proofErr w:type="spellEnd"/>
+      <w:r>
+        <w:t xml:space="preserve"> THEN</w:t>
+      </w:r>
+    </w:p>
+    <w:p>
+      <w:r>
+        <w:t xml:space="preserve">            APPEND left[</w:t>
+      </w:r>
+      <w:proofErr w:type="spellStart"/>
+      <w:r>
+        <w:t>i</w:t>
+      </w:r>
+      <w:proofErr w:type="spellEnd"/>
+      <w:r>
+        <w:t>] TO result</w:t>
+      </w:r>
+    </w:p>
+    <w:p>
+      <w:r>
+        <w:t xml:space="preserve">            </w:t>
+      </w:r>
+      <w:proofErr w:type="spellStart"/>
+      <w:r>
+        <w:t>i</w:t>
+      </w:r>
+      <w:proofErr w:type="spellEnd"/>
+      <w:r>
+        <w:t xml:space="preserve"> = </w:t>
+      </w:r>
+      <w:proofErr w:type="spellStart"/>
+      <w:r>
+        <w:t>i</w:t>
+      </w:r>
+      <w:proofErr w:type="spellEnd"/>
+      <w:r>
+        <w:t xml:space="preserve"> + 1</w:t>
+      </w:r>
+    </w:p>
+    <w:p>
+      <w:r>
+        <w:lastRenderedPageBreak/>
+        <w:t xml:space="preserve">        ELSE</w:t>
+      </w:r>
+    </w:p>
+    <w:p>
+      <w:r>
+        <w:t xml:space="preserve">            APPEND right[j] TO result</w:t>
+      </w:r>
+    </w:p>
+    <w:p>
+      <w:r>
+        <w:t xml:space="preserve">            j = j + 1</w:t>
+      </w:r>
+    </w:p>
+    <w:p>
+      <w:r>
+        <w:t xml:space="preserve">        END IF</w:t>
+      </w:r>
+    </w:p>
+    <w:p>
+      <w:r>
+        <w:t xml:space="preserve">    END WHILE</w:t>
+      </w:r>
+    </w:p>
+    <w:p/>
+    <w:p>
+      <w:r>
+        <w:t xml:space="preserve">    WHILE </w:t>
+      </w:r>
+      <w:proofErr w:type="spellStart"/>
+      <w:r>
+        <w:t>i</w:t>
+      </w:r>
+      <w:proofErr w:type="spellEnd"/>
+      <w:r>
+        <w:t xml:space="preserve"> &lt; </w:t>
+      </w:r>
+      <w:proofErr w:type="gramStart"/>
+      <w:r>
+        <w:t>LENGTH(</w:t>
+      </w:r>
+      <w:proofErr w:type="gramEnd"/>
+      <w:r>
+        <w:t>left) DO</w:t>
+      </w:r>
+    </w:p>
+    <w:p>
+      <w:r>
+        <w:t xml:space="preserve">        APPEND left[</w:t>
+      </w:r>
+      <w:proofErr w:type="spellStart"/>
+      <w:r>
+        <w:t>i</w:t>
+      </w:r>
+      <w:proofErr w:type="spellEnd"/>
+      <w:r>
+        <w:t>] TO result</w:t>
+      </w:r>
+    </w:p>
+    <w:p>
+      <w:r>
+        <w:t xml:space="preserve">        </w:t>
+      </w:r>
+      <w:proofErr w:type="spellStart"/>
+      <w:r>
+        <w:t>i</w:t>
+      </w:r>
+      <w:proofErr w:type="spellEnd"/>
+      <w:r>
+        <w:t xml:space="preserve"> = </w:t>
+      </w:r>
+      <w:proofErr w:type="spellStart"/>
+      <w:r>
+        <w:t>i</w:t>
+      </w:r>
+      <w:proofErr w:type="spellEnd"/>
+      <w:r>
+        <w:t xml:space="preserve"> + 1</w:t>
+      </w:r>
+    </w:p>
+    <w:p>
+      <w:r>
+        <w:t xml:space="preserve">    END WHILE</w:t>
+      </w:r>
+    </w:p>
+    <w:p/>
+    <w:p>
+      <w:r>
+        <w:t xml:space="preserve">    WHILE j &lt; </w:t>
+      </w:r>
+      <w:proofErr w:type="gramStart"/>
+      <w:r>
+        <w:t>LENGTH(</w:t>
+      </w:r>
+      <w:proofErr w:type="gramEnd"/>
+      <w:r>
+        <w:t>right) DO</w:t>
+      </w:r>
+    </w:p>
+    <w:p>
+      <w:r>
+        <w:t xml:space="preserve">        APPEND right[j] TO result</w:t>
+      </w:r>
+    </w:p>
+    <w:p>
+      <w:r>
+        <w:t xml:space="preserve">        j = j + 1</w:t>
+      </w:r>
+    </w:p>
+    <w:p>
+      <w:r>
+        <w:t xml:space="preserve">    END WHILE</w:t>
+      </w:r>
+    </w:p>
+    <w:p/>
+    <w:p>
+      <w:r>
+        <w:t xml:space="preserve">    RETURN result</w:t>
       </w:r>
     </w:p>
     <w:p>
@@ -4047,11 +4758,11 @@
         <w:tblLook w:val="04A0" w:firstRow="1" w:lastRow="0" w:firstColumn="1" w:lastColumn="0" w:noHBand="0" w:noVBand="1"/>
       </w:tblPr>
       <w:tblGrid>
-        <w:gridCol w:w="613"/>
-        <w:gridCol w:w="1596"/>
-        <w:gridCol w:w="2321"/>
-        <w:gridCol w:w="3146"/>
-        <w:gridCol w:w="1330"/>
+        <w:gridCol w:w="607"/>
+        <w:gridCol w:w="1575"/>
+        <w:gridCol w:w="2889"/>
+        <w:gridCol w:w="2669"/>
+        <w:gridCol w:w="1266"/>
       </w:tblGrid>
       <w:tr>
         <w:tc>
@@ -4076,6 +4787,8 @@
               <w:spacing w:after="0" w:line="240" w:lineRule="auto"/>
               <w:rPr>
                 <w:rFonts w:ascii="Times New Roman" w:eastAsia="Times New Roman" w:hAnsi="Times New Roman" w:cs="Times New Roman"/>
+                <w:b/>
+                <w:bCs/>
                 <w:kern w:val="0"/>
                 <w:sz w:val="24"/>
                 <w:szCs w:val="24"/>
@@ -4086,6 +4799,8 @@
             <w:r>
               <w:rPr>
                 <w:rFonts w:ascii="Calibri" w:eastAsia="Times New Roman" w:hAnsi="Calibri" w:cs="Calibri"/>
+                <w:b/>
+                <w:bCs/>
                 <w:color w:val="000000"/>
                 <w:kern w:val="0"/>
                 <w:lang w:eastAsia="en-IN"/>
@@ -4117,6 +4832,8 @@
               <w:spacing w:after="0" w:line="240" w:lineRule="auto"/>
               <w:rPr>
                 <w:rFonts w:ascii="Times New Roman" w:eastAsia="Times New Roman" w:hAnsi="Times New Roman" w:cs="Times New Roman"/>
+                <w:b/>
+                <w:bCs/>
                 <w:kern w:val="0"/>
                 <w:sz w:val="24"/>
                 <w:szCs w:val="24"/>
@@ -4127,6 +4844,8 @@
             <w:r>
               <w:rPr>
                 <w:rFonts w:ascii="Calibri" w:eastAsia="Times New Roman" w:hAnsi="Calibri" w:cs="Calibri"/>
+                <w:b/>
+                <w:bCs/>
                 <w:color w:val="000000"/>
                 <w:kern w:val="0"/>
                 <w:lang w:eastAsia="en-IN"/>
@@ -4158,6 +4877,8 @@
               <w:spacing w:after="0" w:line="240" w:lineRule="auto"/>
               <w:rPr>
                 <w:rFonts w:ascii="Times New Roman" w:eastAsia="Times New Roman" w:hAnsi="Times New Roman" w:cs="Times New Roman"/>
+                <w:b/>
+                <w:bCs/>
                 <w:kern w:val="0"/>
                 <w:sz w:val="24"/>
                 <w:szCs w:val="24"/>
@@ -4168,6 +4889,8 @@
             <w:r>
               <w:rPr>
                 <w:rFonts w:ascii="Calibri" w:eastAsia="Times New Roman" w:hAnsi="Calibri" w:cs="Calibri"/>
+                <w:b/>
+                <w:bCs/>
                 <w:color w:val="000000"/>
                 <w:kern w:val="0"/>
                 <w:lang w:eastAsia="en-IN"/>
@@ -4199,6 +4922,8 @@
               <w:spacing w:after="0" w:line="240" w:lineRule="auto"/>
               <w:rPr>
                 <w:rFonts w:ascii="Times New Roman" w:eastAsia="Times New Roman" w:hAnsi="Times New Roman" w:cs="Times New Roman"/>
+                <w:b/>
+                <w:bCs/>
                 <w:kern w:val="0"/>
                 <w:sz w:val="24"/>
                 <w:szCs w:val="24"/>
@@ -4209,6 +4934,8 @@
             <w:r>
               <w:rPr>
                 <w:rFonts w:ascii="Calibri" w:eastAsia="Times New Roman" w:hAnsi="Calibri" w:cs="Calibri"/>
+                <w:b/>
+                <w:bCs/>
                 <w:color w:val="000000"/>
                 <w:kern w:val="0"/>
                 <w:lang w:eastAsia="en-IN"/>
@@ -4240,6 +4967,8 @@
               <w:spacing w:after="0" w:line="240" w:lineRule="auto"/>
               <w:rPr>
                 <w:rFonts w:ascii="Times New Roman" w:eastAsia="Times New Roman" w:hAnsi="Times New Roman" w:cs="Times New Roman"/>
+                <w:b/>
+                <w:bCs/>
                 <w:kern w:val="0"/>
                 <w:sz w:val="24"/>
                 <w:szCs w:val="24"/>
@@ -4250,6 +4979,8 @@
             <w:r>
               <w:rPr>
                 <w:rFonts w:ascii="Calibri" w:eastAsia="Times New Roman" w:hAnsi="Calibri" w:cs="Calibri"/>
+                <w:b/>
+                <w:bCs/>
                 <w:color w:val="000000"/>
                 <w:kern w:val="0"/>
                 <w:lang w:eastAsia="en-IN"/>
@@ -4712,6 +5443,7 @@
                 <w:lang w:eastAsia="en-IN"/>
                 <w14:ligatures w14:val="none"/>
               </w:rPr>
+              <w:lastRenderedPageBreak/>
               <w:t>T3</w:t>
             </w:r>
           </w:p>
@@ -5086,29 +5818,7 @@
                 <w:lang w:eastAsia="en-IN"/>
                 <w14:ligatures w14:val="none"/>
               </w:rPr>
-              <w:t xml:space="preserve">Fetch and parse JSON response within &lt;500ms using native </w:t>
-            </w:r>
-            <w:proofErr w:type="spellStart"/>
-            <w:r>
-              <w:rPr>
-                <w:rFonts w:ascii="Calibri" w:eastAsia="Times New Roman" w:hAnsi="Calibri" w:cs="Calibri"/>
-                <w:color w:val="000000"/>
-                <w:kern w:val="0"/>
-                <w:lang w:eastAsia="en-IN"/>
-                <w14:ligatures w14:val="none"/>
-              </w:rPr>
-              <w:t>urllib</w:t>
-            </w:r>
-            <w:proofErr w:type="spellEnd"/>
-            <w:r>
-              <w:rPr>
-                <w:rFonts w:ascii="Calibri" w:eastAsia="Times New Roman" w:hAnsi="Calibri" w:cs="Calibri"/>
-                <w:color w:val="000000"/>
-                <w:kern w:val="0"/>
-                <w:lang w:eastAsia="en-IN"/>
-                <w14:ligatures w14:val="none"/>
-              </w:rPr>
-              <w:t>. </w:t>
+              <w:t>Fetch and parse JSON response within &lt;500ms using native urllib. </w:t>
             </w:r>
           </w:p>
         </w:tc>
@@ -5936,51 +6646,7 @@
                 <w:lang w:eastAsia="en-IN"/>
                 <w14:ligatures w14:val="none"/>
               </w:rPr>
-              <w:t xml:space="preserve">Alert saved to database with </w:t>
-            </w:r>
-            <w:proofErr w:type="spellStart"/>
-            <w:r>
-              <w:rPr>
-                <w:rFonts w:ascii="Calibri" w:eastAsia="Times New Roman" w:hAnsi="Calibri" w:cs="Calibri"/>
-                <w:color w:val="000000"/>
-                <w:kern w:val="0"/>
-                <w:lang w:eastAsia="en-IN"/>
-                <w14:ligatures w14:val="none"/>
-              </w:rPr>
-              <w:t>is_active</w:t>
-            </w:r>
-            <w:proofErr w:type="spellEnd"/>
-            <w:r>
-              <w:rPr>
-                <w:rFonts w:ascii="Calibri" w:eastAsia="Times New Roman" w:hAnsi="Calibri" w:cs="Calibri"/>
-                <w:color w:val="000000"/>
-                <w:kern w:val="0"/>
-                <w:lang w:eastAsia="en-IN"/>
-                <w14:ligatures w14:val="none"/>
-              </w:rPr>
-              <w:t xml:space="preserve"> = 1 linked via Foreign Key </w:t>
-            </w:r>
-            <w:proofErr w:type="spellStart"/>
-            <w:r>
-              <w:rPr>
-                <w:rFonts w:ascii="Calibri" w:eastAsia="Times New Roman" w:hAnsi="Calibri" w:cs="Calibri"/>
-                <w:color w:val="000000"/>
-                <w:kern w:val="0"/>
-                <w:lang w:eastAsia="en-IN"/>
-                <w14:ligatures w14:val="none"/>
-              </w:rPr>
-              <w:t>user_id</w:t>
-            </w:r>
-            <w:proofErr w:type="spellEnd"/>
-            <w:r>
-              <w:rPr>
-                <w:rFonts w:ascii="Calibri" w:eastAsia="Times New Roman" w:hAnsi="Calibri" w:cs="Calibri"/>
-                <w:color w:val="000000"/>
-                <w:kern w:val="0"/>
-                <w:lang w:eastAsia="en-IN"/>
-                <w14:ligatures w14:val="none"/>
-              </w:rPr>
-              <w:t>. </w:t>
+              <w:t>Alert saved to database with is_active = 1 linked via Foreign Key user_id. </w:t>
             </w:r>
           </w:p>
         </w:tc>
@@ -6026,20 +6692,488 @@
           </w:p>
         </w:tc>
       </w:tr>
+      <w:tr>
+        <w:tc>
+          <w:tcPr>
+            <w:tcW w:w="0" w:type="auto"/>
+            <w:tcBorders>
+              <w:top w:val="single" w:sz="8" w:space="0" w:color="000000"/>
+              <w:left w:val="single" w:sz="8" w:space="0" w:color="000000"/>
+              <w:bottom w:val="single" w:sz="8" w:space="0" w:color="000000"/>
+              <w:right w:val="single" w:sz="8" w:space="0" w:color="000000"/>
+            </w:tcBorders>
+            <w:tcMar>
+              <w:top w:w="100" w:type="dxa"/>
+              <w:left w:w="100" w:type="dxa"/>
+              <w:bottom w:w="100" w:type="dxa"/>
+              <w:right w:w="100" w:type="dxa"/>
+            </w:tcMar>
+          </w:tcPr>
+          <w:p>
+            <w:pPr>
+              <w:spacing w:after="0" w:line="240" w:lineRule="auto"/>
+              <w:rPr>
+                <w:rFonts w:ascii="Calibri" w:eastAsia="Times New Roman" w:hAnsi="Calibri" w:cs="Calibri"/>
+                <w:color w:val="000000"/>
+                <w:kern w:val="0"/>
+                <w:lang w:eastAsia="en-IN"/>
+                <w14:ligatures w14:val="none"/>
+              </w:rPr>
+            </w:pPr>
+            <w:r>
+              <w:rPr>
+                <w:rFonts w:ascii="Calibri" w:eastAsia="Times New Roman" w:hAnsi="Calibri" w:cs="Calibri"/>
+                <w:color w:val="000000"/>
+                <w:kern w:val="0"/>
+                <w:lang w:eastAsia="en-IN"/>
+                <w14:ligatures w14:val="none"/>
+              </w:rPr>
+              <w:t>T9</w:t>
+            </w:r>
+          </w:p>
+        </w:tc>
+        <w:tc>
+          <w:tcPr>
+            <w:tcW w:w="0" w:type="auto"/>
+            <w:tcBorders>
+              <w:top w:val="single" w:sz="8" w:space="0" w:color="000000"/>
+              <w:left w:val="single" w:sz="8" w:space="0" w:color="000000"/>
+              <w:bottom w:val="single" w:sz="8" w:space="0" w:color="000000"/>
+              <w:right w:val="single" w:sz="8" w:space="0" w:color="000000"/>
+            </w:tcBorders>
+            <w:tcMar>
+              <w:top w:w="100" w:type="dxa"/>
+              <w:left w:w="100" w:type="dxa"/>
+              <w:bottom w:w="100" w:type="dxa"/>
+              <w:right w:w="100" w:type="dxa"/>
+            </w:tcMar>
+          </w:tcPr>
+          <w:p>
+            <w:pPr>
+              <w:spacing w:after="0" w:line="240" w:lineRule="auto"/>
+              <w:rPr>
+                <w:rFonts w:ascii="Calibri" w:eastAsia="Times New Roman" w:hAnsi="Calibri" w:cs="Calibri"/>
+                <w:color w:val="000000"/>
+                <w:kern w:val="0"/>
+                <w:lang w:eastAsia="en-IN"/>
+                <w14:ligatures w14:val="none"/>
+              </w:rPr>
+            </w:pPr>
+            <w:r>
+              <w:rPr>
+                <w:rFonts w:ascii="Calibri" w:eastAsia="Times New Roman" w:hAnsi="Calibri" w:cs="Calibri"/>
+                <w:color w:val="000000"/>
+                <w:kern w:val="0"/>
+                <w:lang w:eastAsia="en-IN"/>
+                <w14:ligatures w14:val="none"/>
+              </w:rPr>
+              <w:t>Custom DSA Math</w:t>
+            </w:r>
+          </w:p>
+        </w:tc>
+        <w:tc>
+          <w:tcPr>
+            <w:tcW w:w="0" w:type="auto"/>
+            <w:tcBorders>
+              <w:top w:val="single" w:sz="8" w:space="0" w:color="000000"/>
+              <w:left w:val="single" w:sz="8" w:space="0" w:color="000000"/>
+              <w:bottom w:val="single" w:sz="8" w:space="0" w:color="000000"/>
+              <w:right w:val="single" w:sz="8" w:space="0" w:color="000000"/>
+            </w:tcBorders>
+            <w:tcMar>
+              <w:top w:w="100" w:type="dxa"/>
+              <w:left w:w="100" w:type="dxa"/>
+              <w:bottom w:w="100" w:type="dxa"/>
+              <w:right w:w="100" w:type="dxa"/>
+            </w:tcMar>
+          </w:tcPr>
+          <w:p>
+            <w:pPr>
+              <w:spacing w:after="0" w:line="240" w:lineRule="auto"/>
+              <w:rPr>
+                <w:rFonts w:ascii="Calibri" w:eastAsia="Times New Roman" w:hAnsi="Calibri" w:cs="Calibri"/>
+                <w:color w:val="000000"/>
+                <w:kern w:val="0"/>
+                <w:lang w:eastAsia="en-IN"/>
+                <w14:ligatures w14:val="none"/>
+              </w:rPr>
+            </w:pPr>
+            <w:r>
+              <w:rPr>
+                <w:rFonts w:ascii="Calibri" w:eastAsia="Times New Roman" w:hAnsi="Calibri" w:cs="Calibri"/>
+                <w:color w:val="000000"/>
+                <w:kern w:val="0"/>
+                <w:lang w:eastAsia="en-IN"/>
+                <w14:ligatures w14:val="none"/>
+              </w:rPr>
+              <w:t>Pass an unsorted basket of 8 stock dictionaries with positive and negative percentage changes to merge_sort_stocks().</w:t>
+            </w:r>
+          </w:p>
+        </w:tc>
+        <w:tc>
+          <w:tcPr>
+            <w:tcW w:w="0" w:type="auto"/>
+            <w:tcBorders>
+              <w:top w:val="single" w:sz="8" w:space="0" w:color="000000"/>
+              <w:left w:val="single" w:sz="8" w:space="0" w:color="000000"/>
+              <w:bottom w:val="single" w:sz="8" w:space="0" w:color="000000"/>
+              <w:right w:val="single" w:sz="8" w:space="0" w:color="000000"/>
+            </w:tcBorders>
+            <w:tcMar>
+              <w:top w:w="100" w:type="dxa"/>
+              <w:left w:w="100" w:type="dxa"/>
+              <w:bottom w:w="100" w:type="dxa"/>
+              <w:right w:w="100" w:type="dxa"/>
+            </w:tcMar>
+          </w:tcPr>
+          <w:p>
+            <w:pPr>
+              <w:spacing w:after="0" w:line="240" w:lineRule="auto"/>
+              <w:rPr>
+                <w:rFonts w:ascii="Calibri" w:eastAsia="Times New Roman" w:hAnsi="Calibri" w:cs="Calibri"/>
+                <w:color w:val="000000"/>
+                <w:kern w:val="0"/>
+                <w:lang w:eastAsia="en-IN"/>
+                <w14:ligatures w14:val="none"/>
+              </w:rPr>
+            </w:pPr>
+            <w:r>
+              <w:rPr>
+                <w:rFonts w:ascii="Calibri" w:eastAsia="Times New Roman" w:hAnsi="Calibri" w:cs="Calibri"/>
+                <w:color w:val="000000"/>
+                <w:kern w:val="0"/>
+                <w:lang w:eastAsia="en-IN"/>
+                <w14:ligatures w14:val="none"/>
+              </w:rPr>
+              <w:t>Returns list sorted strictly in descending order; top 5 records sliced and rendered accurately on the dashboard.</w:t>
+            </w:r>
+          </w:p>
+        </w:tc>
+        <w:tc>
+          <w:tcPr>
+            <w:tcW w:w="0" w:type="auto"/>
+            <w:tcBorders>
+              <w:top w:val="single" w:sz="8" w:space="0" w:color="000000"/>
+              <w:left w:val="single" w:sz="8" w:space="0" w:color="000000"/>
+              <w:bottom w:val="single" w:sz="8" w:space="0" w:color="000000"/>
+              <w:right w:val="single" w:sz="8" w:space="0" w:color="000000"/>
+            </w:tcBorders>
+            <w:tcMar>
+              <w:top w:w="100" w:type="dxa"/>
+              <w:left w:w="100" w:type="dxa"/>
+              <w:bottom w:w="100" w:type="dxa"/>
+              <w:right w:w="100" w:type="dxa"/>
+            </w:tcMar>
+          </w:tcPr>
+          <w:p>
+            <w:pPr>
+              <w:spacing w:after="0" w:line="240" w:lineRule="auto"/>
+              <w:rPr>
+                <w:rFonts w:ascii="Calibri" w:eastAsia="Times New Roman" w:hAnsi="Calibri" w:cs="Calibri"/>
+                <w:color w:val="000000"/>
+                <w:kern w:val="0"/>
+                <w:lang w:eastAsia="en-IN"/>
+                <w14:ligatures w14:val="none"/>
+              </w:rPr>
+            </w:pPr>
+            <w:r>
+              <w:rPr>
+                <w:rFonts w:ascii="Calibri" w:eastAsia="Times New Roman" w:hAnsi="Calibri" w:cs="Calibri"/>
+                <w:color w:val="000000"/>
+                <w:kern w:val="0"/>
+                <w:lang w:eastAsia="en-IN"/>
+                <w14:ligatures w14:val="none"/>
+              </w:rPr>
+              <w:t>Normal / Boundary</w:t>
+            </w:r>
+          </w:p>
+          <w:p>
+            <w:pPr>
+              <w:rPr>
+                <w:rFonts w:ascii="Calibri" w:eastAsia="Times New Roman" w:hAnsi="Calibri" w:cs="Calibri"/>
+                <w:lang w:eastAsia="en-IN"/>
+              </w:rPr>
+            </w:pPr>
+          </w:p>
+        </w:tc>
+      </w:tr>
     </w:tbl>
+    <w:p/>
+    <w:p/>
+    <w:p>
+      <w:pPr>
+        <w:rPr>
+          <w:b/>
+          <w:bCs/>
+          <w:sz w:val="28"/>
+          <w:szCs w:val="28"/>
+        </w:rPr>
+      </w:pPr>
+      <w:r>
+        <w:rPr>
+          <w:b/>
+          <w:bCs/>
+          <w:sz w:val="28"/>
+          <w:szCs w:val="28"/>
+        </w:rPr>
+        <w:t>Section 3.3 Iterative Development &amp; Technical Implementation</w:t>
+      </w:r>
+    </w:p>
+    <w:p/>
+    <w:p>
+      <w:r>
+        <w:t>In this section, I document the iterative build of the system, demonstrating how each modular component was coded, tested, and validated against the initial design specifications. All backend security, database persistence, and API data transformation modules have been implemented strictly using Python's native standard libraries (hashlib, sqlite3, urllib) to avoid unverified external abstractions and demonstrate Group A technical competence.</w:t>
+      </w:r>
+    </w:p>
+    <w:p/>
+    <w:p>
+      <w:r>
+        <w:t>3.3.1 Milestone 1: Relational Persistence Layer &amp; Cryptographic Security (database.py)</w:t>
+      </w:r>
+    </w:p>
+    <w:p>
+      <w:r>
+        <w:t>The foundation of the application is a persistent SQLite database structured strictly in Third Normal Form (3NF) to eliminate data redundancy and anomalies.</w:t>
+      </w:r>
+    </w:p>
+    <w:p/>
     <w:p>
       <w:r>
         <w:lastRenderedPageBreak/>
-        <w:t>Section 3.3</w:t>
-      </w:r>
-    </w:p>
+        <w:t>1. Technical Implementation Details:</w:t>
+      </w:r>
+    </w:p>
+    <w:p>
+      <w:r>
+        <w:t xml:space="preserve">- 3NF Relational Tables: Created the 'users' and 'alerts' entities. Enforced referential integrity via 'PRAGMA </w:t>
+      </w:r>
+      <w:proofErr w:type="spellStart"/>
+      <w:r>
+        <w:t>foreign_keys</w:t>
+      </w:r>
+      <w:proofErr w:type="spellEnd"/>
+      <w:r>
+        <w:t xml:space="preserve"> = ON' and applied an 'ON DELETE CASCADE' constraint on the foreign key (user_id) to prevent orphaned alert records.</w:t>
+      </w:r>
+    </w:p>
+    <w:p>
+      <w:r>
+        <w:t>- Native PBKDF2 Hashing: To secure user credentials without third-party libraries, I utilized '</w:t>
+      </w:r>
+      <w:proofErr w:type="gramStart"/>
+      <w:r>
+        <w:t>hashlib.pbkdf</w:t>
+      </w:r>
+      <w:proofErr w:type="gramEnd"/>
+      <w:r>
+        <w:t>2_hmac' with SHA-256, applying 100,000 key-stretching iterations combined with a cryptographically secure 16-byte random salt generated via '</w:t>
+      </w:r>
+      <w:proofErr w:type="spellStart"/>
+      <w:proofErr w:type="gramStart"/>
+      <w:r>
+        <w:t>os.urandom</w:t>
+      </w:r>
+      <w:proofErr w:type="spellEnd"/>
+      <w:proofErr w:type="gramEnd"/>
+      <w:r>
+        <w:t>(16)'.</w:t>
+      </w:r>
+    </w:p>
+    <w:p>
+      <w:r>
+        <w:t>- Constant-Time Bitwise XOR Verification: Standard equality checks ('==') are susceptible to side-channel timing attacks, where execution duration leaks character matching progress. To mitigate this vulnerability, I engineered a constant-time comparison loop utilizing bitwise XOR ('^') and accumulator OR ('|=') operations across byte sequences, guaranteeing identical execution latency regardless of match accuracy.</w:t>
+      </w:r>
+    </w:p>
+    <w:p/>
     <w:p>
       <w:r>
         <w:rPr>
           <w:noProof/>
         </w:rPr>
         <w:drawing>
-          <wp:inline distT="0" distB="0" distL="0" distR="0" wp14:anchorId="3D672310" wp14:editId="48D76E6D">
+          <wp:inline distT="0" distB="0" distL="0" distR="0" wp14:anchorId="586DE57C" wp14:editId="17C6C6DC">
+            <wp:extent cx="5731510" cy="1172210"/>
+            <wp:effectExtent l="0" t="0" r="2540" b="8890"/>
+            <wp:docPr id="998962740" name="Picture 1"/>
+            <wp:cNvGraphicFramePr>
+              <a:graphicFrameLocks xmlns:a="http://schemas.openxmlformats.org/drawingml/2006/main" noChangeAspect="1"/>
+            </wp:cNvGraphicFramePr>
+            <a:graphic xmlns:a="http://schemas.openxmlformats.org/drawingml/2006/main">
+              <a:graphicData uri="http://schemas.openxmlformats.org/drawingml/2006/picture">
+                <pic:pic xmlns:pic="http://schemas.openxmlformats.org/drawingml/2006/picture">
+                  <pic:nvPicPr>
+                    <pic:cNvPr id="998962740" name=""/>
+                    <pic:cNvPicPr/>
+                  </pic:nvPicPr>
+                  <pic:blipFill>
+                    <a:blip r:embed="rId19"/>
+                    <a:stretch>
+                      <a:fillRect/>
+                    </a:stretch>
+                  </pic:blipFill>
+                  <pic:spPr>
+                    <a:xfrm>
+                      <a:off x="0" y="0"/>
+                      <a:ext cx="5731510" cy="1172210"/>
+                    </a:xfrm>
+                    <a:prstGeom prst="rect">
+                      <a:avLst/>
+                    </a:prstGeom>
+                  </pic:spPr>
+                </pic:pic>
+              </a:graphicData>
+            </a:graphic>
+          </wp:inline>
+        </w:drawing>
+      </w:r>
+    </w:p>
+    <w:p>
+      <w:r>
+        <w:t>Figure 3.8: Verification of SQLite 3NF Database State displaying salted PBKDF2 digests, lockout deadlines, and foreign key integrity.</w:t>
+      </w:r>
+    </w:p>
+    <w:p/>
+    <w:p>
+      <w:r>
+        <w:t>2. Evidence Evaluation &amp; Test Validation:</w:t>
+      </w:r>
+    </w:p>
+    <w:p>
+      <w:r>
+        <w:t>As demonstrated in Figure 3.8, the database successfully stores key-stretched password digests formatted as '</w:t>
+      </w:r>
+      <w:proofErr w:type="spellStart"/>
+      <w:r>
+        <w:t>iterations$salt$hash</w:t>
+      </w:r>
+      <w:proofErr w:type="spellEnd"/>
+      <w:r>
+        <w:t>'. The '</w:t>
+      </w:r>
+      <w:proofErr w:type="spellStart"/>
+      <w:r>
+        <w:t>failed_attempts</w:t>
+      </w:r>
+      <w:proofErr w:type="spellEnd"/>
+      <w:r>
+        <w:t>' and '</w:t>
+      </w:r>
+      <w:proofErr w:type="spellStart"/>
+      <w:r>
+        <w:t>lockout_until</w:t>
+      </w:r>
+      <w:proofErr w:type="spellEnd"/>
+      <w:r>
+        <w:t>' fields update persistently upon invalid authentication sequences, fulfilling Success Criterion SC1 and SC3.</w:t>
+      </w:r>
+    </w:p>
+    <w:p/>
+    <w:p>
+      <w:r>
+        <w:t>---</w:t>
+      </w:r>
+    </w:p>
+    <w:p/>
+    <w:p>
+      <w:r>
+        <w:t>3.3.2 Milestone 2: Flask Web Controller &amp; Defensive Authentication Guard (app.py)</w:t>
+      </w:r>
+    </w:p>
+    <w:p>
+      <w:r>
+        <w:t>With the persistence layer verified, I developed the centralized application controller ('app.py') along with Jinja2 interface templates ('base.html' and 'login.html') to manage client-server communication and session security.</w:t>
+      </w:r>
+    </w:p>
+    <w:p/>
+    <w:p>
+      <w:r>
+        <w:t>1. Technical Implementation Details:</w:t>
+      </w:r>
+    </w:p>
+    <w:p>
+      <w:r>
+        <w:t>- Cryptographic Session Management: Initialized '</w:t>
+      </w:r>
+      <w:proofErr w:type="spellStart"/>
+      <w:proofErr w:type="gramStart"/>
+      <w:r>
+        <w:t>app.secret</w:t>
+      </w:r>
+      <w:proofErr w:type="gramEnd"/>
+      <w:r>
+        <w:t>_key</w:t>
+      </w:r>
+      <w:proofErr w:type="spellEnd"/>
+      <w:r>
+        <w:t>' using 24 cryptographically random bytes via '</w:t>
+      </w:r>
+      <w:proofErr w:type="spellStart"/>
+      <w:proofErr w:type="gramStart"/>
+      <w:r>
+        <w:t>os.urandom</w:t>
+      </w:r>
+      <w:proofErr w:type="spellEnd"/>
+      <w:proofErr w:type="gramEnd"/>
+      <w:r>
+        <w:t>(24</w:t>
+      </w:r>
+      <w:proofErr w:type="gramStart"/>
+      <w:r>
+        <w:t>).hex</w:t>
+      </w:r>
+      <w:proofErr w:type="gramEnd"/>
+      <w:r>
+        <w:t>()' to guarantee tamper-proof signed cookie sessions.</w:t>
+      </w:r>
+    </w:p>
+    <w:p>
+      <w:r>
+        <w:lastRenderedPageBreak/>
+        <w:t>- Input Boundary Validation (Test T2): Implemented strict server-side validation rejecting usernames under 3 characters and passwords under 6 characters prior to executing database queries.</w:t>
+      </w:r>
+    </w:p>
+    <w:p>
+      <w:r>
+        <w:t>- Brute-Force Rate Limiting (Algorithm 3): On every failed credential attempt, the controller increments '</w:t>
+      </w:r>
+      <w:proofErr w:type="spellStart"/>
+      <w:r>
+        <w:t>failed_attempts</w:t>
+      </w:r>
+      <w:proofErr w:type="spellEnd"/>
+      <w:r>
+        <w:t>'. Upon reaching 3 consecutive failures, the controller writes an ISO-8601 timestamp representing '</w:t>
+      </w:r>
+      <w:proofErr w:type="spellStart"/>
+      <w:proofErr w:type="gramStart"/>
+      <w:r>
+        <w:t>datetime.now</w:t>
+      </w:r>
+      <w:proofErr w:type="spellEnd"/>
+      <w:r>
+        <w:t>(</w:t>
+      </w:r>
+      <w:proofErr w:type="gramEnd"/>
+      <w:r>
+        <w:t xml:space="preserve">) + </w:t>
+      </w:r>
+      <w:proofErr w:type="spellStart"/>
+      <w:r>
+        <w:t>timedelta</w:t>
+      </w:r>
+      <w:proofErr w:type="spellEnd"/>
+      <w:r>
+        <w:t>(minutes=15)' to SQLite. Subsequent login attempts during this window are intercepted immediately before executing cryptographic hashes, conserving server computational overhead and displaying dynamic remaining time banners.</w:t>
+      </w:r>
+    </w:p>
+    <w:p/>
+    <w:p>
+      <w:r>
+        <w:rPr>
+          <w:noProof/>
+        </w:rPr>
+        <w:drawing>
+          <wp:inline distT="0" distB="0" distL="0" distR="0" wp14:anchorId="2C602424" wp14:editId="7F574D12">
             <wp:extent cx="4122777" cy="3215919"/>
             <wp:effectExtent l="0" t="0" r="0" b="3810"/>
             <wp:docPr id="556371737" name="Picture 1"/>
@@ -6054,7 +7188,7 @@
                     <pic:cNvPicPr/>
                   </pic:nvPicPr>
                   <pic:blipFill>
-                    <a:blip r:embed="rId19">
+                    <a:blip r:embed="rId20">
                       <a:extLst>
                         <a:ext uri="{28A0092B-C50C-407E-A947-70E740481C1C}">
                           <a14:useLocalDpi xmlns:a14="http://schemas.microsoft.com/office/drawing/2010/main" val="0"/>
@@ -6084,54 +7218,137 @@
     <w:p/>
     <w:p>
       <w:r>
+        <w:t>Figure 3.9: Web UI Authentication Interface exhibiting dynamic 15-minute lockout security enforcement following 3 consecutive failed login attempts (Test T3).</w:t>
+      </w:r>
+    </w:p>
+    <w:p/>
+    <w:p>
+      <w:r>
+        <w:t>2. Evidence Evaluation &amp; Test Validation:</w:t>
+      </w:r>
+    </w:p>
+    <w:p>
+      <w:r>
+        <w:t>Figure 3.9 confirms that the web application dynamically catches brute-force thresholds and renders the custom error container designed in Section 3.2.4. Simultaneously, Figure 3.8 confirms the persistence layer synchronized this event by setting '</w:t>
+      </w:r>
+      <w:proofErr w:type="spellStart"/>
+      <w:r>
+        <w:t>failed_attempts</w:t>
+      </w:r>
+      <w:proofErr w:type="spellEnd"/>
+      <w:r>
+        <w:t xml:space="preserve"> = 3' and updating '</w:t>
+      </w:r>
+      <w:proofErr w:type="spellStart"/>
+      <w:r>
+        <w:t>lockout_until</w:t>
+      </w:r>
+      <w:proofErr w:type="spellEnd"/>
+      <w:r>
+        <w:t>' to '2026-09-04T22:38:40', successfully fulfilling Test T1, T2, and T3.</w:t>
+      </w:r>
+    </w:p>
+    <w:p/>
+    <w:p>
+      <w:r>
+        <w:t>3.3.3 Milestone 3: Native Market Data Extraction &amp; Payload Cleansing Engine (data_parser.py)</w:t>
+      </w:r>
+    </w:p>
+    <w:p>
+      <w:r>
+        <w:t>To retrieve financial market feeds without relying on high-level wrappers like 'requests' or 'pandas', I built a native extraction and data sanitization pipeline in 'app/data_parser.py'.</w:t>
+      </w:r>
+    </w:p>
+    <w:p/>
+    <w:p>
+      <w:r>
+        <w:t>1. Technical Implementation Details:</w:t>
+      </w:r>
+    </w:p>
+    <w:p>
+      <w:r>
+        <w:lastRenderedPageBreak/>
+        <w:t>- Network Transmission via urllib: Structured explicit HTTP GET queries using '</w:t>
+      </w:r>
+      <w:proofErr w:type="spellStart"/>
+      <w:proofErr w:type="gramStart"/>
+      <w:r>
+        <w:t>urllib.request</w:t>
+      </w:r>
+      <w:proofErr w:type="gramEnd"/>
+      <w:r>
+        <w:t>.Request</w:t>
+      </w:r>
+      <w:proofErr w:type="spellEnd"/>
+      <w:r>
+        <w:t>' configured with custom 'User-Agent' headers to prevent automated script blocking (HTTP 403 Forbidden).</w:t>
+      </w:r>
+    </w:p>
+    <w:p>
+      <w:r>
+        <w:t>- Connection Safety &amp; Timeouts: Bound all socket connections to a strict 5.0-second timeout ('</w:t>
+      </w:r>
+      <w:proofErr w:type="spellStart"/>
+      <w:proofErr w:type="gramStart"/>
+      <w:r>
+        <w:t>urllib.request</w:t>
+      </w:r>
+      <w:proofErr w:type="gramEnd"/>
+      <w:r>
+        <w:t>.</w:t>
+      </w:r>
+      <w:proofErr w:type="gramStart"/>
+      <w:r>
+        <w:t>urlopen</w:t>
+      </w:r>
+      <w:proofErr w:type="spellEnd"/>
+      <w:r>
+        <w:t>(</w:t>
+      </w:r>
+      <w:proofErr w:type="spellStart"/>
+      <w:proofErr w:type="gramEnd"/>
+      <w:r>
+        <w:t>req</w:t>
+      </w:r>
+      <w:proofErr w:type="spellEnd"/>
+      <w:r>
+        <w:t>, timeout=5.0)') to prevent server thread starvation during external network drops.</w:t>
+      </w:r>
+    </w:p>
+    <w:p>
+      <w:r>
+        <w:t>- Holiday &amp; Null Cleansing: Financial market APIs output null/empty entries for market closures (weekends and national bank holidays). The cleanser iterates through parallel timestamp and price arrays using '</w:t>
+      </w:r>
+      <w:proofErr w:type="gramStart"/>
+      <w:r>
+        <w:t>zip(</w:t>
+      </w:r>
+      <w:proofErr w:type="gramEnd"/>
+      <w:r>
+        <w:t>)', filtering non-numerical artifacts and rounding active closing prices to two decimal places.</w:t>
+      </w:r>
+    </w:p>
+    <w:p>
+      <w:r>
+        <w:t>- Algorithm Precondition Guard: Enforced a boundary check ensuring at least 14 valid numerical trading sessions exist ($N \</w:t>
+      </w:r>
+      <w:proofErr w:type="spellStart"/>
+      <w:r>
+        <w:t>ge</w:t>
+      </w:r>
+      <w:proofErr w:type="spellEnd"/>
+      <w:r>
+        <w:t xml:space="preserve"> 14$) to prevent runtime index errors in subsequent RSI mathematical indicators.</w:t>
+      </w:r>
+    </w:p>
+    <w:p/>
+    <w:p>
+      <w:r>
         <w:rPr>
           <w:noProof/>
         </w:rPr>
         <w:drawing>
-          <wp:inline distT="0" distB="0" distL="0" distR="0" wp14:anchorId="06FC34CE" wp14:editId="20C8D437">
-            <wp:extent cx="5731510" cy="1172210"/>
-            <wp:effectExtent l="0" t="0" r="2540" b="8890"/>
-            <wp:docPr id="998962740" name="Picture 1"/>
-            <wp:cNvGraphicFramePr>
-              <a:graphicFrameLocks xmlns:a="http://schemas.openxmlformats.org/drawingml/2006/main" noChangeAspect="1"/>
-            </wp:cNvGraphicFramePr>
-            <a:graphic xmlns:a="http://schemas.openxmlformats.org/drawingml/2006/main">
-              <a:graphicData uri="http://schemas.openxmlformats.org/drawingml/2006/picture">
-                <pic:pic xmlns:pic="http://schemas.openxmlformats.org/drawingml/2006/picture">
-                  <pic:nvPicPr>
-                    <pic:cNvPr id="998962740" name=""/>
-                    <pic:cNvPicPr/>
-                  </pic:nvPicPr>
-                  <pic:blipFill>
-                    <a:blip r:embed="rId20"/>
-                    <a:stretch>
-                      <a:fillRect/>
-                    </a:stretch>
-                  </pic:blipFill>
-                  <pic:spPr>
-                    <a:xfrm>
-                      <a:off x="0" y="0"/>
-                      <a:ext cx="5731510" cy="1172210"/>
-                    </a:xfrm>
-                    <a:prstGeom prst="rect">
-                      <a:avLst/>
-                    </a:prstGeom>
-                  </pic:spPr>
-                </pic:pic>
-              </a:graphicData>
-            </a:graphic>
-          </wp:inline>
-        </w:drawing>
-      </w:r>
-    </w:p>
-    <w:p/>
-    <w:p>
-      <w:r>
-        <w:rPr>
-          <w:noProof/>
-        </w:rPr>
-        <w:drawing>
-          <wp:inline distT="0" distB="0" distL="0" distR="0" wp14:anchorId="59A6ED24" wp14:editId="75791625">
+          <wp:inline distT="0" distB="0" distL="0" distR="0" wp14:anchorId="08B31A35" wp14:editId="4F5E5187">
             <wp:extent cx="5731510" cy="2073275"/>
             <wp:effectExtent l="0" t="0" r="2540" b="3175"/>
             <wp:docPr id="644126422" name="Picture 1"/>
@@ -6173,8 +7390,235 @@
         </w:drawing>
       </w:r>
     </w:p>
+    <w:p>
+      <w:r>
+        <w:t>Figure 3.10: Terminal execution benchmark verifying native API data extraction, payload cleansing, and latency compliance under 500ms (Test T4 and T5).</w:t>
+      </w:r>
+    </w:p>
+    <w:p/>
+    <w:p>
+      <w:r>
+        <w:t>2. Evidence Evaluation &amp; Test Validation:</w:t>
+      </w:r>
+    </w:p>
+    <w:p>
+      <w:r>
+        <w:t>As recorded in the terminal benchmark (Figure 3.10):</w:t>
+      </w:r>
+    </w:p>
+    <w:p>
+      <w:r>
+        <w:t xml:space="preserve">- Test T4 (Normal Data): For ticker 'AAPL', the pipeline extracted and sanitized 21 trading days, returning a current price of $336.98 USD with an execution latency of 406.82 </w:t>
+      </w:r>
+      <w:proofErr w:type="spellStart"/>
+      <w:r>
+        <w:t>ms</w:t>
+      </w:r>
+      <w:proofErr w:type="spellEnd"/>
+      <w:r>
+        <w:t xml:space="preserve">. This directly satisfies Success Criterion SC2 (&lt; 500 </w:t>
+      </w:r>
+      <w:proofErr w:type="spellStart"/>
+      <w:r>
+        <w:t>ms</w:t>
+      </w:r>
+      <w:proofErr w:type="spellEnd"/>
+      <w:r>
+        <w:t>).</w:t>
+      </w:r>
+    </w:p>
+    <w:p>
+      <w:r>
+        <w:t>- Test T5 (Erroneous Input): For non-existent ticker 'INVALID_TICKER_999', the system caught the HTTP 404 response gracefully and returned an informative user error message without application failure.</w:t>
+      </w:r>
+    </w:p>
+    <w:p/>
+    <w:p/>
+    <w:p/>
+    <w:p>
+      <w:r>
+        <w:lastRenderedPageBreak/>
+        <w:t>3.3.4 Milestone 4: Pure Algorithmic Engine &amp; Leaderboard Sorting (algorithms.py)</w:t>
+      </w:r>
+    </w:p>
+    <w:p>
+      <w:r>
+        <w:t xml:space="preserve">To </w:t>
+      </w:r>
+      <w:proofErr w:type="spellStart"/>
+      <w:r>
+        <w:t>fulfill</w:t>
+      </w:r>
+      <w:proofErr w:type="spellEnd"/>
+      <w:r>
+        <w:t xml:space="preserve"> Band 4 / Group A requirements, I created 'app/algorithms.py', implementing all technical indicators, statistical forecasting, and leaderboard sorting without external scientific libraries.</w:t>
+      </w:r>
+    </w:p>
+    <w:p/>
+    <w:p>
+      <w:r>
+        <w:t>1. Technical Implementation Details:</w:t>
+      </w:r>
+    </w:p>
+    <w:p>
+      <w:r>
+        <w:t>- 10-Day Sliding SMA: Computed via an arithmetic slice ('</w:t>
+      </w:r>
+      <w:proofErr w:type="gramStart"/>
+      <w:r>
+        <w:t>prices[</w:t>
+      </w:r>
+      <w:proofErr w:type="gramEnd"/>
+      <w:r>
+        <w:t>-10:]') and aggregated in O(K) time, smoothing out short-term price volatility.</w:t>
+      </w:r>
+    </w:p>
+    <w:p>
+      <w:r>
+        <w:t>- 14-Period Wilder's RSI: Programmed price difference tracking ('deltas'), isolating positive gains from negative losses. Applied Wilder's recursive smoothing factor to update relative strength momentum across trading days.</w:t>
+      </w:r>
+    </w:p>
+    <w:p>
+      <w:r>
+        <w:t>- Ordinary Least Squares Linear Regression: Engineered single-pass accumulators (</w:t>
+      </w:r>
+      <w:proofErr w:type="spellStart"/>
+      <w:r>
+        <w:t>sum_x</w:t>
+      </w:r>
+      <w:proofErr w:type="spellEnd"/>
+      <w:r>
+        <w:t xml:space="preserve">, </w:t>
+      </w:r>
+      <w:proofErr w:type="spellStart"/>
+      <w:r>
+        <w:t>sum_y</w:t>
+      </w:r>
+      <w:proofErr w:type="spellEnd"/>
+      <w:r>
+        <w:t xml:space="preserve">, </w:t>
+      </w:r>
+      <w:proofErr w:type="spellStart"/>
+      <w:r>
+        <w:t>sum_xy</w:t>
+      </w:r>
+      <w:proofErr w:type="spellEnd"/>
+      <w:r>
+        <w:t>, sum_x2) to calculate slope (m) and intercept (c) in strict O(N) linear time, generating an extrapolation vector for the subsequent 7 trading days.</w:t>
+      </w:r>
+    </w:p>
+    <w:p>
+      <w:r>
+        <w:t>- Custom Divide-and-Conquer Merge Sort: Implemented an explicit recursive '</w:t>
+      </w:r>
+      <w:proofErr w:type="spellStart"/>
+      <w:r>
+        <w:t>merge_sort_</w:t>
+      </w:r>
+      <w:proofErr w:type="gramStart"/>
+      <w:r>
+        <w:t>stocks</w:t>
+      </w:r>
+      <w:proofErr w:type="spellEnd"/>
+      <w:r>
+        <w:t>(</w:t>
+      </w:r>
+      <w:proofErr w:type="gramEnd"/>
+      <w:r>
+        <w:t xml:space="preserve">)' algorithm and sub-list comparator. It recursively partitions the equities basket into halves and merges them in descending order based on daily percentage change, ensuring stable </w:t>
+      </w:r>
+      <w:proofErr w:type="gramStart"/>
+      <w:r>
+        <w:t>O(</w:t>
+      </w:r>
+      <w:proofErr w:type="gramEnd"/>
+      <w:r>
+        <w:t>N log N) performance across all cases.</w:t>
+      </w:r>
+    </w:p>
+    <w:p/>
+    <w:p>
+      <w:r>
+        <w:rPr>
+          <w:noProof/>
+        </w:rPr>
+        <w:drawing>
+          <wp:inline distT="0" distB="0" distL="0" distR="0" wp14:anchorId="658DD4B0" wp14:editId="078689BA">
+            <wp:extent cx="5731510" cy="2445385"/>
+            <wp:effectExtent l="0" t="0" r="2540" b="0"/>
+            <wp:docPr id="1314252469" name="Picture 1"/>
+            <wp:cNvGraphicFramePr>
+              <a:graphicFrameLocks xmlns:a="http://schemas.openxmlformats.org/drawingml/2006/main" noChangeAspect="1"/>
+            </wp:cNvGraphicFramePr>
+            <a:graphic xmlns:a="http://schemas.openxmlformats.org/drawingml/2006/main">
+              <a:graphicData uri="http://schemas.openxmlformats.org/drawingml/2006/picture">
+                <pic:pic xmlns:pic="http://schemas.openxmlformats.org/drawingml/2006/picture">
+                  <pic:nvPicPr>
+                    <pic:cNvPr id="1314252469" name="Picture 1314252469"/>
+                    <pic:cNvPicPr/>
+                  </pic:nvPicPr>
+                  <pic:blipFill>
+                    <a:blip r:embed="rId22">
+                      <a:extLst>
+                        <a:ext uri="{28A0092B-C50C-407E-A947-70E740481C1C}">
+                          <a14:useLocalDpi xmlns:a14="http://schemas.microsoft.com/office/drawing/2010/main" val="0"/>
+                        </a:ext>
+                      </a:extLst>
+                    </a:blip>
+                    <a:stretch>
+                      <a:fillRect/>
+                    </a:stretch>
+                  </pic:blipFill>
+                  <pic:spPr>
+                    <a:xfrm>
+                      <a:off x="0" y="0"/>
+                      <a:ext cx="5731510" cy="2445385"/>
+                    </a:xfrm>
+                    <a:prstGeom prst="rect">
+                      <a:avLst/>
+                    </a:prstGeom>
+                  </pic:spPr>
+                </pic:pic>
+              </a:graphicData>
+            </a:graphic>
+          </wp:inline>
+        </w:drawing>
+      </w:r>
+    </w:p>
+    <w:p>
+      <w:r>
+        <w:t>Figure 3.11: Terminal execution verification demonstrating independent calculations for 10-day SMA, 14-period RSI, 7-day Linear Regression slope/forecasts, and custom Merge Sort ranking (Tests T6, T7, and T9).</w:t>
+      </w:r>
+    </w:p>
+    <w:p/>
+    <w:p>
+      <w:r>
+        <w:t>2. Evidence Evaluation &amp; Test Validation:</w:t>
+      </w:r>
+    </w:p>
+    <w:p>
+      <w:r>
+        <w:t>As demonstrated in Figure 3.11:</w:t>
+      </w:r>
+    </w:p>
+    <w:p>
+      <w:r>
+        <w:t>- Test T6 (Mathematical Accuracy): The 10-day SMA yielded $197.30 and Linear Regression computed a positive slope (m = 0.7625), validating Success Criterion SC4.</w:t>
+      </w:r>
+    </w:p>
+    <w:p>
+      <w:r>
+        <w:lastRenderedPageBreak/>
+        <w:t>- Test T7 (Momentum Validation): The 14-period RSI computed an overbought rating of 81.58, demonstrating proper handling of directional changes.</w:t>
+      </w:r>
+    </w:p>
+    <w:p>
+      <w:r>
+        <w:t>- Test T9 (Custom Sorting Engine): The unsorted market basket was sorted in descending order (NVDA (+4.2%) -&gt; TSLA (+3.1%) -&gt; META (+2.1%) -&gt; AAPL (+1.4%) -&gt; MSFT (+0.9%)), validating Success Criterion SC7.</w:t>
+      </w:r>
+    </w:p>
     <w:sectPr>
-      <w:headerReference w:type="default" r:id="rId22"/>
+      <w:headerReference w:type="default" r:id="rId23"/>
       <w:pgSz w:w="11906" w:h="16838"/>
       <w:pgMar w:top="1440" w:right="1440" w:bottom="1440" w:left="1440" w:header="708" w:footer="708" w:gutter="0"/>
       <w:cols w:space="708"/>

</xml_diff>